<commit_message>
docs: align Strategy Evaluation architecture
</commit_message>
<xml_diff>
--- a/docs/DOC-017 — Proceso de Desarrollo Asistido por Inteligencia Artificial.docx
+++ b/docs/DOC-017 — Proceso de Desarrollo Asistido por Inteligencia Artificial.docx
@@ -99,7 +99,7 @@
       <w:pPr>
         <w:numPr>
           <w:ilvl w:val="0"/>
-          <w:numId w:val="9"/>
+          <w:numId w:val="12"/>
         </w:numPr>
         <w:spacing w:after="0" w:afterAutospacing="0" w:before="240" w:lineRule="auto"/>
         <w:ind w:left="720" w:hanging="360"/>
@@ -123,7 +123,7 @@
       <w:pPr>
         <w:numPr>
           <w:ilvl w:val="0"/>
-          <w:numId w:val="9"/>
+          <w:numId w:val="12"/>
         </w:numPr>
         <w:spacing w:after="0" w:afterAutospacing="0" w:before="0" w:beforeAutospacing="0" w:lineRule="auto"/>
         <w:ind w:left="720" w:hanging="360"/>
@@ -147,7 +147,7 @@
       <w:pPr>
         <w:numPr>
           <w:ilvl w:val="0"/>
-          <w:numId w:val="9"/>
+          <w:numId w:val="12"/>
         </w:numPr>
         <w:spacing w:after="0" w:afterAutospacing="0" w:before="0" w:beforeAutospacing="0" w:lineRule="auto"/>
         <w:ind w:left="720" w:hanging="360"/>
@@ -171,7 +171,7 @@
       <w:pPr>
         <w:numPr>
           <w:ilvl w:val="0"/>
-          <w:numId w:val="9"/>
+          <w:numId w:val="12"/>
         </w:numPr>
         <w:spacing w:after="0" w:afterAutospacing="0" w:before="0" w:beforeAutospacing="0" w:lineRule="auto"/>
         <w:ind w:left="720" w:hanging="360"/>
@@ -195,7 +195,7 @@
       <w:pPr>
         <w:numPr>
           <w:ilvl w:val="0"/>
-          <w:numId w:val="9"/>
+          <w:numId w:val="12"/>
         </w:numPr>
         <w:spacing w:after="0" w:afterAutospacing="0" w:before="0" w:beforeAutospacing="0" w:lineRule="auto"/>
         <w:ind w:left="720" w:hanging="360"/>
@@ -219,7 +219,7 @@
       <w:pPr>
         <w:numPr>
           <w:ilvl w:val="0"/>
-          <w:numId w:val="9"/>
+          <w:numId w:val="12"/>
         </w:numPr>
         <w:spacing w:after="0" w:afterAutospacing="0" w:before="0" w:beforeAutospacing="0" w:lineRule="auto"/>
         <w:ind w:left="720" w:hanging="360"/>
@@ -237,7 +237,7 @@
       <w:pPr>
         <w:numPr>
           <w:ilvl w:val="1"/>
-          <w:numId w:val="9"/>
+          <w:numId w:val="12"/>
         </w:numPr>
         <w:spacing w:after="0" w:afterAutospacing="0" w:before="0" w:beforeAutospacing="0" w:lineRule="auto"/>
         <w:ind w:left="1440" w:hanging="360"/>
@@ -253,7 +253,7 @@
       <w:pPr>
         <w:numPr>
           <w:ilvl w:val="1"/>
-          <w:numId w:val="9"/>
+          <w:numId w:val="12"/>
         </w:numPr>
         <w:spacing w:after="0" w:afterAutospacing="0" w:before="0" w:beforeAutospacing="0" w:lineRule="auto"/>
         <w:ind w:left="1440" w:hanging="360"/>
@@ -269,7 +269,7 @@
       <w:pPr>
         <w:numPr>
           <w:ilvl w:val="1"/>
-          <w:numId w:val="9"/>
+          <w:numId w:val="12"/>
         </w:numPr>
         <w:spacing w:after="0" w:afterAutospacing="0" w:before="0" w:beforeAutospacing="0" w:lineRule="auto"/>
         <w:ind w:left="1440" w:hanging="360"/>
@@ -285,7 +285,7 @@
       <w:pPr>
         <w:numPr>
           <w:ilvl w:val="1"/>
-          <w:numId w:val="9"/>
+          <w:numId w:val="12"/>
         </w:numPr>
         <w:spacing w:after="0" w:afterAutospacing="0" w:before="0" w:beforeAutospacing="0" w:lineRule="auto"/>
         <w:ind w:left="1440" w:hanging="360"/>
@@ -301,7 +301,7 @@
       <w:pPr>
         <w:numPr>
           <w:ilvl w:val="1"/>
-          <w:numId w:val="9"/>
+          <w:numId w:val="12"/>
         </w:numPr>
         <w:spacing w:after="240" w:before="0" w:beforeAutospacing="0" w:lineRule="auto"/>
         <w:ind w:left="1440" w:hanging="360"/>
@@ -435,7 +435,7 @@
       <w:pPr>
         <w:numPr>
           <w:ilvl w:val="0"/>
-          <w:numId w:val="6"/>
+          <w:numId w:val="9"/>
         </w:numPr>
         <w:spacing w:after="0" w:afterAutospacing="0" w:before="240" w:lineRule="auto"/>
         <w:ind w:left="720" w:hanging="360"/>
@@ -451,7 +451,7 @@
       <w:pPr>
         <w:numPr>
           <w:ilvl w:val="0"/>
-          <w:numId w:val="6"/>
+          <w:numId w:val="9"/>
         </w:numPr>
         <w:spacing w:after="0" w:afterAutospacing="0" w:before="0" w:beforeAutospacing="0" w:lineRule="auto"/>
         <w:ind w:left="720" w:hanging="360"/>
@@ -467,7 +467,7 @@
       <w:pPr>
         <w:numPr>
           <w:ilvl w:val="0"/>
-          <w:numId w:val="6"/>
+          <w:numId w:val="9"/>
         </w:numPr>
         <w:spacing w:after="0" w:afterAutospacing="0" w:before="0" w:beforeAutospacing="0" w:lineRule="auto"/>
         <w:ind w:left="720" w:hanging="360"/>
@@ -483,7 +483,7 @@
       <w:pPr>
         <w:numPr>
           <w:ilvl w:val="0"/>
-          <w:numId w:val="6"/>
+          <w:numId w:val="9"/>
         </w:numPr>
         <w:spacing w:after="0" w:afterAutospacing="0" w:before="0" w:beforeAutospacing="0" w:lineRule="auto"/>
         <w:ind w:left="720" w:hanging="360"/>
@@ -499,16 +499,395 @@
       <w:pPr>
         <w:numPr>
           <w:ilvl w:val="0"/>
-          <w:numId w:val="6"/>
+          <w:numId w:val="9"/>
+        </w:numPr>
+        <w:spacing w:after="0" w:afterAutospacing="0" w:before="0" w:beforeAutospacing="0" w:lineRule="auto"/>
+        <w:ind w:left="720" w:hanging="360"/>
+      </w:pPr>
+      <w:r>
+        <w:rPr>
+          <w:rtl w:val="0"/>
+        </w:rPr>
+        <w:t xml:space="preserve">La plataforma no dependerá de un proveedor específico de IA.</w:t>
+      </w:r>
+    </w:p>
+    <w:p>
+      <w:pPr>
+        <w:numPr>
+          <w:ilvl w:val="0"/>
+          <w:numId w:val="9"/>
+        </w:numPr>
+        <w:spacing w:after="0" w:afterAutospacing="0" w:before="0" w:beforeAutospacing="0" w:lineRule="auto"/>
+        <w:ind w:left="720" w:hanging="360"/>
+        <w:rPr>
+          <w:u w:val="none"/>
+        </w:rPr>
+      </w:pPr>
+      <w:r>
+        <w:rPr>
+          <w:rtl w:val="0"/>
+        </w:rPr>
+        <w:t xml:space="preserve">Si durante una implementación el Agente de Implementación detecta una inconsistencia entre la especificación solicitada y la arquitectura vigente definida por los documentos del sistema, deberá detener la implementación y reportar la inconsistencia. El agente no está autorizado a resolver conflictos arquitectónicos mediante interpretación propia. </w:t>
+      </w:r>
+    </w:p>
+    <w:p>
+      <w:pPr>
+        <w:numPr>
+          <w:ilvl w:val="0"/>
+          <w:numId w:val="9"/>
         </w:numPr>
         <w:spacing w:after="240" w:before="0" w:beforeAutospacing="0" w:lineRule="auto"/>
         <w:ind w:left="720" w:hanging="360"/>
-      </w:pPr>
-      <w:r>
-        <w:rPr>
-          <w:rtl w:val="0"/>
-        </w:rPr>
-        <w:t xml:space="preserve">La plataforma no dependerá de un proveedor específico de IA.</w:t>
+        <w:rPr>
+          <w:u w:val="none"/>
+        </w:rPr>
+      </w:pPr>
+      <w:r>
+        <w:rPr>
+          <w:rtl w:val="0"/>
+        </w:rPr>
+        <w:t xml:space="preserve">En caso de conflicto entre una especificación técnica (IT) y la metodología definida por los documentos de gobierno (DOC), prevalecerán los documentos de gobierno. Una especificación técnica no podrá modificar implícitamente el proceso de desarrollo ni el estándar documental del proyecto. </w:t>
+      </w:r>
+    </w:p>
+    <w:p>
+      <w:pPr>
+        <w:pStyle w:val="Heading2"/>
+        <w:keepNext w:val="0"/>
+        <w:keepLines w:val="0"/>
+        <w:spacing w:after="80" w:lineRule="auto"/>
+        <w:ind w:left="720" w:hanging="360"/>
+        <w:rPr>
+          <w:b w:val="1"/>
+          <w:bCs w:val="1"/>
+          <w:sz w:val="34"/>
+          <w:szCs w:val="34"/>
+        </w:rPr>
+      </w:pPr>
+      <w:bookmarkStart w:colFirst="0" w:colLast="0" w:name="_26md0hm0qppi" w:id="5"/>
+      <w:bookmarkEnd w:id="5"/>
+      <w:r>
+        <w:rPr>
+          <w:b w:val="1"/>
+          <w:bCs w:val="1"/>
+          <w:sz w:val="34"/>
+          <w:szCs w:val="34"/>
+          <w:rtl w:val="0"/>
+        </w:rPr>
+        <w:t xml:space="preserve">Tratamiento de mejoras arquitectónicas</w:t>
+      </w:r>
+    </w:p>
+    <w:p>
+      <w:pPr>
+        <w:spacing w:after="240" w:before="240" w:lineRule="auto"/>
+        <w:rPr/>
+      </w:pPr>
+      <w:r>
+        <w:rPr>
+          <w:rtl w:val="0"/>
+        </w:rPr>
+        <w:t xml:space="preserve">Durante la elaboración de documentación o implementación podrán identificarse mejoras arquitectónicas que no constituyan inconsistencias con la arquitectura vigente.</w:t>
+      </w:r>
+    </w:p>
+    <w:p>
+      <w:pPr>
+        <w:spacing w:after="240" w:before="240" w:lineRule="auto"/>
+        <w:rPr/>
+      </w:pPr>
+      <w:r>
+        <w:rPr>
+          <w:rtl w:val="0"/>
+        </w:rPr>
+        <w:t xml:space="preserve">Estas mejoras:</w:t>
+      </w:r>
+    </w:p>
+    <w:p>
+      <w:pPr>
+        <w:numPr>
+          <w:ilvl w:val="0"/>
+          <w:numId w:val="4"/>
+        </w:numPr>
+        <w:spacing w:after="0" w:afterAutospacing="0" w:before="240" w:lineRule="auto"/>
+        <w:ind w:left="720" w:hanging="360"/>
+      </w:pPr>
+      <w:r>
+        <w:rPr>
+          <w:rtl w:val="0"/>
+        </w:rPr>
+        <w:t xml:space="preserve">no autorizan modificar la especificación en elaboración;</w:t>
+      </w:r>
+    </w:p>
+    <w:p>
+      <w:pPr>
+        <w:numPr>
+          <w:ilvl w:val="0"/>
+          <w:numId w:val="4"/>
+        </w:numPr>
+        <w:spacing w:after="0" w:afterAutospacing="0" w:before="0" w:beforeAutospacing="0" w:lineRule="auto"/>
+        <w:ind w:left="720" w:hanging="360"/>
+      </w:pPr>
+      <w:r>
+        <w:rPr>
+          <w:rtl w:val="0"/>
+        </w:rPr>
+        <w:t xml:space="preserve">no suspenden el flujo de trabajo;</w:t>
+      </w:r>
+    </w:p>
+    <w:p>
+      <w:pPr>
+        <w:numPr>
+          <w:ilvl w:val="0"/>
+          <w:numId w:val="4"/>
+        </w:numPr>
+        <w:spacing w:after="0" w:afterAutospacing="0" w:before="0" w:beforeAutospacing="0" w:lineRule="auto"/>
+        <w:ind w:left="720" w:hanging="360"/>
+      </w:pPr>
+      <w:r>
+        <w:rPr>
+          <w:rtl w:val="0"/>
+        </w:rPr>
+        <w:t xml:space="preserve">deberán registrarse como propuestas de evolución;</w:t>
+      </w:r>
+    </w:p>
+    <w:p>
+      <w:pPr>
+        <w:numPr>
+          <w:ilvl w:val="0"/>
+          <w:numId w:val="4"/>
+        </w:numPr>
+        <w:spacing w:after="240" w:before="0" w:beforeAutospacing="0" w:lineRule="auto"/>
+        <w:ind w:left="720" w:hanging="360"/>
+      </w:pPr>
+      <w:r>
+        <w:rPr>
+          <w:rtl w:val="0"/>
+        </w:rPr>
+        <w:t xml:space="preserve">únicamente podrán incorporarse tras la actualización y aprobación de la documentación arquitectónica correspondiente.</w:t>
+      </w:r>
+    </w:p>
+    <w:p>
+      <w:pPr>
+        <w:spacing w:after="240" w:before="240" w:lineRule="auto"/>
+        <w:rPr/>
+      </w:pPr>
+      <w:r>
+        <w:rPr>
+          <w:rtl w:val="0"/>
+        </w:rPr>
+        <w:t xml:space="preserve">Hasta su aprobación, la implementación y la documentación deberán continuar conforme a la arquitectura vigente.</w:t>
+      </w:r>
+    </w:p>
+    <w:p>
+      <w:pPr>
+        <w:spacing w:after="240" w:before="240" w:lineRule="auto"/>
+        <w:rPr/>
+      </w:pPr>
+      <w:r>
+        <w:rPr>
+          <w:rtl w:val="0"/>
+        </w:rPr>
+      </w:r>
+    </w:p>
+    <w:p>
+      <w:pPr>
+        <w:pStyle w:val="Heading2"/>
+        <w:keepNext w:val="0"/>
+        <w:keepLines w:val="0"/>
+        <w:spacing w:after="80" w:lineRule="auto"/>
+        <w:rPr>
+          <w:b w:val="1"/>
+          <w:bCs w:val="1"/>
+          <w:sz w:val="34"/>
+          <w:szCs w:val="34"/>
+        </w:rPr>
+      </w:pPr>
+      <w:bookmarkStart w:colFirst="0" w:colLast="0" w:name="_pavtshayljv" w:id="6"/>
+      <w:bookmarkEnd w:id="6"/>
+      <w:r>
+        <w:rPr>
+          <w:b w:val="1"/>
+          <w:bCs w:val="1"/>
+          <w:sz w:val="34"/>
+          <w:szCs w:val="34"/>
+          <w:rtl w:val="0"/>
+        </w:rPr>
+        <w:t xml:space="preserve">Arquitectura vigente</w:t>
+      </w:r>
+    </w:p>
+    <w:p>
+      <w:pPr>
+        <w:spacing w:after="240" w:before="240" w:lineRule="auto"/>
+        <w:rPr/>
+      </w:pPr>
+      <w:r>
+        <w:rPr>
+          <w:rtl w:val="0"/>
+        </w:rPr>
+        <w:t xml:space="preserve">Al comenzar un ciclo de implementación o elaboración de una especificación técnica, la arquitectura vigente se considerará congelada.</w:t>
+      </w:r>
+    </w:p>
+    <w:p>
+      <w:pPr>
+        <w:spacing w:after="240" w:before="240" w:lineRule="auto"/>
+        <w:rPr/>
+      </w:pPr>
+      <w:r>
+        <w:rPr>
+          <w:rtl w:val="0"/>
+        </w:rPr>
+        <w:t xml:space="preserve">Durante ese ciclo únicamente podrán interrumpir el trabajo:</w:t>
+      </w:r>
+    </w:p>
+    <w:p>
+      <w:pPr>
+        <w:numPr>
+          <w:ilvl w:val="0"/>
+          <w:numId w:val="7"/>
+        </w:numPr>
+        <w:spacing w:after="0" w:afterAutospacing="0" w:before="240" w:lineRule="auto"/>
+        <w:ind w:left="720" w:hanging="360"/>
+      </w:pPr>
+      <w:r>
+        <w:rPr>
+          <w:rtl w:val="0"/>
+        </w:rPr>
+        <w:t xml:space="preserve">inconsistencias documentales;</w:t>
+      </w:r>
+    </w:p>
+    <w:p>
+      <w:pPr>
+        <w:numPr>
+          <w:ilvl w:val="0"/>
+          <w:numId w:val="7"/>
+        </w:numPr>
+        <w:spacing w:after="0" w:afterAutospacing="0" w:before="0" w:beforeAutospacing="0" w:lineRule="auto"/>
+        <w:ind w:left="720" w:hanging="360"/>
+      </w:pPr>
+      <w:r>
+        <w:rPr>
+          <w:rtl w:val="0"/>
+        </w:rPr>
+        <w:t xml:space="preserve">contradicciones arquitectónicas;</w:t>
+      </w:r>
+    </w:p>
+    <w:p>
+      <w:pPr>
+        <w:numPr>
+          <w:ilvl w:val="0"/>
+          <w:numId w:val="7"/>
+        </w:numPr>
+        <w:spacing w:after="0" w:afterAutospacing="0" w:before="0" w:beforeAutospacing="0" w:lineRule="auto"/>
+        <w:ind w:left="720" w:hanging="360"/>
+      </w:pPr>
+      <w:r>
+        <w:rPr>
+          <w:rtl w:val="0"/>
+        </w:rPr>
+        <w:t xml:space="preserve">incumplimientos de dependencias;</w:t>
+      </w:r>
+    </w:p>
+    <w:p>
+      <w:pPr>
+        <w:numPr>
+          <w:ilvl w:val="0"/>
+          <w:numId w:val="7"/>
+        </w:numPr>
+        <w:spacing w:after="240" w:before="0" w:beforeAutospacing="0" w:lineRule="auto"/>
+        <w:ind w:left="720" w:hanging="360"/>
+      </w:pPr>
+      <w:r>
+        <w:rPr>
+          <w:rtl w:val="0"/>
+        </w:rPr>
+        <w:t xml:space="preserve">riesgos técnicos que impidan continuar.</w:t>
+      </w:r>
+    </w:p>
+    <w:p>
+      <w:pPr>
+        <w:spacing w:after="240" w:before="240" w:lineRule="auto"/>
+        <w:rPr/>
+      </w:pPr>
+      <w:r>
+        <w:rPr>
+          <w:rtl w:val="0"/>
+        </w:rPr>
+        <w:t xml:space="preserve">Las mejoras evolutivas deberán tratarse conforme al proceso definido para la evolución documental.</w:t>
+        <w:br w:type="textWrapping"/>
+        <w:br w:type="textWrapping"/>
+      </w:r>
+      <w:r>
+        <w:rPr>
+          <w:b w:val="1"/>
+          <w:bCs w:val="1"/>
+          <w:sz w:val="34"/>
+          <w:szCs w:val="34"/>
+          <w:rtl w:val="0"/>
+        </w:rPr>
+        <w:t xml:space="preserve"> Especificación técnica</w:t>
+      </w:r>
+      <w:r>
+        <w:rPr>
+          <w:rtl w:val="0"/>
+        </w:rPr>
+        <w:t xml:space="preserve"> </w:t>
+      </w:r>
+    </w:p>
+    <w:p>
+      <w:pPr>
+        <w:spacing w:after="240" w:before="240" w:lineRule="auto"/>
+        <w:rPr/>
+      </w:pPr>
+      <w:r>
+        <w:rPr>
+          <w:rtl w:val="0"/>
+        </w:rPr>
+        <w:t xml:space="preserve">Una especificación técnica tiene como objetivo eliminar decisiones de implementación.</w:t>
+      </w:r>
+    </w:p>
+    <w:p>
+      <w:pPr>
+        <w:spacing w:after="240" w:before="240" w:lineRule="auto"/>
+        <w:rPr/>
+      </w:pPr>
+      <w:r>
+        <w:rPr>
+          <w:rtl w:val="0"/>
+        </w:rPr>
+        <w:t xml:space="preserve">No constituye un documento de exploración arquitectónica.</w:t>
+      </w:r>
+    </w:p>
+    <w:p>
+      <w:pPr>
+        <w:spacing w:after="240" w:before="240" w:lineRule="auto"/>
+        <w:rPr/>
+      </w:pPr>
+      <w:r>
+        <w:rPr>
+          <w:rtl w:val="0"/>
+        </w:rPr>
+        <w:t xml:space="preserve">Toda decisión arquitectónica necesaria para producir la especificación deberá encontrarse previamente documentada o ser resuelta mediante el proceso arquitectónico correspondiente.</w:t>
+      </w:r>
+    </w:p>
+    <w:p>
+      <w:pPr>
+        <w:spacing w:after="240" w:before="240" w:lineRule="auto"/>
+        <w:rPr/>
+      </w:pPr>
+      <w:r>
+        <w:rPr>
+          <w:rtl w:val="0"/>
+        </w:rPr>
+      </w:r>
+    </w:p>
+    <w:p>
+      <w:pPr>
+        <w:spacing w:after="240" w:before="240" w:lineRule="auto"/>
+        <w:ind w:left="720" w:firstLine="0"/>
+        <w:rPr/>
+      </w:pPr>
+      <w:r>
+        <w:rPr>
+          <w:rtl w:val="0"/>
+        </w:rPr>
       </w:r>
     </w:p>
     <w:p>
@@ -539,8 +918,8 @@
           <w:szCs w:val="46"/>
         </w:rPr>
       </w:pPr>
-      <w:bookmarkStart w:colFirst="0" w:colLast="0" w:name="_urp8b5s4xmqe" w:id="5"/>
-      <w:bookmarkEnd w:id="5"/>
+      <w:bookmarkStart w:colFirst="0" w:colLast="0" w:name="_urp8b5s4xmqe" w:id="7"/>
+      <w:bookmarkEnd w:id="7"/>
       <w:r>
         <w:rPr>
           <w:b w:val="1"/>
@@ -565,8 +944,8 @@
           <w:szCs w:val="34"/>
         </w:rPr>
       </w:pPr>
-      <w:bookmarkStart w:colFirst="0" w:colLast="0" w:name="_4i6uvx826pxi" w:id="6"/>
-      <w:bookmarkEnd w:id="6"/>
+      <w:bookmarkStart w:colFirst="0" w:colLast="0" w:name="_4i6uvx826pxi" w:id="8"/>
+      <w:bookmarkEnd w:id="8"/>
       <w:r>
         <w:rPr>
           <w:b w:val="1"/>
@@ -594,7 +973,7 @@
       <w:pPr>
         <w:numPr>
           <w:ilvl w:val="0"/>
-          <w:numId w:val="5"/>
+          <w:numId w:val="8"/>
         </w:numPr>
         <w:spacing w:after="0" w:afterAutospacing="0" w:before="240" w:lineRule="auto"/>
         <w:ind w:left="720" w:hanging="360"/>
@@ -610,7 +989,7 @@
       <w:pPr>
         <w:numPr>
           <w:ilvl w:val="0"/>
-          <w:numId w:val="5"/>
+          <w:numId w:val="8"/>
         </w:numPr>
         <w:spacing w:after="0" w:afterAutospacing="0" w:before="0" w:beforeAutospacing="0" w:lineRule="auto"/>
         <w:ind w:left="720" w:hanging="360"/>
@@ -626,7 +1005,7 @@
       <w:pPr>
         <w:numPr>
           <w:ilvl w:val="0"/>
-          <w:numId w:val="5"/>
+          <w:numId w:val="8"/>
         </w:numPr>
         <w:spacing w:after="0" w:afterAutospacing="0" w:before="0" w:beforeAutospacing="0" w:lineRule="auto"/>
         <w:ind w:left="720" w:hanging="360"/>
@@ -642,16 +1021,118 @@
       <w:pPr>
         <w:numPr>
           <w:ilvl w:val="0"/>
-          <w:numId w:val="5"/>
+          <w:numId w:val="8"/>
+        </w:numPr>
+        <w:spacing w:after="0" w:afterAutospacing="0" w:before="0" w:beforeAutospacing="0" w:lineRule="auto"/>
+        <w:ind w:left="720" w:hanging="360"/>
+      </w:pPr>
+      <w:r>
+        <w:rPr>
+          <w:rtl w:val="0"/>
+        </w:rPr>
+        <w:t xml:space="preserve">aprobar decisiones técnicas.</w:t>
+      </w:r>
+    </w:p>
+    <w:p>
+      <w:pPr>
+        <w:numPr>
+          <w:ilvl w:val="0"/>
+          <w:numId w:val="8"/>
         </w:numPr>
         <w:spacing w:after="240" w:before="0" w:beforeAutospacing="0" w:lineRule="auto"/>
         <w:ind w:left="720" w:hanging="360"/>
-      </w:pPr>
-      <w:r>
-        <w:rPr>
-          <w:rtl w:val="0"/>
-        </w:rPr>
-        <w:t xml:space="preserve">aprobar decisiones técnicas.</w:t>
+        <w:rPr>
+          <w:u w:val="none"/>
+        </w:rPr>
+      </w:pPr>
+      <w:r>
+        <w:rPr>
+          <w:rtl w:val="0"/>
+        </w:rPr>
+        <w:t xml:space="preserve">mantener la coherencia con la arquitectura vigente durante la elaboración de nuevas especificaciones. </w:t>
+      </w:r>
+    </w:p>
+    <w:p>
+      <w:pPr>
+        <w:spacing w:after="240" w:before="240" w:lineRule="auto"/>
+        <w:rPr/>
+      </w:pPr>
+      <w:r>
+        <w:rPr>
+          <w:rtl w:val="0"/>
+        </w:rPr>
+        <w:t xml:space="preserve">El Arquitecto Técnico no deberá:</w:t>
+      </w:r>
+    </w:p>
+    <w:p>
+      <w:pPr>
+        <w:numPr>
+          <w:ilvl w:val="0"/>
+          <w:numId w:val="6"/>
+        </w:numPr>
+        <w:spacing w:after="0" w:afterAutospacing="0" w:before="240" w:lineRule="auto"/>
+        <w:ind w:left="720" w:hanging="360"/>
+      </w:pPr>
+      <w:r>
+        <w:rPr>
+          <w:rtl w:val="0"/>
+        </w:rPr>
+        <w:t xml:space="preserve">modificar implícitamente la arquitectura mediante una especificación técnica;</w:t>
+      </w:r>
+    </w:p>
+    <w:p>
+      <w:pPr>
+        <w:numPr>
+          <w:ilvl w:val="0"/>
+          <w:numId w:val="6"/>
+        </w:numPr>
+        <w:spacing w:after="0" w:afterAutospacing="0" w:before="0" w:beforeAutospacing="0" w:lineRule="auto"/>
+        <w:ind w:left="720" w:hanging="360"/>
+      </w:pPr>
+      <w:r>
+        <w:rPr>
+          <w:rtl w:val="0"/>
+        </w:rPr>
+        <w:t xml:space="preserve">introducir cambios metodológicos durante la elaboración de un IT;</w:t>
+      </w:r>
+    </w:p>
+    <w:p>
+      <w:pPr>
+        <w:numPr>
+          <w:ilvl w:val="0"/>
+          <w:numId w:val="6"/>
+        </w:numPr>
+        <w:spacing w:after="240" w:before="0" w:beforeAutospacing="0" w:lineRule="auto"/>
+        <w:ind w:left="720" w:hanging="360"/>
+      </w:pPr>
+      <w:r>
+        <w:rPr>
+          <w:rtl w:val="0"/>
+        </w:rPr>
+        <w:t xml:space="preserve">sustituir el proceso documental establecido por interpretación propia.</w:t>
+      </w:r>
+    </w:p>
+    <w:p>
+      <w:pPr>
+        <w:spacing w:after="240" w:before="240" w:lineRule="auto"/>
+        <w:rPr/>
+      </w:pPr>
+      <w:r>
+        <w:rPr>
+          <w:rtl w:val="0"/>
+        </w:rPr>
+        <w:t xml:space="preserve">Toda modificación de la arquitectura deberá realizarse mediante la actualización del documento arquitectónico correspondiente.</w:t>
+      </w:r>
+    </w:p>
+    <w:p>
+      <w:pPr>
+        <w:spacing w:after="240" w:before="240" w:lineRule="auto"/>
+        <w:rPr/>
+      </w:pPr>
+      <w:r>
+        <w:rPr>
+          <w:rtl w:val="0"/>
+        </w:rPr>
       </w:r>
     </w:p>
     <w:p>
@@ -694,8 +1175,8 @@
           <w:szCs w:val="34"/>
         </w:rPr>
       </w:pPr>
-      <w:bookmarkStart w:colFirst="0" w:colLast="0" w:name="_4duqquvu24ek" w:id="7"/>
-      <w:bookmarkEnd w:id="7"/>
+      <w:bookmarkStart w:colFirst="0" w:colLast="0" w:name="_4duqquvu24ek" w:id="9"/>
+      <w:bookmarkEnd w:id="9"/>
       <w:r>
         <w:rPr>
           <w:b w:val="1"/>
@@ -723,7 +1204,7 @@
       <w:pPr>
         <w:numPr>
           <w:ilvl w:val="0"/>
-          <w:numId w:val="10"/>
+          <w:numId w:val="13"/>
         </w:numPr>
         <w:spacing w:after="0" w:afterAutospacing="0" w:before="240" w:lineRule="auto"/>
         <w:ind w:left="720" w:hanging="360"/>
@@ -739,7 +1220,7 @@
       <w:pPr>
         <w:numPr>
           <w:ilvl w:val="0"/>
-          <w:numId w:val="10"/>
+          <w:numId w:val="13"/>
         </w:numPr>
         <w:spacing w:after="0" w:afterAutospacing="0" w:before="0" w:beforeAutospacing="0" w:lineRule="auto"/>
         <w:ind w:left="720" w:hanging="360"/>
@@ -755,7 +1236,7 @@
       <w:pPr>
         <w:numPr>
           <w:ilvl w:val="0"/>
-          <w:numId w:val="10"/>
+          <w:numId w:val="13"/>
         </w:numPr>
         <w:spacing w:after="0" w:afterAutospacing="0" w:before="0" w:beforeAutospacing="0" w:lineRule="auto"/>
         <w:ind w:left="720" w:hanging="360"/>
@@ -771,7 +1252,7 @@
       <w:pPr>
         <w:numPr>
           <w:ilvl w:val="0"/>
-          <w:numId w:val="10"/>
+          <w:numId w:val="13"/>
         </w:numPr>
         <w:spacing w:after="240" w:before="0" w:beforeAutospacing="0" w:lineRule="auto"/>
         <w:ind w:left="720" w:hanging="360"/>
@@ -849,8 +1330,8 @@
           <w:szCs w:val="34"/>
         </w:rPr>
       </w:pPr>
-      <w:bookmarkStart w:colFirst="0" w:colLast="0" w:name="_iqjec35s307i" w:id="8"/>
-      <w:bookmarkEnd w:id="8"/>
+      <w:bookmarkStart w:colFirst="0" w:colLast="0" w:name="_iqjec35s307i" w:id="10"/>
+      <w:bookmarkEnd w:id="10"/>
       <w:r>
         <w:rPr>
           <w:b w:val="1"/>
@@ -966,8 +1447,8 @@
           <w:szCs w:val="34"/>
         </w:rPr>
       </w:pPr>
-      <w:bookmarkStart w:colFirst="0" w:colLast="0" w:name="_fae79ixf6irv" w:id="9"/>
-      <w:bookmarkEnd w:id="9"/>
+      <w:bookmarkStart w:colFirst="0" w:colLast="0" w:name="_fae79ixf6irv" w:id="11"/>
+      <w:bookmarkEnd w:id="11"/>
       <w:r>
         <w:rPr>
           <w:b w:val="1"/>
@@ -1095,8 +1576,8 @@
           <w:szCs w:val="46"/>
         </w:rPr>
       </w:pPr>
-      <w:bookmarkStart w:colFirst="0" w:colLast="0" w:name="_5xm3arev5ity" w:id="10"/>
-      <w:bookmarkEnd w:id="10"/>
+      <w:bookmarkStart w:colFirst="0" w:colLast="0" w:name="_5xm3arev5ity" w:id="12"/>
+      <w:bookmarkEnd w:id="12"/>
       <w:r>
         <w:rPr>
           <w:b w:val="1"/>
@@ -1378,8 +1859,8 @@
           <w:szCs w:val="46"/>
         </w:rPr>
       </w:pPr>
-      <w:bookmarkStart w:colFirst="0" w:colLast="0" w:name="_ygyv45nzyql7" w:id="11"/>
-      <w:bookmarkEnd w:id="11"/>
+      <w:bookmarkStart w:colFirst="0" w:colLast="0" w:name="_ygyv45nzyql7" w:id="13"/>
+      <w:bookmarkEnd w:id="13"/>
       <w:r>
         <w:rPr>
           <w:b w:val="1"/>
@@ -1407,7 +1888,7 @@
       <w:pPr>
         <w:numPr>
           <w:ilvl w:val="0"/>
-          <w:numId w:val="4"/>
+          <w:numId w:val="5"/>
         </w:numPr>
         <w:spacing w:after="0" w:afterAutospacing="0" w:before="240" w:lineRule="auto"/>
         <w:ind w:left="720" w:hanging="360"/>
@@ -1423,7 +1904,7 @@
       <w:pPr>
         <w:numPr>
           <w:ilvl w:val="0"/>
-          <w:numId w:val="4"/>
+          <w:numId w:val="5"/>
         </w:numPr>
         <w:spacing w:after="0" w:afterAutospacing="0" w:before="0" w:beforeAutospacing="0" w:lineRule="auto"/>
         <w:ind w:left="720" w:hanging="360"/>
@@ -1439,7 +1920,7 @@
       <w:pPr>
         <w:numPr>
           <w:ilvl w:val="0"/>
-          <w:numId w:val="4"/>
+          <w:numId w:val="5"/>
         </w:numPr>
         <w:spacing w:after="0" w:afterAutospacing="0" w:before="0" w:beforeAutospacing="0" w:lineRule="auto"/>
         <w:ind w:left="720" w:hanging="360"/>
@@ -1455,7 +1936,7 @@
       <w:pPr>
         <w:numPr>
           <w:ilvl w:val="0"/>
-          <w:numId w:val="4"/>
+          <w:numId w:val="5"/>
         </w:numPr>
         <w:spacing w:after="0" w:afterAutospacing="0" w:before="0" w:beforeAutospacing="0" w:lineRule="auto"/>
         <w:ind w:left="720" w:hanging="360"/>
@@ -1471,7 +1952,7 @@
       <w:pPr>
         <w:numPr>
           <w:ilvl w:val="0"/>
-          <w:numId w:val="4"/>
+          <w:numId w:val="5"/>
         </w:numPr>
         <w:spacing w:after="0" w:afterAutospacing="0" w:before="0" w:beforeAutospacing="0" w:lineRule="auto"/>
         <w:ind w:left="720" w:hanging="360"/>
@@ -1487,7 +1968,7 @@
       <w:pPr>
         <w:numPr>
           <w:ilvl w:val="0"/>
-          <w:numId w:val="4"/>
+          <w:numId w:val="5"/>
         </w:numPr>
         <w:spacing w:after="240" w:before="0" w:beforeAutospacing="0" w:lineRule="auto"/>
         <w:ind w:left="720" w:hanging="360"/>
@@ -1539,8 +2020,8 @@
           <w:szCs w:val="46"/>
         </w:rPr>
       </w:pPr>
-      <w:bookmarkStart w:colFirst="0" w:colLast="0" w:name="_hgin08l9ibcs" w:id="12"/>
-      <w:bookmarkEnd w:id="12"/>
+      <w:bookmarkStart w:colFirst="0" w:colLast="0" w:name="_hgin08l9ibcs" w:id="14"/>
+      <w:bookmarkEnd w:id="14"/>
       <w:r>
         <w:rPr>
           <w:b w:val="1"/>
@@ -1698,8 +2179,8 @@
           <w:szCs w:val="46"/>
         </w:rPr>
       </w:pPr>
-      <w:bookmarkStart w:colFirst="0" w:colLast="0" w:name="_kadl4seaitr6" w:id="13"/>
-      <w:bookmarkEnd w:id="13"/>
+      <w:bookmarkStart w:colFirst="0" w:colLast="0" w:name="_kadl4seaitr6" w:id="15"/>
+      <w:bookmarkEnd w:id="15"/>
       <w:r>
         <w:rPr>
           <w:b w:val="1"/>
@@ -1739,7 +2220,7 @@
       <w:pPr>
         <w:numPr>
           <w:ilvl w:val="0"/>
-          <w:numId w:val="8"/>
+          <w:numId w:val="11"/>
         </w:numPr>
         <w:spacing w:after="0" w:afterAutospacing="0" w:before="240" w:lineRule="auto"/>
         <w:ind w:left="720" w:hanging="360"/>
@@ -1755,7 +2236,7 @@
       <w:pPr>
         <w:numPr>
           <w:ilvl w:val="0"/>
-          <w:numId w:val="8"/>
+          <w:numId w:val="11"/>
         </w:numPr>
         <w:spacing w:after="0" w:afterAutospacing="0" w:before="0" w:beforeAutospacing="0" w:lineRule="auto"/>
         <w:ind w:left="720" w:hanging="360"/>
@@ -1771,7 +2252,7 @@
       <w:pPr>
         <w:numPr>
           <w:ilvl w:val="0"/>
-          <w:numId w:val="8"/>
+          <w:numId w:val="11"/>
         </w:numPr>
         <w:spacing w:after="0" w:afterAutospacing="0" w:before="0" w:beforeAutospacing="0" w:lineRule="auto"/>
         <w:ind w:left="720" w:hanging="360"/>
@@ -1787,7 +2268,7 @@
       <w:pPr>
         <w:numPr>
           <w:ilvl w:val="0"/>
-          <w:numId w:val="8"/>
+          <w:numId w:val="11"/>
         </w:numPr>
         <w:spacing w:after="240" w:before="0" w:beforeAutospacing="0" w:lineRule="auto"/>
         <w:ind w:left="720" w:hanging="360"/>
@@ -1839,8 +2320,8 @@
           <w:szCs w:val="46"/>
         </w:rPr>
       </w:pPr>
-      <w:bookmarkStart w:colFirst="0" w:colLast="0" w:name="_34l9e34puccl" w:id="14"/>
-      <w:bookmarkEnd w:id="14"/>
+      <w:bookmarkStart w:colFirst="0" w:colLast="0" w:name="_34l9e34puccl" w:id="16"/>
+      <w:bookmarkEnd w:id="16"/>
       <w:r>
         <w:rPr>
           <w:b w:val="1"/>
@@ -1868,7 +2349,7 @@
       <w:pPr>
         <w:numPr>
           <w:ilvl w:val="0"/>
-          <w:numId w:val="7"/>
+          <w:numId w:val="10"/>
         </w:numPr>
         <w:spacing w:after="0" w:afterAutospacing="0" w:before="240" w:lineRule="auto"/>
         <w:ind w:left="720" w:hanging="360"/>
@@ -1884,7 +2365,7 @@
       <w:pPr>
         <w:numPr>
           <w:ilvl w:val="0"/>
-          <w:numId w:val="7"/>
+          <w:numId w:val="10"/>
         </w:numPr>
         <w:spacing w:after="0" w:afterAutospacing="0" w:before="0" w:beforeAutospacing="0" w:lineRule="auto"/>
         <w:ind w:left="720" w:hanging="360"/>
@@ -1900,7 +2381,7 @@
       <w:pPr>
         <w:numPr>
           <w:ilvl w:val="0"/>
-          <w:numId w:val="7"/>
+          <w:numId w:val="10"/>
         </w:numPr>
         <w:spacing w:after="0" w:afterAutospacing="0" w:before="0" w:beforeAutospacing="0" w:lineRule="auto"/>
         <w:ind w:left="720" w:hanging="360"/>
@@ -1916,7 +2397,7 @@
       <w:pPr>
         <w:numPr>
           <w:ilvl w:val="0"/>
-          <w:numId w:val="7"/>
+          <w:numId w:val="10"/>
         </w:numPr>
         <w:spacing w:after="0" w:afterAutospacing="0" w:before="0" w:beforeAutospacing="0" w:lineRule="auto"/>
         <w:ind w:left="720" w:hanging="360"/>
@@ -1932,7 +2413,7 @@
       <w:pPr>
         <w:numPr>
           <w:ilvl w:val="0"/>
-          <w:numId w:val="7"/>
+          <w:numId w:val="10"/>
         </w:numPr>
         <w:spacing w:after="240" w:before="0" w:beforeAutospacing="0" w:lineRule="auto"/>
         <w:ind w:left="720" w:hanging="360"/>
@@ -1972,8 +2453,8 @@
           <w:szCs w:val="46"/>
         </w:rPr>
       </w:pPr>
-      <w:bookmarkStart w:colFirst="0" w:colLast="0" w:name="_jlkomerib4ly" w:id="15"/>
-      <w:bookmarkEnd w:id="15"/>
+      <w:bookmarkStart w:colFirst="0" w:colLast="0" w:name="_jlkomerib4ly" w:id="17"/>
+      <w:bookmarkEnd w:id="17"/>
       <w:r>
         <w:rPr>
           <w:b w:val="1"/>
@@ -1995,6 +2476,71 @@
           <w:rtl w:val="0"/>
         </w:rPr>
         <w:t xml:space="preserve">La incorporación de nuevos agentes de IA, sistemas automáticos de revisión o herramientas de generación de código deberá realizarse mediante un ADR específico, preservando siempre el contrato definido en este documento.</w:t>
+      </w:r>
+    </w:p>
+    <w:p>
+      <w:pPr>
+        <w:rPr/>
+      </w:pPr>
+      <w:r>
+        <w:rPr>
+          <w:rtl w:val="0"/>
+        </w:rPr>
+      </w:r>
+    </w:p>
+    <w:p>
+      <w:pPr>
+        <w:rPr/>
+      </w:pPr>
+      <w:r>
+        <w:rPr>
+          <w:b w:val="1"/>
+          <w:bCs w:val="1"/>
+          <w:sz w:val="46"/>
+          <w:szCs w:val="46"/>
+          <w:rtl w:val="0"/>
+        </w:rPr>
+        <w:t xml:space="preserve">Criterio de detención</w:t>
+      </w:r>
+      <w:r>
+        <w:rPr>
+          <w:rtl w:val="0"/>
+        </w:rPr>
+        <w:t xml:space="preserve"> </w:t>
+      </w:r>
+    </w:p>
+    <w:p>
+      <w:pPr>
+        <w:spacing w:after="240" w:before="240" w:lineRule="auto"/>
+        <w:rPr/>
+      </w:pPr>
+      <w:r>
+        <w:rPr>
+          <w:rtl w:val="0"/>
+        </w:rPr>
+        <w:t xml:space="preserve">Durante la elaboración de una especificación técnica, la detección repetida de mejoras evolutivas sobre un mismo aspecto no constituye, por sí sola, motivo para detener la redacción.</w:t>
+      </w:r>
+    </w:p>
+    <w:p>
+      <w:pPr>
+        <w:spacing w:after="240" w:before="240" w:lineRule="auto"/>
+        <w:rPr/>
+      </w:pPr>
+      <w:r>
+        <w:rPr>
+          <w:rtl w:val="0"/>
+        </w:rPr>
+        <w:t xml:space="preserve">El trabajo únicamente deberá interrumpirse cuando exista evidencia objetiva de una inconsistencia con la arquitectura vigente.</w:t>
+      </w:r>
+    </w:p>
+    <w:p>
+      <w:pPr>
+        <w:rPr/>
+      </w:pPr>
+      <w:r>
+        <w:rPr>
+          <w:rtl w:val="0"/>
+        </w:rPr>
       </w:r>
     </w:p>
     <w:p>
@@ -2025,8 +2571,8 @@
           <w:szCs w:val="46"/>
         </w:rPr>
       </w:pPr>
-      <w:bookmarkStart w:colFirst="0" w:colLast="0" w:name="_6lfbcjgkeeok" w:id="16"/>
-      <w:bookmarkEnd w:id="16"/>
+      <w:bookmarkStart w:colFirst="0" w:colLast="0" w:name="_6lfbcjgkeeok" w:id="18"/>
+      <w:bookmarkEnd w:id="18"/>
       <w:r>
         <w:rPr>
           <w:b w:val="1"/>
@@ -2102,8 +2648,8 @@
           <w:szCs w:val="46"/>
         </w:rPr>
       </w:pPr>
-      <w:bookmarkStart w:colFirst="0" w:colLast="0" w:name="_bt0u3esnco0d" w:id="17"/>
-      <w:bookmarkEnd w:id="17"/>
+      <w:bookmarkStart w:colFirst="0" w:colLast="0" w:name="_bt0u3esnco0d" w:id="19"/>
+      <w:bookmarkEnd w:id="19"/>
       <w:r>
         <w:rPr>
           <w:b w:val="1"/>
@@ -3165,6 +3711,336 @@
     </w:lvl>
   </w:abstractNum>
   <w:abstractNum w:abstractNumId="10">
+    <w:lvl w:ilvl="0">
+      <w:start w:val="1"/>
+      <w:numFmt w:val="bullet"/>
+      <w:lvlText w:val="●"/>
+      <w:lvlJc w:val="left"/>
+      <w:pPr>
+        <w:ind w:left="720" w:hanging="360"/>
+      </w:pPr>
+      <w:rPr>
+        <w:u w:val="none"/>
+      </w:rPr>
+    </w:lvl>
+    <w:lvl w:ilvl="1">
+      <w:start w:val="1"/>
+      <w:numFmt w:val="bullet"/>
+      <w:lvlText w:val="○"/>
+      <w:lvlJc w:val="left"/>
+      <w:pPr>
+        <w:ind w:left="1440" w:hanging="360"/>
+      </w:pPr>
+      <w:rPr>
+        <w:u w:val="none"/>
+      </w:rPr>
+    </w:lvl>
+    <w:lvl w:ilvl="2">
+      <w:start w:val="1"/>
+      <w:numFmt w:val="bullet"/>
+      <w:lvlText w:val="■"/>
+      <w:lvlJc w:val="left"/>
+      <w:pPr>
+        <w:ind w:left="2160" w:hanging="360"/>
+      </w:pPr>
+      <w:rPr>
+        <w:u w:val="none"/>
+      </w:rPr>
+    </w:lvl>
+    <w:lvl w:ilvl="3">
+      <w:start w:val="1"/>
+      <w:numFmt w:val="bullet"/>
+      <w:lvlText w:val="●"/>
+      <w:lvlJc w:val="left"/>
+      <w:pPr>
+        <w:ind w:left="2880" w:hanging="360"/>
+      </w:pPr>
+      <w:rPr>
+        <w:u w:val="none"/>
+      </w:rPr>
+    </w:lvl>
+    <w:lvl w:ilvl="4">
+      <w:start w:val="1"/>
+      <w:numFmt w:val="bullet"/>
+      <w:lvlText w:val="○"/>
+      <w:lvlJc w:val="left"/>
+      <w:pPr>
+        <w:ind w:left="3600" w:hanging="360"/>
+      </w:pPr>
+      <w:rPr>
+        <w:u w:val="none"/>
+      </w:rPr>
+    </w:lvl>
+    <w:lvl w:ilvl="5">
+      <w:start w:val="1"/>
+      <w:numFmt w:val="bullet"/>
+      <w:lvlText w:val="■"/>
+      <w:lvlJc w:val="left"/>
+      <w:pPr>
+        <w:ind w:left="4320" w:hanging="360"/>
+      </w:pPr>
+      <w:rPr>
+        <w:u w:val="none"/>
+      </w:rPr>
+    </w:lvl>
+    <w:lvl w:ilvl="6">
+      <w:start w:val="1"/>
+      <w:numFmt w:val="bullet"/>
+      <w:lvlText w:val="●"/>
+      <w:lvlJc w:val="left"/>
+      <w:pPr>
+        <w:ind w:left="5040" w:hanging="360"/>
+      </w:pPr>
+      <w:rPr>
+        <w:u w:val="none"/>
+      </w:rPr>
+    </w:lvl>
+    <w:lvl w:ilvl="7">
+      <w:start w:val="1"/>
+      <w:numFmt w:val="bullet"/>
+      <w:lvlText w:val="○"/>
+      <w:lvlJc w:val="left"/>
+      <w:pPr>
+        <w:ind w:left="5760" w:hanging="360"/>
+      </w:pPr>
+      <w:rPr>
+        <w:u w:val="none"/>
+      </w:rPr>
+    </w:lvl>
+    <w:lvl w:ilvl="8">
+      <w:start w:val="1"/>
+      <w:numFmt w:val="bullet"/>
+      <w:lvlText w:val="■"/>
+      <w:lvlJc w:val="left"/>
+      <w:pPr>
+        <w:ind w:left="6480" w:hanging="360"/>
+      </w:pPr>
+      <w:rPr>
+        <w:u w:val="none"/>
+      </w:rPr>
+    </w:lvl>
+  </w:abstractNum>
+  <w:abstractNum w:abstractNumId="11">
+    <w:lvl w:ilvl="0">
+      <w:start w:val="1"/>
+      <w:numFmt w:val="bullet"/>
+      <w:lvlText w:val="●"/>
+      <w:lvlJc w:val="left"/>
+      <w:pPr>
+        <w:ind w:left="720" w:hanging="360"/>
+      </w:pPr>
+      <w:rPr>
+        <w:u w:val="none"/>
+      </w:rPr>
+    </w:lvl>
+    <w:lvl w:ilvl="1">
+      <w:start w:val="1"/>
+      <w:numFmt w:val="bullet"/>
+      <w:lvlText w:val="○"/>
+      <w:lvlJc w:val="left"/>
+      <w:pPr>
+        <w:ind w:left="1440" w:hanging="360"/>
+      </w:pPr>
+      <w:rPr>
+        <w:u w:val="none"/>
+      </w:rPr>
+    </w:lvl>
+    <w:lvl w:ilvl="2">
+      <w:start w:val="1"/>
+      <w:numFmt w:val="bullet"/>
+      <w:lvlText w:val="■"/>
+      <w:lvlJc w:val="left"/>
+      <w:pPr>
+        <w:ind w:left="2160" w:hanging="360"/>
+      </w:pPr>
+      <w:rPr>
+        <w:u w:val="none"/>
+      </w:rPr>
+    </w:lvl>
+    <w:lvl w:ilvl="3">
+      <w:start w:val="1"/>
+      <w:numFmt w:val="bullet"/>
+      <w:lvlText w:val="●"/>
+      <w:lvlJc w:val="left"/>
+      <w:pPr>
+        <w:ind w:left="2880" w:hanging="360"/>
+      </w:pPr>
+      <w:rPr>
+        <w:u w:val="none"/>
+      </w:rPr>
+    </w:lvl>
+    <w:lvl w:ilvl="4">
+      <w:start w:val="1"/>
+      <w:numFmt w:val="bullet"/>
+      <w:lvlText w:val="○"/>
+      <w:lvlJc w:val="left"/>
+      <w:pPr>
+        <w:ind w:left="3600" w:hanging="360"/>
+      </w:pPr>
+      <w:rPr>
+        <w:u w:val="none"/>
+      </w:rPr>
+    </w:lvl>
+    <w:lvl w:ilvl="5">
+      <w:start w:val="1"/>
+      <w:numFmt w:val="bullet"/>
+      <w:lvlText w:val="■"/>
+      <w:lvlJc w:val="left"/>
+      <w:pPr>
+        <w:ind w:left="4320" w:hanging="360"/>
+      </w:pPr>
+      <w:rPr>
+        <w:u w:val="none"/>
+      </w:rPr>
+    </w:lvl>
+    <w:lvl w:ilvl="6">
+      <w:start w:val="1"/>
+      <w:numFmt w:val="bullet"/>
+      <w:lvlText w:val="●"/>
+      <w:lvlJc w:val="left"/>
+      <w:pPr>
+        <w:ind w:left="5040" w:hanging="360"/>
+      </w:pPr>
+      <w:rPr>
+        <w:u w:val="none"/>
+      </w:rPr>
+    </w:lvl>
+    <w:lvl w:ilvl="7">
+      <w:start w:val="1"/>
+      <w:numFmt w:val="bullet"/>
+      <w:lvlText w:val="○"/>
+      <w:lvlJc w:val="left"/>
+      <w:pPr>
+        <w:ind w:left="5760" w:hanging="360"/>
+      </w:pPr>
+      <w:rPr>
+        <w:u w:val="none"/>
+      </w:rPr>
+    </w:lvl>
+    <w:lvl w:ilvl="8">
+      <w:start w:val="1"/>
+      <w:numFmt w:val="bullet"/>
+      <w:lvlText w:val="■"/>
+      <w:lvlJc w:val="left"/>
+      <w:pPr>
+        <w:ind w:left="6480" w:hanging="360"/>
+      </w:pPr>
+      <w:rPr>
+        <w:u w:val="none"/>
+      </w:rPr>
+    </w:lvl>
+  </w:abstractNum>
+  <w:abstractNum w:abstractNumId="12">
+    <w:lvl w:ilvl="0">
+      <w:start w:val="1"/>
+      <w:numFmt w:val="bullet"/>
+      <w:lvlText w:val="●"/>
+      <w:lvlJc w:val="left"/>
+      <w:pPr>
+        <w:ind w:left="720" w:hanging="360"/>
+      </w:pPr>
+      <w:rPr>
+        <w:u w:val="none"/>
+      </w:rPr>
+    </w:lvl>
+    <w:lvl w:ilvl="1">
+      <w:start w:val="1"/>
+      <w:numFmt w:val="bullet"/>
+      <w:lvlText w:val="○"/>
+      <w:lvlJc w:val="left"/>
+      <w:pPr>
+        <w:ind w:left="1440" w:hanging="360"/>
+      </w:pPr>
+      <w:rPr>
+        <w:u w:val="none"/>
+      </w:rPr>
+    </w:lvl>
+    <w:lvl w:ilvl="2">
+      <w:start w:val="1"/>
+      <w:numFmt w:val="bullet"/>
+      <w:lvlText w:val="■"/>
+      <w:lvlJc w:val="left"/>
+      <w:pPr>
+        <w:ind w:left="2160" w:hanging="360"/>
+      </w:pPr>
+      <w:rPr>
+        <w:u w:val="none"/>
+      </w:rPr>
+    </w:lvl>
+    <w:lvl w:ilvl="3">
+      <w:start w:val="1"/>
+      <w:numFmt w:val="bullet"/>
+      <w:lvlText w:val="●"/>
+      <w:lvlJc w:val="left"/>
+      <w:pPr>
+        <w:ind w:left="2880" w:hanging="360"/>
+      </w:pPr>
+      <w:rPr>
+        <w:u w:val="none"/>
+      </w:rPr>
+    </w:lvl>
+    <w:lvl w:ilvl="4">
+      <w:start w:val="1"/>
+      <w:numFmt w:val="bullet"/>
+      <w:lvlText w:val="○"/>
+      <w:lvlJc w:val="left"/>
+      <w:pPr>
+        <w:ind w:left="3600" w:hanging="360"/>
+      </w:pPr>
+      <w:rPr>
+        <w:u w:val="none"/>
+      </w:rPr>
+    </w:lvl>
+    <w:lvl w:ilvl="5">
+      <w:start w:val="1"/>
+      <w:numFmt w:val="bullet"/>
+      <w:lvlText w:val="■"/>
+      <w:lvlJc w:val="left"/>
+      <w:pPr>
+        <w:ind w:left="4320" w:hanging="360"/>
+      </w:pPr>
+      <w:rPr>
+        <w:u w:val="none"/>
+      </w:rPr>
+    </w:lvl>
+    <w:lvl w:ilvl="6">
+      <w:start w:val="1"/>
+      <w:numFmt w:val="bullet"/>
+      <w:lvlText w:val="●"/>
+      <w:lvlJc w:val="left"/>
+      <w:pPr>
+        <w:ind w:left="5040" w:hanging="360"/>
+      </w:pPr>
+      <w:rPr>
+        <w:u w:val="none"/>
+      </w:rPr>
+    </w:lvl>
+    <w:lvl w:ilvl="7">
+      <w:start w:val="1"/>
+      <w:numFmt w:val="bullet"/>
+      <w:lvlText w:val="○"/>
+      <w:lvlJc w:val="left"/>
+      <w:pPr>
+        <w:ind w:left="5760" w:hanging="360"/>
+      </w:pPr>
+      <w:rPr>
+        <w:u w:val="none"/>
+      </w:rPr>
+    </w:lvl>
+    <w:lvl w:ilvl="8">
+      <w:start w:val="1"/>
+      <w:numFmt w:val="bullet"/>
+      <w:lvlText w:val="■"/>
+      <w:lvlJc w:val="left"/>
+      <w:pPr>
+        <w:ind w:left="6480" w:hanging="360"/>
+      </w:pPr>
+      <w:rPr>
+        <w:u w:val="none"/>
+      </w:rPr>
+    </w:lvl>
+  </w:abstractNum>
+  <w:abstractNum w:abstractNumId="13">
     <w:lvl w:ilvl="0">
       <w:start w:val="1"/>
       <w:numFmt w:val="bullet"/>
@@ -3303,6 +4179,15 @@
   </w:num>
   <w:num w:numId="10">
     <w:abstractNumId w:val="10"/>
+  </w:num>
+  <w:num w:numId="11">
+    <w:abstractNumId w:val="11"/>
+  </w:num>
+  <w:num w:numId="12">
+    <w:abstractNumId w:val="12"/>
+  </w:num>
+  <w:num w:numId="13">
+    <w:abstractNumId w:val="13"/>
   </w:num>
 </w:numbering>
 </file>

</xml_diff>

<commit_message>
docs: strengthen development and capability determination process
</commit_message>
<xml_diff>
--- a/docs/DOC-017 — Proceso de Desarrollo Asistido por Inteligencia Artificial.docx
+++ b/docs/DOC-017 — Proceso de Desarrollo Asistido por Inteligencia Artificial.docx
@@ -99,7 +99,7 @@
       <w:pPr>
         <w:numPr>
           <w:ilvl w:val="0"/>
-          <w:numId w:val="12"/>
+          <w:numId w:val="17"/>
         </w:numPr>
         <w:spacing w:after="0" w:afterAutospacing="0" w:before="240" w:lineRule="auto"/>
         <w:ind w:left="720" w:hanging="360"/>
@@ -123,7 +123,7 @@
       <w:pPr>
         <w:numPr>
           <w:ilvl w:val="0"/>
-          <w:numId w:val="12"/>
+          <w:numId w:val="17"/>
         </w:numPr>
         <w:spacing w:after="0" w:afterAutospacing="0" w:before="0" w:beforeAutospacing="0" w:lineRule="auto"/>
         <w:ind w:left="720" w:hanging="360"/>
@@ -147,7 +147,7 @@
       <w:pPr>
         <w:numPr>
           <w:ilvl w:val="0"/>
-          <w:numId w:val="12"/>
+          <w:numId w:val="17"/>
         </w:numPr>
         <w:spacing w:after="0" w:afterAutospacing="0" w:before="0" w:beforeAutospacing="0" w:lineRule="auto"/>
         <w:ind w:left="720" w:hanging="360"/>
@@ -171,7 +171,7 @@
       <w:pPr>
         <w:numPr>
           <w:ilvl w:val="0"/>
-          <w:numId w:val="12"/>
+          <w:numId w:val="17"/>
         </w:numPr>
         <w:spacing w:after="0" w:afterAutospacing="0" w:before="0" w:beforeAutospacing="0" w:lineRule="auto"/>
         <w:ind w:left="720" w:hanging="360"/>
@@ -195,7 +195,7 @@
       <w:pPr>
         <w:numPr>
           <w:ilvl w:val="0"/>
-          <w:numId w:val="12"/>
+          <w:numId w:val="17"/>
         </w:numPr>
         <w:spacing w:after="0" w:afterAutospacing="0" w:before="0" w:beforeAutospacing="0" w:lineRule="auto"/>
         <w:ind w:left="720" w:hanging="360"/>
@@ -219,7 +219,7 @@
       <w:pPr>
         <w:numPr>
           <w:ilvl w:val="0"/>
-          <w:numId w:val="12"/>
+          <w:numId w:val="17"/>
         </w:numPr>
         <w:spacing w:after="0" w:afterAutospacing="0" w:before="0" w:beforeAutospacing="0" w:lineRule="auto"/>
         <w:ind w:left="720" w:hanging="360"/>
@@ -237,7 +237,7 @@
       <w:pPr>
         <w:numPr>
           <w:ilvl w:val="1"/>
-          <w:numId w:val="12"/>
+          <w:numId w:val="17"/>
         </w:numPr>
         <w:spacing w:after="0" w:afterAutospacing="0" w:before="0" w:beforeAutospacing="0" w:lineRule="auto"/>
         <w:ind w:left="1440" w:hanging="360"/>
@@ -253,7 +253,7 @@
       <w:pPr>
         <w:numPr>
           <w:ilvl w:val="1"/>
-          <w:numId w:val="12"/>
+          <w:numId w:val="17"/>
         </w:numPr>
         <w:spacing w:after="0" w:afterAutospacing="0" w:before="0" w:beforeAutospacing="0" w:lineRule="auto"/>
         <w:ind w:left="1440" w:hanging="360"/>
@@ -269,7 +269,7 @@
       <w:pPr>
         <w:numPr>
           <w:ilvl w:val="1"/>
-          <w:numId w:val="12"/>
+          <w:numId w:val="17"/>
         </w:numPr>
         <w:spacing w:after="0" w:afterAutospacing="0" w:before="0" w:beforeAutospacing="0" w:lineRule="auto"/>
         <w:ind w:left="1440" w:hanging="360"/>
@@ -285,7 +285,7 @@
       <w:pPr>
         <w:numPr>
           <w:ilvl w:val="1"/>
-          <w:numId w:val="12"/>
+          <w:numId w:val="17"/>
         </w:numPr>
         <w:spacing w:after="0" w:afterAutospacing="0" w:before="0" w:beforeAutospacing="0" w:lineRule="auto"/>
         <w:ind w:left="1440" w:hanging="360"/>
@@ -301,7 +301,7 @@
       <w:pPr>
         <w:numPr>
           <w:ilvl w:val="1"/>
-          <w:numId w:val="12"/>
+          <w:numId w:val="17"/>
         </w:numPr>
         <w:spacing w:after="240" w:before="0" w:beforeAutospacing="0" w:lineRule="auto"/>
         <w:ind w:left="1440" w:hanging="360"/>
@@ -435,7 +435,7 @@
       <w:pPr>
         <w:numPr>
           <w:ilvl w:val="0"/>
-          <w:numId w:val="9"/>
+          <w:numId w:val="14"/>
         </w:numPr>
         <w:spacing w:after="0" w:afterAutospacing="0" w:before="240" w:lineRule="auto"/>
         <w:ind w:left="720" w:hanging="360"/>
@@ -451,7 +451,7 @@
       <w:pPr>
         <w:numPr>
           <w:ilvl w:val="0"/>
-          <w:numId w:val="9"/>
+          <w:numId w:val="14"/>
         </w:numPr>
         <w:spacing w:after="0" w:afterAutospacing="0" w:before="0" w:beforeAutospacing="0" w:lineRule="auto"/>
         <w:ind w:left="720" w:hanging="360"/>
@@ -467,7 +467,7 @@
       <w:pPr>
         <w:numPr>
           <w:ilvl w:val="0"/>
-          <w:numId w:val="9"/>
+          <w:numId w:val="14"/>
         </w:numPr>
         <w:spacing w:after="0" w:afterAutospacing="0" w:before="0" w:beforeAutospacing="0" w:lineRule="auto"/>
         <w:ind w:left="720" w:hanging="360"/>
@@ -483,7 +483,7 @@
       <w:pPr>
         <w:numPr>
           <w:ilvl w:val="0"/>
-          <w:numId w:val="9"/>
+          <w:numId w:val="14"/>
         </w:numPr>
         <w:spacing w:after="0" w:afterAutospacing="0" w:before="0" w:beforeAutospacing="0" w:lineRule="auto"/>
         <w:ind w:left="720" w:hanging="360"/>
@@ -499,7 +499,7 @@
       <w:pPr>
         <w:numPr>
           <w:ilvl w:val="0"/>
-          <w:numId w:val="9"/>
+          <w:numId w:val="14"/>
         </w:numPr>
         <w:spacing w:after="0" w:afterAutospacing="0" w:before="0" w:beforeAutospacing="0" w:lineRule="auto"/>
         <w:ind w:left="720" w:hanging="360"/>
@@ -515,7 +515,7 @@
       <w:pPr>
         <w:numPr>
           <w:ilvl w:val="0"/>
-          <w:numId w:val="9"/>
+          <w:numId w:val="14"/>
         </w:numPr>
         <w:spacing w:after="0" w:afterAutospacing="0" w:before="0" w:beforeAutospacing="0" w:lineRule="auto"/>
         <w:ind w:left="720" w:hanging="360"/>
@@ -534,7 +534,7 @@
       <w:pPr>
         <w:numPr>
           <w:ilvl w:val="0"/>
-          <w:numId w:val="9"/>
+          <w:numId w:val="14"/>
         </w:numPr>
         <w:spacing w:after="240" w:before="0" w:beforeAutospacing="0" w:lineRule="auto"/>
         <w:ind w:left="720" w:hanging="360"/>
@@ -604,7 +604,7 @@
       <w:pPr>
         <w:numPr>
           <w:ilvl w:val="0"/>
-          <w:numId w:val="4"/>
+          <w:numId w:val="7"/>
         </w:numPr>
         <w:spacing w:after="0" w:afterAutospacing="0" w:before="240" w:lineRule="auto"/>
         <w:ind w:left="720" w:hanging="360"/>
@@ -620,7 +620,7 @@
       <w:pPr>
         <w:numPr>
           <w:ilvl w:val="0"/>
-          <w:numId w:val="4"/>
+          <w:numId w:val="7"/>
         </w:numPr>
         <w:spacing w:after="0" w:afterAutospacing="0" w:before="0" w:beforeAutospacing="0" w:lineRule="auto"/>
         <w:ind w:left="720" w:hanging="360"/>
@@ -636,7 +636,7 @@
       <w:pPr>
         <w:numPr>
           <w:ilvl w:val="0"/>
-          <w:numId w:val="4"/>
+          <w:numId w:val="7"/>
         </w:numPr>
         <w:spacing w:after="0" w:afterAutospacing="0" w:before="0" w:beforeAutospacing="0" w:lineRule="auto"/>
         <w:ind w:left="720" w:hanging="360"/>
@@ -652,7 +652,7 @@
       <w:pPr>
         <w:numPr>
           <w:ilvl w:val="0"/>
-          <w:numId w:val="4"/>
+          <w:numId w:val="7"/>
         </w:numPr>
         <w:spacing w:after="240" w:before="0" w:beforeAutospacing="0" w:lineRule="auto"/>
         <w:ind w:left="720" w:hanging="360"/>
@@ -741,7 +741,7 @@
       <w:pPr>
         <w:numPr>
           <w:ilvl w:val="0"/>
-          <w:numId w:val="7"/>
+          <w:numId w:val="12"/>
         </w:numPr>
         <w:spacing w:after="0" w:afterAutospacing="0" w:before="240" w:lineRule="auto"/>
         <w:ind w:left="720" w:hanging="360"/>
@@ -757,7 +757,7 @@
       <w:pPr>
         <w:numPr>
           <w:ilvl w:val="0"/>
-          <w:numId w:val="7"/>
+          <w:numId w:val="12"/>
         </w:numPr>
         <w:spacing w:after="0" w:afterAutospacing="0" w:before="0" w:beforeAutospacing="0" w:lineRule="auto"/>
         <w:ind w:left="720" w:hanging="360"/>
@@ -773,7 +773,7 @@
       <w:pPr>
         <w:numPr>
           <w:ilvl w:val="0"/>
-          <w:numId w:val="7"/>
+          <w:numId w:val="12"/>
         </w:numPr>
         <w:spacing w:after="0" w:afterAutospacing="0" w:before="0" w:beforeAutospacing="0" w:lineRule="auto"/>
         <w:ind w:left="720" w:hanging="360"/>
@@ -789,7 +789,7 @@
       <w:pPr>
         <w:numPr>
           <w:ilvl w:val="0"/>
-          <w:numId w:val="7"/>
+          <w:numId w:val="12"/>
         </w:numPr>
         <w:spacing w:after="240" w:before="0" w:beforeAutospacing="0" w:lineRule="auto"/>
         <w:ind w:left="720" w:hanging="360"/>
@@ -973,7 +973,7 @@
       <w:pPr>
         <w:numPr>
           <w:ilvl w:val="0"/>
-          <w:numId w:val="8"/>
+          <w:numId w:val="13"/>
         </w:numPr>
         <w:spacing w:after="0" w:afterAutospacing="0" w:before="240" w:lineRule="auto"/>
         <w:ind w:left="720" w:hanging="360"/>
@@ -989,7 +989,7 @@
       <w:pPr>
         <w:numPr>
           <w:ilvl w:val="0"/>
-          <w:numId w:val="8"/>
+          <w:numId w:val="13"/>
         </w:numPr>
         <w:spacing w:after="0" w:afterAutospacing="0" w:before="0" w:beforeAutospacing="0" w:lineRule="auto"/>
         <w:ind w:left="720" w:hanging="360"/>
@@ -1005,7 +1005,7 @@
       <w:pPr>
         <w:numPr>
           <w:ilvl w:val="0"/>
-          <w:numId w:val="8"/>
+          <w:numId w:val="13"/>
         </w:numPr>
         <w:spacing w:after="0" w:afterAutospacing="0" w:before="0" w:beforeAutospacing="0" w:lineRule="auto"/>
         <w:ind w:left="720" w:hanging="360"/>
@@ -1021,7 +1021,7 @@
       <w:pPr>
         <w:numPr>
           <w:ilvl w:val="0"/>
-          <w:numId w:val="8"/>
+          <w:numId w:val="13"/>
         </w:numPr>
         <w:spacing w:after="0" w:afterAutospacing="0" w:before="0" w:beforeAutospacing="0" w:lineRule="auto"/>
         <w:ind w:left="720" w:hanging="360"/>
@@ -1037,7 +1037,7 @@
       <w:pPr>
         <w:numPr>
           <w:ilvl w:val="0"/>
-          <w:numId w:val="8"/>
+          <w:numId w:val="13"/>
         </w:numPr>
         <w:spacing w:after="240" w:before="0" w:beforeAutospacing="0" w:lineRule="auto"/>
         <w:ind w:left="720" w:hanging="360"/>
@@ -1068,7 +1068,7 @@
       <w:pPr>
         <w:numPr>
           <w:ilvl w:val="0"/>
-          <w:numId w:val="6"/>
+          <w:numId w:val="9"/>
         </w:numPr>
         <w:spacing w:after="0" w:afterAutospacing="0" w:before="240" w:lineRule="auto"/>
         <w:ind w:left="720" w:hanging="360"/>
@@ -1084,7 +1084,7 @@
       <w:pPr>
         <w:numPr>
           <w:ilvl w:val="0"/>
-          <w:numId w:val="6"/>
+          <w:numId w:val="9"/>
         </w:numPr>
         <w:spacing w:after="0" w:afterAutospacing="0" w:before="0" w:beforeAutospacing="0" w:lineRule="auto"/>
         <w:ind w:left="720" w:hanging="360"/>
@@ -1100,7 +1100,7 @@
       <w:pPr>
         <w:numPr>
           <w:ilvl w:val="0"/>
-          <w:numId w:val="6"/>
+          <w:numId w:val="9"/>
         </w:numPr>
         <w:spacing w:after="240" w:before="0" w:beforeAutospacing="0" w:lineRule="auto"/>
         <w:ind w:left="720" w:hanging="360"/>
@@ -1204,7 +1204,7 @@
       <w:pPr>
         <w:numPr>
           <w:ilvl w:val="0"/>
-          <w:numId w:val="13"/>
+          <w:numId w:val="18"/>
         </w:numPr>
         <w:spacing w:after="0" w:afterAutospacing="0" w:before="240" w:lineRule="auto"/>
         <w:ind w:left="720" w:hanging="360"/>
@@ -1220,7 +1220,7 @@
       <w:pPr>
         <w:numPr>
           <w:ilvl w:val="0"/>
-          <w:numId w:val="13"/>
+          <w:numId w:val="18"/>
         </w:numPr>
         <w:spacing w:after="0" w:afterAutospacing="0" w:before="0" w:beforeAutospacing="0" w:lineRule="auto"/>
         <w:ind w:left="720" w:hanging="360"/>
@@ -1236,7 +1236,7 @@
       <w:pPr>
         <w:numPr>
           <w:ilvl w:val="0"/>
-          <w:numId w:val="13"/>
+          <w:numId w:val="18"/>
         </w:numPr>
         <w:spacing w:after="0" w:afterAutospacing="0" w:before="0" w:beforeAutospacing="0" w:lineRule="auto"/>
         <w:ind w:left="720" w:hanging="360"/>
@@ -1252,7 +1252,7 @@
       <w:pPr>
         <w:numPr>
           <w:ilvl w:val="0"/>
-          <w:numId w:val="13"/>
+          <w:numId w:val="18"/>
         </w:numPr>
         <w:spacing w:after="240" w:before="0" w:beforeAutospacing="0" w:lineRule="auto"/>
         <w:ind w:left="720" w:hanging="360"/>
@@ -1359,7 +1359,7 @@
       <w:pPr>
         <w:numPr>
           <w:ilvl w:val="0"/>
-          <w:numId w:val="2"/>
+          <w:numId w:val="4"/>
         </w:numPr>
         <w:spacing w:after="0" w:afterAutospacing="0" w:before="240" w:lineRule="auto"/>
         <w:ind w:left="720" w:hanging="360"/>
@@ -1375,7 +1375,7 @@
       <w:pPr>
         <w:numPr>
           <w:ilvl w:val="0"/>
-          <w:numId w:val="2"/>
+          <w:numId w:val="4"/>
         </w:numPr>
         <w:spacing w:after="0" w:afterAutospacing="0" w:before="0" w:beforeAutospacing="0" w:lineRule="auto"/>
         <w:ind w:left="720" w:hanging="360"/>
@@ -1391,7 +1391,7 @@
       <w:pPr>
         <w:numPr>
           <w:ilvl w:val="0"/>
-          <w:numId w:val="2"/>
+          <w:numId w:val="4"/>
         </w:numPr>
         <w:spacing w:after="0" w:afterAutospacing="0" w:before="0" w:beforeAutospacing="0" w:lineRule="auto"/>
         <w:ind w:left="720" w:hanging="360"/>
@@ -1407,7 +1407,7 @@
       <w:pPr>
         <w:numPr>
           <w:ilvl w:val="0"/>
-          <w:numId w:val="2"/>
+          <w:numId w:val="4"/>
         </w:numPr>
         <w:spacing w:after="240" w:before="0" w:beforeAutospacing="0" w:lineRule="auto"/>
         <w:ind w:left="720" w:hanging="360"/>
@@ -1546,6 +1546,802 @@
           <w:rtl w:val="0"/>
         </w:rPr>
         <w:t xml:space="preserve">Inicialmente estará basada en herramientas locales y evolucionará hacia CI/CD cuando el proyecto lo requiera.</w:t>
+        <w:br w:type="textWrapping"/>
+        <w:br w:type="textWrapping"/>
+        <w:br w:type="textWrapping"/>
+      </w:r>
+      <w:r>
+        <w:rPr>
+          <w:b w:val="1"/>
+          <w:bCs w:val="1"/>
+          <w:sz w:val="34"/>
+          <w:szCs w:val="34"/>
+          <w:rtl w:val="0"/>
+        </w:rPr>
+        <w:t xml:space="preserve">4.1 Revisión multidisciplinaria </w:t>
+        <w:br w:type="textWrapping"/>
+      </w:r>
+      <w:r>
+        <w:rPr>
+          <w:rtl w:val="0"/>
+        </w:rPr>
+      </w:r>
+    </w:p>
+    <w:p>
+      <w:pPr>
+        <w:spacing w:after="240" w:before="240" w:lineRule="auto"/>
+        <w:rPr/>
+      </w:pPr>
+      <w:r>
+        <w:rPr>
+          <w:rtl w:val="0"/>
+        </w:rPr>
+        <w:t xml:space="preserve">Durante la elaboración de documentación arquitectónica (DOC), decisiones arquitectónicas (ADR) o especificaciones técnicas (IT), el Arquitecto Técnico deberá analizar la solución desde múltiples perspectivas de ingeniería antes de consolidar la versión final del documento.</w:t>
+      </w:r>
+    </w:p>
+    <w:p>
+      <w:pPr>
+        <w:spacing w:after="240" w:before="240" w:lineRule="auto"/>
+        <w:rPr/>
+      </w:pPr>
+      <w:r>
+        <w:rPr>
+          <w:rtl w:val="0"/>
+        </w:rPr>
+        <w:t xml:space="preserve">Estas perspectivas constituyen un mecanismo interno de revisión arquitectónica y no representan nuevos responsables del proceso definido en este documento.</w:t>
+      </w:r>
+    </w:p>
+    <w:p>
+      <w:pPr>
+        <w:spacing w:after="240" w:before="240" w:lineRule="auto"/>
+        <w:rPr/>
+      </w:pPr>
+      <w:r>
+        <w:rPr>
+          <w:rtl w:val="0"/>
+        </w:rPr>
+        <w:t xml:space="preserve">Como mínimo deberán considerarse las siguientes disciplinas:</w:t>
+      </w:r>
+    </w:p>
+    <w:p>
+      <w:pPr>
+        <w:pStyle w:val="Heading3"/>
+        <w:keepNext w:val="0"/>
+        <w:keepLines w:val="0"/>
+        <w:spacing w:before="280" w:lineRule="auto"/>
+        <w:rPr>
+          <w:b w:val="1"/>
+          <w:bCs w:val="1"/>
+          <w:color w:val="000000"/>
+          <w:sz w:val="26"/>
+          <w:szCs w:val="26"/>
+        </w:rPr>
+      </w:pPr>
+      <w:bookmarkStart w:colFirst="0" w:colLast="0" w:name="_wf36jc3namjw" w:id="12"/>
+      <w:bookmarkEnd w:id="12"/>
+      <w:r>
+        <w:rPr>
+          <w:b w:val="1"/>
+          <w:bCs w:val="1"/>
+          <w:color w:val="000000"/>
+          <w:sz w:val="26"/>
+          <w:szCs w:val="26"/>
+          <w:rtl w:val="0"/>
+        </w:rPr>
+        <w:t xml:space="preserve">Arquitectura</w:t>
+      </w:r>
+    </w:p>
+    <w:p>
+      <w:pPr>
+        <w:spacing w:after="240" w:before="240" w:lineRule="auto"/>
+        <w:rPr/>
+      </w:pPr>
+      <w:r>
+        <w:rPr>
+          <w:rtl w:val="0"/>
+        </w:rPr>
+        <w:t xml:space="preserve">Verificar:</w:t>
+      </w:r>
+    </w:p>
+    <w:p>
+      <w:pPr>
+        <w:numPr>
+          <w:ilvl w:val="0"/>
+          <w:numId w:val="10"/>
+        </w:numPr>
+        <w:spacing w:after="0" w:afterAutospacing="0" w:before="240" w:lineRule="auto"/>
+        <w:ind w:left="720" w:hanging="360"/>
+      </w:pPr>
+      <w:r>
+        <w:rPr>
+          <w:rtl w:val="0"/>
+        </w:rPr>
+        <w:t xml:space="preserve">responsabilidades;</w:t>
+      </w:r>
+    </w:p>
+    <w:p>
+      <w:pPr>
+        <w:numPr>
+          <w:ilvl w:val="0"/>
+          <w:numId w:val="10"/>
+        </w:numPr>
+        <w:spacing w:after="0" w:afterAutospacing="0" w:before="0" w:beforeAutospacing="0" w:lineRule="auto"/>
+        <w:ind w:left="720" w:hanging="360"/>
+      </w:pPr>
+      <w:r>
+        <w:rPr>
+          <w:rtl w:val="0"/>
+        </w:rPr>
+        <w:t xml:space="preserve">límites del dominio;</w:t>
+      </w:r>
+    </w:p>
+    <w:p>
+      <w:pPr>
+        <w:numPr>
+          <w:ilvl w:val="0"/>
+          <w:numId w:val="10"/>
+        </w:numPr>
+        <w:spacing w:after="0" w:afterAutospacing="0" w:before="0" w:beforeAutospacing="0" w:lineRule="auto"/>
+        <w:ind w:left="720" w:hanging="360"/>
+      </w:pPr>
+      <w:r>
+        <w:rPr>
+          <w:rtl w:val="0"/>
+        </w:rPr>
+        <w:t xml:space="preserve">coherencia con la arquitectura vigente;</w:t>
+      </w:r>
+    </w:p>
+    <w:p>
+      <w:pPr>
+        <w:numPr>
+          <w:ilvl w:val="0"/>
+          <w:numId w:val="10"/>
+        </w:numPr>
+        <w:spacing w:after="240" w:before="0" w:beforeAutospacing="0" w:lineRule="auto"/>
+        <w:ind w:left="720" w:hanging="360"/>
+      </w:pPr>
+      <w:r>
+        <w:rPr>
+          <w:rtl w:val="0"/>
+        </w:rPr>
+        <w:t xml:space="preserve">separación de responsabilidades.</w:t>
+      </w:r>
+    </w:p>
+    <w:p>
+      <w:pPr>
+        <w:rPr/>
+      </w:pPr>
+      <w:r>
+        <w:pict>
+          <v:rect style="width:0.0pt;height:1.5pt" o:hr="t" o:hrstd="t" o:hralign="center" fillcolor="#A0A0A0" stroked="f"/>
+        </w:pict>
+      </w:r>
+      <w:r>
+        <w:rPr>
+          <w:rtl w:val="0"/>
+        </w:rPr>
+      </w:r>
+    </w:p>
+    <w:p>
+      <w:pPr>
+        <w:pStyle w:val="Heading3"/>
+        <w:keepNext w:val="0"/>
+        <w:keepLines w:val="0"/>
+        <w:spacing w:before="280" w:lineRule="auto"/>
+        <w:rPr>
+          <w:b w:val="1"/>
+          <w:bCs w:val="1"/>
+          <w:color w:val="000000"/>
+          <w:sz w:val="26"/>
+          <w:szCs w:val="26"/>
+        </w:rPr>
+      </w:pPr>
+      <w:bookmarkStart w:colFirst="0" w:colLast="0" w:name="_2wcfofr6q6vz" w:id="13"/>
+      <w:bookmarkEnd w:id="13"/>
+      <w:r>
+        <w:rPr>
+          <w:b w:val="1"/>
+          <w:bCs w:val="1"/>
+          <w:color w:val="000000"/>
+          <w:sz w:val="26"/>
+          <w:szCs w:val="26"/>
+          <w:rtl w:val="0"/>
+        </w:rPr>
+        <w:t xml:space="preserve">Ingeniería Cuantitativa</w:t>
+      </w:r>
+    </w:p>
+    <w:p>
+      <w:pPr>
+        <w:spacing w:after="240" w:before="240" w:lineRule="auto"/>
+        <w:rPr/>
+      </w:pPr>
+      <w:r>
+        <w:rPr>
+          <w:rtl w:val="0"/>
+        </w:rPr>
+        <w:t xml:space="preserve">Verificar:</w:t>
+      </w:r>
+    </w:p>
+    <w:p>
+      <w:pPr>
+        <w:numPr>
+          <w:ilvl w:val="0"/>
+          <w:numId w:val="11"/>
+        </w:numPr>
+        <w:spacing w:after="0" w:afterAutospacing="0" w:before="240" w:lineRule="auto"/>
+        <w:ind w:left="720" w:hanging="360"/>
+      </w:pPr>
+      <w:r>
+        <w:rPr>
+          <w:rtl w:val="0"/>
+        </w:rPr>
+        <w:t xml:space="preserve">coherencia matemática;</w:t>
+      </w:r>
+    </w:p>
+    <w:p>
+      <w:pPr>
+        <w:numPr>
+          <w:ilvl w:val="0"/>
+          <w:numId w:val="11"/>
+        </w:numPr>
+        <w:spacing w:after="0" w:afterAutospacing="0" w:before="0" w:beforeAutospacing="0" w:lineRule="auto"/>
+        <w:ind w:left="720" w:hanging="360"/>
+      </w:pPr>
+      <w:r>
+        <w:rPr>
+          <w:rtl w:val="0"/>
+        </w:rPr>
+        <w:t xml:space="preserve">semántica cuantitativa;</w:t>
+      </w:r>
+    </w:p>
+    <w:p>
+      <w:pPr>
+        <w:numPr>
+          <w:ilvl w:val="0"/>
+          <w:numId w:val="11"/>
+        </w:numPr>
+        <w:spacing w:after="0" w:afterAutospacing="0" w:before="0" w:beforeAutospacing="0" w:lineRule="auto"/>
+        <w:ind w:left="720" w:hanging="360"/>
+      </w:pPr>
+      <w:r>
+        <w:rPr>
+          <w:rtl w:val="0"/>
+        </w:rPr>
+        <w:t xml:space="preserve">validez del modelo de negocio;</w:t>
+      </w:r>
+    </w:p>
+    <w:p>
+      <w:pPr>
+        <w:numPr>
+          <w:ilvl w:val="0"/>
+          <w:numId w:val="11"/>
+        </w:numPr>
+        <w:spacing w:after="240" w:before="0" w:beforeAutospacing="0" w:lineRule="auto"/>
+        <w:ind w:left="720" w:hanging="360"/>
+      </w:pPr>
+      <w:r>
+        <w:rPr>
+          <w:rtl w:val="0"/>
+        </w:rPr>
+        <w:t xml:space="preserve">interpretación de resultados.</w:t>
+      </w:r>
+    </w:p>
+    <w:p>
+      <w:pPr>
+        <w:rPr/>
+      </w:pPr>
+      <w:r>
+        <w:pict>
+          <v:rect style="width:0.0pt;height:1.5pt" o:hr="t" o:hrstd="t" o:hralign="center" fillcolor="#A0A0A0" stroked="f"/>
+        </w:pict>
+      </w:r>
+      <w:r>
+        <w:rPr>
+          <w:rtl w:val="0"/>
+        </w:rPr>
+      </w:r>
+    </w:p>
+    <w:p>
+      <w:pPr>
+        <w:pStyle w:val="Heading3"/>
+        <w:keepNext w:val="0"/>
+        <w:keepLines w:val="0"/>
+        <w:spacing w:before="280" w:lineRule="auto"/>
+        <w:rPr>
+          <w:b w:val="1"/>
+          <w:bCs w:val="1"/>
+          <w:color w:val="000000"/>
+          <w:sz w:val="26"/>
+          <w:szCs w:val="26"/>
+        </w:rPr>
+      </w:pPr>
+      <w:bookmarkStart w:colFirst="0" w:colLast="0" w:name="_9jcb0yi23wuk" w:id="14"/>
+      <w:bookmarkEnd w:id="14"/>
+      <w:r>
+        <w:rPr>
+          <w:b w:val="1"/>
+          <w:bCs w:val="1"/>
+          <w:color w:val="000000"/>
+          <w:sz w:val="26"/>
+          <w:szCs w:val="26"/>
+          <w:rtl w:val="0"/>
+        </w:rPr>
+        <w:t xml:space="preserve">Ingeniería de Datos</w:t>
+      </w:r>
+    </w:p>
+    <w:p>
+      <w:pPr>
+        <w:spacing w:after="240" w:before="240" w:lineRule="auto"/>
+        <w:rPr/>
+      </w:pPr>
+      <w:r>
+        <w:rPr>
+          <w:rtl w:val="0"/>
+        </w:rPr>
+        <w:t xml:space="preserve">Verificar:</w:t>
+      </w:r>
+    </w:p>
+    <w:p>
+      <w:pPr>
+        <w:numPr>
+          <w:ilvl w:val="0"/>
+          <w:numId w:val="2"/>
+        </w:numPr>
+        <w:spacing w:after="0" w:afterAutospacing="0" w:before="240" w:lineRule="auto"/>
+        <w:ind w:left="720" w:hanging="360"/>
+      </w:pPr>
+      <w:r>
+        <w:rPr>
+          <w:rtl w:val="0"/>
+        </w:rPr>
+        <w:t xml:space="preserve">contratos;</w:t>
+      </w:r>
+    </w:p>
+    <w:p>
+      <w:pPr>
+        <w:numPr>
+          <w:ilvl w:val="0"/>
+          <w:numId w:val="2"/>
+        </w:numPr>
+        <w:spacing w:after="0" w:afterAutospacing="0" w:before="0" w:beforeAutospacing="0" w:lineRule="auto"/>
+        <w:ind w:left="720" w:hanging="360"/>
+      </w:pPr>
+      <w:r>
+        <w:rPr>
+          <w:rtl w:val="0"/>
+        </w:rPr>
+        <w:t xml:space="preserve">flujo de información;</w:t>
+      </w:r>
+    </w:p>
+    <w:p>
+      <w:pPr>
+        <w:numPr>
+          <w:ilvl w:val="0"/>
+          <w:numId w:val="2"/>
+        </w:numPr>
+        <w:spacing w:after="0" w:afterAutospacing="0" w:before="0" w:beforeAutospacing="0" w:lineRule="auto"/>
+        <w:ind w:left="720" w:hanging="360"/>
+      </w:pPr>
+      <w:r>
+        <w:rPr>
+          <w:rtl w:val="0"/>
+        </w:rPr>
+        <w:t xml:space="preserve">desacoplamiento entre dominios;</w:t>
+      </w:r>
+    </w:p>
+    <w:p>
+      <w:pPr>
+        <w:numPr>
+          <w:ilvl w:val="0"/>
+          <w:numId w:val="2"/>
+        </w:numPr>
+        <w:spacing w:after="240" w:before="0" w:beforeAutospacing="0" w:lineRule="auto"/>
+        <w:ind w:left="720" w:hanging="360"/>
+      </w:pPr>
+      <w:r>
+        <w:rPr>
+          <w:rtl w:val="0"/>
+        </w:rPr>
+        <w:t xml:space="preserve">estabilidad de interfaces.</w:t>
+      </w:r>
+    </w:p>
+    <w:p>
+      <w:pPr>
+        <w:rPr/>
+      </w:pPr>
+      <w:r>
+        <w:pict>
+          <v:rect style="width:0.0pt;height:1.5pt" o:hr="t" o:hrstd="t" o:hralign="center" fillcolor="#A0A0A0" stroked="f"/>
+        </w:pict>
+      </w:r>
+      <w:r>
+        <w:rPr>
+          <w:rtl w:val="0"/>
+        </w:rPr>
+      </w:r>
+    </w:p>
+    <w:p>
+      <w:pPr>
+        <w:pStyle w:val="Heading3"/>
+        <w:keepNext w:val="0"/>
+        <w:keepLines w:val="0"/>
+        <w:spacing w:before="280" w:lineRule="auto"/>
+        <w:rPr>
+          <w:b w:val="1"/>
+          <w:bCs w:val="1"/>
+          <w:color w:val="000000"/>
+          <w:sz w:val="26"/>
+          <w:szCs w:val="26"/>
+        </w:rPr>
+      </w:pPr>
+      <w:bookmarkStart w:colFirst="0" w:colLast="0" w:name="_46w4piez3z50" w:id="15"/>
+      <w:bookmarkEnd w:id="15"/>
+      <w:r>
+        <w:rPr>
+          <w:b w:val="1"/>
+          <w:bCs w:val="1"/>
+          <w:color w:val="000000"/>
+          <w:sz w:val="26"/>
+          <w:szCs w:val="26"/>
+          <w:rtl w:val="0"/>
+        </w:rPr>
+        <w:t xml:space="preserve">Gestión del Proyecto</w:t>
+      </w:r>
+    </w:p>
+    <w:p>
+      <w:pPr>
+        <w:spacing w:after="240" w:before="240" w:lineRule="auto"/>
+        <w:rPr/>
+      </w:pPr>
+      <w:r>
+        <w:rPr>
+          <w:rtl w:val="0"/>
+        </w:rPr>
+        <w:t xml:space="preserve">Verificar:</w:t>
+      </w:r>
+    </w:p>
+    <w:p>
+      <w:pPr>
+        <w:numPr>
+          <w:ilvl w:val="0"/>
+          <w:numId w:val="3"/>
+        </w:numPr>
+        <w:spacing w:after="0" w:afterAutospacing="0" w:before="240" w:lineRule="auto"/>
+        <w:ind w:left="720" w:hanging="360"/>
+      </w:pPr>
+      <w:r>
+        <w:rPr>
+          <w:rtl w:val="0"/>
+        </w:rPr>
+        <w:t xml:space="preserve">alcance;</w:t>
+      </w:r>
+    </w:p>
+    <w:p>
+      <w:pPr>
+        <w:numPr>
+          <w:ilvl w:val="0"/>
+          <w:numId w:val="3"/>
+        </w:numPr>
+        <w:spacing w:after="0" w:afterAutospacing="0" w:before="0" w:beforeAutospacing="0" w:lineRule="auto"/>
+        <w:ind w:left="720" w:hanging="360"/>
+      </w:pPr>
+      <w:r>
+        <w:rPr>
+          <w:rtl w:val="0"/>
+        </w:rPr>
+        <w:t xml:space="preserve">entregables;</w:t>
+      </w:r>
+    </w:p>
+    <w:p>
+      <w:pPr>
+        <w:numPr>
+          <w:ilvl w:val="0"/>
+          <w:numId w:val="3"/>
+        </w:numPr>
+        <w:spacing w:after="0" w:afterAutospacing="0" w:before="0" w:beforeAutospacing="0" w:lineRule="auto"/>
+        <w:ind w:left="720" w:hanging="360"/>
+      </w:pPr>
+      <w:r>
+        <w:rPr>
+          <w:rtl w:val="0"/>
+        </w:rPr>
+        <w:t xml:space="preserve">trazabilidad;</w:t>
+      </w:r>
+    </w:p>
+    <w:p>
+      <w:pPr>
+        <w:numPr>
+          <w:ilvl w:val="0"/>
+          <w:numId w:val="3"/>
+        </w:numPr>
+        <w:spacing w:after="0" w:afterAutospacing="0" w:before="0" w:beforeAutospacing="0" w:lineRule="auto"/>
+        <w:ind w:left="720" w:hanging="360"/>
+      </w:pPr>
+      <w:r>
+        <w:rPr>
+          <w:rtl w:val="0"/>
+        </w:rPr>
+        <w:t xml:space="preserve">implementación incremental;</w:t>
+      </w:r>
+    </w:p>
+    <w:p>
+      <w:pPr>
+        <w:numPr>
+          <w:ilvl w:val="0"/>
+          <w:numId w:val="3"/>
+        </w:numPr>
+        <w:spacing w:after="240" w:before="0" w:beforeAutospacing="0" w:lineRule="auto"/>
+        <w:ind w:left="720" w:hanging="360"/>
+      </w:pPr>
+      <w:r>
+        <w:rPr>
+          <w:rtl w:val="0"/>
+        </w:rPr>
+        <w:t xml:space="preserve">coherencia con la planificación.</w:t>
+      </w:r>
+    </w:p>
+    <w:p>
+      <w:pPr>
+        <w:rPr/>
+      </w:pPr>
+      <w:r>
+        <w:pict>
+          <v:rect style="width:0.0pt;height:1.5pt" o:hr="t" o:hrstd="t" o:hralign="center" fillcolor="#A0A0A0" stroked="f"/>
+        </w:pict>
+      </w:r>
+      <w:r>
+        <w:rPr>
+          <w:rtl w:val="0"/>
+        </w:rPr>
+      </w:r>
+    </w:p>
+    <w:p>
+      <w:pPr>
+        <w:pStyle w:val="Heading3"/>
+        <w:keepNext w:val="0"/>
+        <w:keepLines w:val="0"/>
+        <w:spacing w:before="280" w:lineRule="auto"/>
+        <w:rPr>
+          <w:b w:val="1"/>
+          <w:bCs w:val="1"/>
+          <w:color w:val="000000"/>
+          <w:sz w:val="26"/>
+          <w:szCs w:val="26"/>
+        </w:rPr>
+      </w:pPr>
+      <w:bookmarkStart w:colFirst="0" w:colLast="0" w:name="_uw70ht5xddmz" w:id="16"/>
+      <w:bookmarkEnd w:id="16"/>
+      <w:r>
+        <w:rPr>
+          <w:b w:val="1"/>
+          <w:bCs w:val="1"/>
+          <w:color w:val="000000"/>
+          <w:sz w:val="26"/>
+          <w:szCs w:val="26"/>
+          <w:rtl w:val="0"/>
+        </w:rPr>
+        <w:t xml:space="preserve">Revisión Crítica</w:t>
+      </w:r>
+    </w:p>
+    <w:p>
+      <w:pPr>
+        <w:spacing w:after="240" w:before="240" w:lineRule="auto"/>
+        <w:rPr/>
+      </w:pPr>
+      <w:r>
+        <w:rPr>
+          <w:rtl w:val="0"/>
+        </w:rPr>
+        <w:t xml:space="preserve">Verificar:</w:t>
+      </w:r>
+    </w:p>
+    <w:p>
+      <w:pPr>
+        <w:numPr>
+          <w:ilvl w:val="0"/>
+          <w:numId w:val="6"/>
+        </w:numPr>
+        <w:spacing w:after="0" w:afterAutospacing="0" w:before="240" w:lineRule="auto"/>
+        <w:ind w:left="720" w:hanging="360"/>
+      </w:pPr>
+      <w:r>
+        <w:rPr>
+          <w:rtl w:val="0"/>
+        </w:rPr>
+        <w:t xml:space="preserve">contradicciones;</w:t>
+      </w:r>
+    </w:p>
+    <w:p>
+      <w:pPr>
+        <w:numPr>
+          <w:ilvl w:val="0"/>
+          <w:numId w:val="6"/>
+        </w:numPr>
+        <w:spacing w:after="0" w:afterAutospacing="0" w:before="0" w:beforeAutospacing="0" w:lineRule="auto"/>
+        <w:ind w:left="720" w:hanging="360"/>
+      </w:pPr>
+      <w:r>
+        <w:rPr>
+          <w:rtl w:val="0"/>
+        </w:rPr>
+        <w:t xml:space="preserve">ambigüedades;</w:t>
+      </w:r>
+    </w:p>
+    <w:p>
+      <w:pPr>
+        <w:numPr>
+          <w:ilvl w:val="0"/>
+          <w:numId w:val="6"/>
+        </w:numPr>
+        <w:spacing w:after="0" w:afterAutospacing="0" w:before="0" w:beforeAutospacing="0" w:lineRule="auto"/>
+        <w:ind w:left="720" w:hanging="360"/>
+      </w:pPr>
+      <w:r>
+        <w:rPr>
+          <w:rtl w:val="0"/>
+        </w:rPr>
+        <w:t xml:space="preserve">casos límite;</w:t>
+      </w:r>
+    </w:p>
+    <w:p>
+      <w:pPr>
+        <w:numPr>
+          <w:ilvl w:val="0"/>
+          <w:numId w:val="6"/>
+        </w:numPr>
+        <w:spacing w:after="0" w:afterAutospacing="0" w:before="0" w:beforeAutospacing="0" w:lineRule="auto"/>
+        <w:ind w:left="720" w:hanging="360"/>
+      </w:pPr>
+      <w:r>
+        <w:rPr>
+          <w:rtl w:val="0"/>
+        </w:rPr>
+        <w:t xml:space="preserve">riesgos técnicos;</w:t>
+      </w:r>
+    </w:p>
+    <w:p>
+      <w:pPr>
+        <w:numPr>
+          <w:ilvl w:val="0"/>
+          <w:numId w:val="6"/>
+        </w:numPr>
+        <w:spacing w:after="240" w:before="0" w:beforeAutospacing="0" w:lineRule="auto"/>
+        <w:ind w:left="720" w:hanging="360"/>
+      </w:pPr>
+      <w:r>
+        <w:rPr>
+          <w:rtl w:val="0"/>
+        </w:rPr>
+        <w:t xml:space="preserve">requisitos incompletos.</w:t>
+      </w:r>
+    </w:p>
+    <w:p>
+      <w:pPr>
+        <w:rPr/>
+      </w:pPr>
+      <w:r>
+        <w:pict>
+          <v:rect style="width:0.0pt;height:1.5pt" o:hr="t" o:hrstd="t" o:hralign="center" fillcolor="#A0A0A0" stroked="f"/>
+        </w:pict>
+      </w:r>
+      <w:r>
+        <w:rPr>
+          <w:rtl w:val="0"/>
+        </w:rPr>
+      </w:r>
+    </w:p>
+    <w:p>
+      <w:pPr>
+        <w:pStyle w:val="Heading3"/>
+        <w:keepNext w:val="0"/>
+        <w:keepLines w:val="0"/>
+        <w:spacing w:before="280" w:lineRule="auto"/>
+        <w:rPr>
+          <w:b w:val="1"/>
+          <w:bCs w:val="1"/>
+          <w:color w:val="000000"/>
+          <w:sz w:val="26"/>
+          <w:szCs w:val="26"/>
+        </w:rPr>
+      </w:pPr>
+      <w:bookmarkStart w:colFirst="0" w:colLast="0" w:name="_tjaznu16b8l4" w:id="17"/>
+      <w:bookmarkEnd w:id="17"/>
+      <w:r>
+        <w:rPr>
+          <w:b w:val="1"/>
+          <w:bCs w:val="1"/>
+          <w:color w:val="000000"/>
+          <w:sz w:val="26"/>
+          <w:szCs w:val="26"/>
+          <w:rtl w:val="0"/>
+        </w:rPr>
+        <w:t xml:space="preserve">Arquitectura de Evolución</w:t>
+      </w:r>
+    </w:p>
+    <w:p>
+      <w:pPr>
+        <w:spacing w:after="240" w:before="240" w:lineRule="auto"/>
+        <w:rPr/>
+      </w:pPr>
+      <w:r>
+        <w:rPr>
+          <w:rtl w:val="0"/>
+        </w:rPr>
+        <w:t xml:space="preserve">Verificar:</w:t>
+      </w:r>
+    </w:p>
+    <w:p>
+      <w:pPr>
+        <w:numPr>
+          <w:ilvl w:val="0"/>
+          <w:numId w:val="19"/>
+        </w:numPr>
+        <w:spacing w:after="0" w:afterAutospacing="0" w:before="240" w:lineRule="auto"/>
+        <w:ind w:left="720" w:hanging="360"/>
+      </w:pPr>
+      <w:r>
+        <w:rPr>
+          <w:rtl w:val="0"/>
+        </w:rPr>
+        <w:t xml:space="preserve">extensibilidad;</w:t>
+      </w:r>
+    </w:p>
+    <w:p>
+      <w:pPr>
+        <w:numPr>
+          <w:ilvl w:val="0"/>
+          <w:numId w:val="19"/>
+        </w:numPr>
+        <w:spacing w:after="0" w:afterAutospacing="0" w:before="0" w:beforeAutospacing="0" w:lineRule="auto"/>
+        <w:ind w:left="720" w:hanging="360"/>
+      </w:pPr>
+      <w:r>
+        <w:rPr>
+          <w:rtl w:val="0"/>
+        </w:rPr>
+        <w:t xml:space="preserve">compatibilidad futura;</w:t>
+      </w:r>
+    </w:p>
+    <w:p>
+      <w:pPr>
+        <w:numPr>
+          <w:ilvl w:val="0"/>
+          <w:numId w:val="19"/>
+        </w:numPr>
+        <w:spacing w:after="0" w:afterAutospacing="0" w:before="0" w:beforeAutospacing="0" w:lineRule="auto"/>
+        <w:ind w:left="720" w:hanging="360"/>
+      </w:pPr>
+      <w:r>
+        <w:rPr>
+          <w:rtl w:val="0"/>
+        </w:rPr>
+        <w:t xml:space="preserve">estabilidad contractual;</w:t>
+      </w:r>
+    </w:p>
+    <w:p>
+      <w:pPr>
+        <w:numPr>
+          <w:ilvl w:val="0"/>
+          <w:numId w:val="19"/>
+        </w:numPr>
+        <w:spacing w:after="240" w:before="0" w:beforeAutospacing="0" w:lineRule="auto"/>
+        <w:ind w:left="720" w:hanging="360"/>
+      </w:pPr>
+      <w:r>
+        <w:rPr>
+          <w:rtl w:val="0"/>
+        </w:rPr>
+        <w:t xml:space="preserve">impacto sobre futuras capacidades.</w:t>
+      </w:r>
+    </w:p>
+    <w:p>
+      <w:pPr>
+        <w:rPr/>
+      </w:pPr>
+      <w:r>
+        <w:rPr>
+          <w:rtl w:val="0"/>
+        </w:rPr>
       </w:r>
     </w:p>
     <w:p>
@@ -1576,8 +2372,8 @@
           <w:szCs w:val="46"/>
         </w:rPr>
       </w:pPr>
-      <w:bookmarkStart w:colFirst="0" w:colLast="0" w:name="_5xm3arev5ity" w:id="12"/>
-      <w:bookmarkEnd w:id="12"/>
+      <w:bookmarkStart w:colFirst="0" w:colLast="0" w:name="_5xm3arev5ity" w:id="18"/>
+      <w:bookmarkEnd w:id="18"/>
       <w:r>
         <w:rPr>
           <w:b w:val="1"/>
@@ -1748,6 +2544,30 @@
           <w:rtl w:val="0"/>
         </w:rPr>
         <w:t xml:space="preserve">Pruebas automáticas</w:t>
+      </w:r>
+    </w:p>
+    <w:p>
+      <w:pPr>
+        <w:ind w:left="0" w:firstLine="0"/>
+        <w:rPr/>
+      </w:pPr>
+      <w:r>
+        <w:rPr>
+          <w:rFonts w:ascii="Arial Unicode MS" w:cs="Arial Unicode MS" w:eastAsia="Arial Unicode MS" w:hAnsi="Arial Unicode MS"/>
+          <w:rtl w:val="0"/>
+        </w:rPr>
+        <w:t xml:space="preserve">       ↓</w:t>
+      </w:r>
+    </w:p>
+    <w:p>
+      <w:pPr>
+        <w:rPr/>
+      </w:pPr>
+      <w:r>
+        <w:rPr>
+          <w:rtl w:val="0"/>
+        </w:rPr>
+        <w:t xml:space="preserve">Auditoría de cobertura </w:t>
       </w:r>
     </w:p>
     <w:p>
@@ -1859,8 +2679,8 @@
           <w:szCs w:val="46"/>
         </w:rPr>
       </w:pPr>
-      <w:bookmarkStart w:colFirst="0" w:colLast="0" w:name="_ygyv45nzyql7" w:id="13"/>
-      <w:bookmarkEnd w:id="13"/>
+      <w:bookmarkStart w:colFirst="0" w:colLast="0" w:name="_ygyv45nzyql7" w:id="19"/>
+      <w:bookmarkEnd w:id="19"/>
       <w:r>
         <w:rPr>
           <w:b w:val="1"/>
@@ -1888,7 +2708,7 @@
       <w:pPr>
         <w:numPr>
           <w:ilvl w:val="0"/>
-          <w:numId w:val="5"/>
+          <w:numId w:val="8"/>
         </w:numPr>
         <w:spacing w:after="0" w:afterAutospacing="0" w:before="240" w:lineRule="auto"/>
         <w:ind w:left="720" w:hanging="360"/>
@@ -1904,7 +2724,7 @@
       <w:pPr>
         <w:numPr>
           <w:ilvl w:val="0"/>
-          <w:numId w:val="5"/>
+          <w:numId w:val="8"/>
         </w:numPr>
         <w:spacing w:after="0" w:afterAutospacing="0" w:before="0" w:beforeAutospacing="0" w:lineRule="auto"/>
         <w:ind w:left="720" w:hanging="360"/>
@@ -1920,7 +2740,7 @@
       <w:pPr>
         <w:numPr>
           <w:ilvl w:val="0"/>
-          <w:numId w:val="5"/>
+          <w:numId w:val="8"/>
         </w:numPr>
         <w:spacing w:after="0" w:afterAutospacing="0" w:before="0" w:beforeAutospacing="0" w:lineRule="auto"/>
         <w:ind w:left="720" w:hanging="360"/>
@@ -1936,7 +2756,7 @@
       <w:pPr>
         <w:numPr>
           <w:ilvl w:val="0"/>
-          <w:numId w:val="5"/>
+          <w:numId w:val="8"/>
         </w:numPr>
         <w:spacing w:after="0" w:afterAutospacing="0" w:before="0" w:beforeAutospacing="0" w:lineRule="auto"/>
         <w:ind w:left="720" w:hanging="360"/>
@@ -1952,7 +2772,7 @@
       <w:pPr>
         <w:numPr>
           <w:ilvl w:val="0"/>
-          <w:numId w:val="5"/>
+          <w:numId w:val="8"/>
         </w:numPr>
         <w:spacing w:after="0" w:afterAutospacing="0" w:before="0" w:beforeAutospacing="0" w:lineRule="auto"/>
         <w:ind w:left="720" w:hanging="360"/>
@@ -1968,7 +2788,7 @@
       <w:pPr>
         <w:numPr>
           <w:ilvl w:val="0"/>
-          <w:numId w:val="5"/>
+          <w:numId w:val="8"/>
         </w:numPr>
         <w:spacing w:after="240" w:before="0" w:beforeAutospacing="0" w:lineRule="auto"/>
         <w:ind w:left="720" w:hanging="360"/>
@@ -2020,8 +2840,8 @@
           <w:szCs w:val="46"/>
         </w:rPr>
       </w:pPr>
-      <w:bookmarkStart w:colFirst="0" w:colLast="0" w:name="_hgin08l9ibcs" w:id="14"/>
-      <w:bookmarkEnd w:id="14"/>
+      <w:bookmarkStart w:colFirst="0" w:colLast="0" w:name="_hgin08l9ibcs" w:id="20"/>
+      <w:bookmarkEnd w:id="20"/>
       <w:r>
         <w:rPr>
           <w:b w:val="1"/>
@@ -2063,7 +2883,7 @@
       <w:pPr>
         <w:numPr>
           <w:ilvl w:val="0"/>
-          <w:numId w:val="3"/>
+          <w:numId w:val="5"/>
         </w:numPr>
         <w:spacing w:after="0" w:afterAutospacing="0" w:before="240" w:lineRule="auto"/>
         <w:ind w:left="720" w:hanging="360"/>
@@ -2079,7 +2899,7 @@
       <w:pPr>
         <w:numPr>
           <w:ilvl w:val="0"/>
-          <w:numId w:val="3"/>
+          <w:numId w:val="5"/>
         </w:numPr>
         <w:spacing w:after="0" w:afterAutospacing="0" w:before="0" w:beforeAutospacing="0" w:lineRule="auto"/>
         <w:ind w:left="720" w:hanging="360"/>
@@ -2095,7 +2915,7 @@
       <w:pPr>
         <w:numPr>
           <w:ilvl w:val="0"/>
-          <w:numId w:val="3"/>
+          <w:numId w:val="5"/>
         </w:numPr>
         <w:spacing w:after="0" w:afterAutospacing="0" w:before="0" w:beforeAutospacing="0" w:lineRule="auto"/>
         <w:ind w:left="720" w:hanging="360"/>
@@ -2111,7 +2931,7 @@
       <w:pPr>
         <w:numPr>
           <w:ilvl w:val="0"/>
-          <w:numId w:val="3"/>
+          <w:numId w:val="5"/>
         </w:numPr>
         <w:spacing w:after="0" w:afterAutospacing="0" w:before="0" w:beforeAutospacing="0" w:lineRule="auto"/>
         <w:ind w:left="720" w:hanging="360"/>
@@ -2127,7 +2947,7 @@
       <w:pPr>
         <w:numPr>
           <w:ilvl w:val="0"/>
-          <w:numId w:val="3"/>
+          <w:numId w:val="5"/>
         </w:numPr>
         <w:spacing w:after="240" w:before="0" w:beforeAutospacing="0" w:lineRule="auto"/>
         <w:ind w:left="720" w:hanging="360"/>
@@ -2179,8 +2999,8 @@
           <w:szCs w:val="46"/>
         </w:rPr>
       </w:pPr>
-      <w:bookmarkStart w:colFirst="0" w:colLast="0" w:name="_kadl4seaitr6" w:id="15"/>
-      <w:bookmarkEnd w:id="15"/>
+      <w:bookmarkStart w:colFirst="0" w:colLast="0" w:name="_kadl4seaitr6" w:id="21"/>
+      <w:bookmarkEnd w:id="21"/>
       <w:r>
         <w:rPr>
           <w:b w:val="1"/>
@@ -2220,7 +3040,7 @@
       <w:pPr>
         <w:numPr>
           <w:ilvl w:val="0"/>
-          <w:numId w:val="11"/>
+          <w:numId w:val="16"/>
         </w:numPr>
         <w:spacing w:after="0" w:afterAutospacing="0" w:before="240" w:lineRule="auto"/>
         <w:ind w:left="720" w:hanging="360"/>
@@ -2236,7 +3056,7 @@
       <w:pPr>
         <w:numPr>
           <w:ilvl w:val="0"/>
-          <w:numId w:val="11"/>
+          <w:numId w:val="16"/>
         </w:numPr>
         <w:spacing w:after="0" w:afterAutospacing="0" w:before="0" w:beforeAutospacing="0" w:lineRule="auto"/>
         <w:ind w:left="720" w:hanging="360"/>
@@ -2252,7 +3072,7 @@
       <w:pPr>
         <w:numPr>
           <w:ilvl w:val="0"/>
-          <w:numId w:val="11"/>
+          <w:numId w:val="16"/>
         </w:numPr>
         <w:spacing w:after="0" w:afterAutospacing="0" w:before="0" w:beforeAutospacing="0" w:lineRule="auto"/>
         <w:ind w:left="720" w:hanging="360"/>
@@ -2268,7 +3088,7 @@
       <w:pPr>
         <w:numPr>
           <w:ilvl w:val="0"/>
-          <w:numId w:val="11"/>
+          <w:numId w:val="16"/>
         </w:numPr>
         <w:spacing w:after="240" w:before="0" w:beforeAutospacing="0" w:lineRule="auto"/>
         <w:ind w:left="720" w:hanging="360"/>
@@ -2320,8 +3140,8 @@
           <w:szCs w:val="46"/>
         </w:rPr>
       </w:pPr>
-      <w:bookmarkStart w:colFirst="0" w:colLast="0" w:name="_34l9e34puccl" w:id="16"/>
-      <w:bookmarkEnd w:id="16"/>
+      <w:bookmarkStart w:colFirst="0" w:colLast="0" w:name="_34l9e34puccl" w:id="22"/>
+      <w:bookmarkEnd w:id="22"/>
       <w:r>
         <w:rPr>
           <w:b w:val="1"/>
@@ -2349,7 +3169,7 @@
       <w:pPr>
         <w:numPr>
           <w:ilvl w:val="0"/>
-          <w:numId w:val="10"/>
+          <w:numId w:val="15"/>
         </w:numPr>
         <w:spacing w:after="0" w:afterAutospacing="0" w:before="240" w:lineRule="auto"/>
         <w:ind w:left="720" w:hanging="360"/>
@@ -2365,7 +3185,7 @@
       <w:pPr>
         <w:numPr>
           <w:ilvl w:val="0"/>
-          <w:numId w:val="10"/>
+          <w:numId w:val="15"/>
         </w:numPr>
         <w:spacing w:after="0" w:afterAutospacing="0" w:before="0" w:beforeAutospacing="0" w:lineRule="auto"/>
         <w:ind w:left="720" w:hanging="360"/>
@@ -2381,7 +3201,7 @@
       <w:pPr>
         <w:numPr>
           <w:ilvl w:val="0"/>
-          <w:numId w:val="10"/>
+          <w:numId w:val="15"/>
         </w:numPr>
         <w:spacing w:after="0" w:afterAutospacing="0" w:before="0" w:beforeAutospacing="0" w:lineRule="auto"/>
         <w:ind w:left="720" w:hanging="360"/>
@@ -2397,7 +3217,7 @@
       <w:pPr>
         <w:numPr>
           <w:ilvl w:val="0"/>
-          <w:numId w:val="10"/>
+          <w:numId w:val="15"/>
         </w:numPr>
         <w:spacing w:after="0" w:afterAutospacing="0" w:before="0" w:beforeAutospacing="0" w:lineRule="auto"/>
         <w:ind w:left="720" w:hanging="360"/>
@@ -2413,7 +3233,7 @@
       <w:pPr>
         <w:numPr>
           <w:ilvl w:val="0"/>
-          <w:numId w:val="10"/>
+          <w:numId w:val="15"/>
         </w:numPr>
         <w:spacing w:after="240" w:before="0" w:beforeAutospacing="0" w:lineRule="auto"/>
         <w:ind w:left="720" w:hanging="360"/>
@@ -2453,8 +3273,8 @@
           <w:szCs w:val="46"/>
         </w:rPr>
       </w:pPr>
-      <w:bookmarkStart w:colFirst="0" w:colLast="0" w:name="_jlkomerib4ly" w:id="17"/>
-      <w:bookmarkEnd w:id="17"/>
+      <w:bookmarkStart w:colFirst="0" w:colLast="0" w:name="_jlkomerib4ly" w:id="23"/>
+      <w:bookmarkEnd w:id="23"/>
       <w:r>
         <w:rPr>
           <w:b w:val="1"/>
@@ -2571,8 +3391,8 @@
           <w:szCs w:val="46"/>
         </w:rPr>
       </w:pPr>
-      <w:bookmarkStart w:colFirst="0" w:colLast="0" w:name="_6lfbcjgkeeok" w:id="18"/>
-      <w:bookmarkEnd w:id="18"/>
+      <w:bookmarkStart w:colFirst="0" w:colLast="0" w:name="_6lfbcjgkeeok" w:id="24"/>
+      <w:bookmarkEnd w:id="24"/>
       <w:r>
         <w:rPr>
           <w:b w:val="1"/>
@@ -2648,8 +3468,8 @@
           <w:szCs w:val="46"/>
         </w:rPr>
       </w:pPr>
-      <w:bookmarkStart w:colFirst="0" w:colLast="0" w:name="_bt0u3esnco0d" w:id="19"/>
-      <w:bookmarkEnd w:id="19"/>
+      <w:bookmarkStart w:colFirst="0" w:colLast="0" w:name="_bt0u3esnco0d" w:id="25"/>
+      <w:bookmarkEnd w:id="25"/>
       <w:r>
         <w:rPr>
           <w:b w:val="1"/>
@@ -4041,6 +4861,666 @@
     </w:lvl>
   </w:abstractNum>
   <w:abstractNum w:abstractNumId="13">
+    <w:lvl w:ilvl="0">
+      <w:start w:val="1"/>
+      <w:numFmt w:val="bullet"/>
+      <w:lvlText w:val="●"/>
+      <w:lvlJc w:val="left"/>
+      <w:pPr>
+        <w:ind w:left="720" w:hanging="360"/>
+      </w:pPr>
+      <w:rPr>
+        <w:u w:val="none"/>
+      </w:rPr>
+    </w:lvl>
+    <w:lvl w:ilvl="1">
+      <w:start w:val="1"/>
+      <w:numFmt w:val="bullet"/>
+      <w:lvlText w:val="○"/>
+      <w:lvlJc w:val="left"/>
+      <w:pPr>
+        <w:ind w:left="1440" w:hanging="360"/>
+      </w:pPr>
+      <w:rPr>
+        <w:u w:val="none"/>
+      </w:rPr>
+    </w:lvl>
+    <w:lvl w:ilvl="2">
+      <w:start w:val="1"/>
+      <w:numFmt w:val="bullet"/>
+      <w:lvlText w:val="■"/>
+      <w:lvlJc w:val="left"/>
+      <w:pPr>
+        <w:ind w:left="2160" w:hanging="360"/>
+      </w:pPr>
+      <w:rPr>
+        <w:u w:val="none"/>
+      </w:rPr>
+    </w:lvl>
+    <w:lvl w:ilvl="3">
+      <w:start w:val="1"/>
+      <w:numFmt w:val="bullet"/>
+      <w:lvlText w:val="●"/>
+      <w:lvlJc w:val="left"/>
+      <w:pPr>
+        <w:ind w:left="2880" w:hanging="360"/>
+      </w:pPr>
+      <w:rPr>
+        <w:u w:val="none"/>
+      </w:rPr>
+    </w:lvl>
+    <w:lvl w:ilvl="4">
+      <w:start w:val="1"/>
+      <w:numFmt w:val="bullet"/>
+      <w:lvlText w:val="○"/>
+      <w:lvlJc w:val="left"/>
+      <w:pPr>
+        <w:ind w:left="3600" w:hanging="360"/>
+      </w:pPr>
+      <w:rPr>
+        <w:u w:val="none"/>
+      </w:rPr>
+    </w:lvl>
+    <w:lvl w:ilvl="5">
+      <w:start w:val="1"/>
+      <w:numFmt w:val="bullet"/>
+      <w:lvlText w:val="■"/>
+      <w:lvlJc w:val="left"/>
+      <w:pPr>
+        <w:ind w:left="4320" w:hanging="360"/>
+      </w:pPr>
+      <w:rPr>
+        <w:u w:val="none"/>
+      </w:rPr>
+    </w:lvl>
+    <w:lvl w:ilvl="6">
+      <w:start w:val="1"/>
+      <w:numFmt w:val="bullet"/>
+      <w:lvlText w:val="●"/>
+      <w:lvlJc w:val="left"/>
+      <w:pPr>
+        <w:ind w:left="5040" w:hanging="360"/>
+      </w:pPr>
+      <w:rPr>
+        <w:u w:val="none"/>
+      </w:rPr>
+    </w:lvl>
+    <w:lvl w:ilvl="7">
+      <w:start w:val="1"/>
+      <w:numFmt w:val="bullet"/>
+      <w:lvlText w:val="○"/>
+      <w:lvlJc w:val="left"/>
+      <w:pPr>
+        <w:ind w:left="5760" w:hanging="360"/>
+      </w:pPr>
+      <w:rPr>
+        <w:u w:val="none"/>
+      </w:rPr>
+    </w:lvl>
+    <w:lvl w:ilvl="8">
+      <w:start w:val="1"/>
+      <w:numFmt w:val="bullet"/>
+      <w:lvlText w:val="■"/>
+      <w:lvlJc w:val="left"/>
+      <w:pPr>
+        <w:ind w:left="6480" w:hanging="360"/>
+      </w:pPr>
+      <w:rPr>
+        <w:u w:val="none"/>
+      </w:rPr>
+    </w:lvl>
+  </w:abstractNum>
+  <w:abstractNum w:abstractNumId="14">
+    <w:lvl w:ilvl="0">
+      <w:start w:val="1"/>
+      <w:numFmt w:val="bullet"/>
+      <w:lvlText w:val="●"/>
+      <w:lvlJc w:val="left"/>
+      <w:pPr>
+        <w:ind w:left="720" w:hanging="360"/>
+      </w:pPr>
+      <w:rPr>
+        <w:u w:val="none"/>
+      </w:rPr>
+    </w:lvl>
+    <w:lvl w:ilvl="1">
+      <w:start w:val="1"/>
+      <w:numFmt w:val="bullet"/>
+      <w:lvlText w:val="○"/>
+      <w:lvlJc w:val="left"/>
+      <w:pPr>
+        <w:ind w:left="1440" w:hanging="360"/>
+      </w:pPr>
+      <w:rPr>
+        <w:u w:val="none"/>
+      </w:rPr>
+    </w:lvl>
+    <w:lvl w:ilvl="2">
+      <w:start w:val="1"/>
+      <w:numFmt w:val="bullet"/>
+      <w:lvlText w:val="■"/>
+      <w:lvlJc w:val="left"/>
+      <w:pPr>
+        <w:ind w:left="2160" w:hanging="360"/>
+      </w:pPr>
+      <w:rPr>
+        <w:u w:val="none"/>
+      </w:rPr>
+    </w:lvl>
+    <w:lvl w:ilvl="3">
+      <w:start w:val="1"/>
+      <w:numFmt w:val="bullet"/>
+      <w:lvlText w:val="●"/>
+      <w:lvlJc w:val="left"/>
+      <w:pPr>
+        <w:ind w:left="2880" w:hanging="360"/>
+      </w:pPr>
+      <w:rPr>
+        <w:u w:val="none"/>
+      </w:rPr>
+    </w:lvl>
+    <w:lvl w:ilvl="4">
+      <w:start w:val="1"/>
+      <w:numFmt w:val="bullet"/>
+      <w:lvlText w:val="○"/>
+      <w:lvlJc w:val="left"/>
+      <w:pPr>
+        <w:ind w:left="3600" w:hanging="360"/>
+      </w:pPr>
+      <w:rPr>
+        <w:u w:val="none"/>
+      </w:rPr>
+    </w:lvl>
+    <w:lvl w:ilvl="5">
+      <w:start w:val="1"/>
+      <w:numFmt w:val="bullet"/>
+      <w:lvlText w:val="■"/>
+      <w:lvlJc w:val="left"/>
+      <w:pPr>
+        <w:ind w:left="4320" w:hanging="360"/>
+      </w:pPr>
+      <w:rPr>
+        <w:u w:val="none"/>
+      </w:rPr>
+    </w:lvl>
+    <w:lvl w:ilvl="6">
+      <w:start w:val="1"/>
+      <w:numFmt w:val="bullet"/>
+      <w:lvlText w:val="●"/>
+      <w:lvlJc w:val="left"/>
+      <w:pPr>
+        <w:ind w:left="5040" w:hanging="360"/>
+      </w:pPr>
+      <w:rPr>
+        <w:u w:val="none"/>
+      </w:rPr>
+    </w:lvl>
+    <w:lvl w:ilvl="7">
+      <w:start w:val="1"/>
+      <w:numFmt w:val="bullet"/>
+      <w:lvlText w:val="○"/>
+      <w:lvlJc w:val="left"/>
+      <w:pPr>
+        <w:ind w:left="5760" w:hanging="360"/>
+      </w:pPr>
+      <w:rPr>
+        <w:u w:val="none"/>
+      </w:rPr>
+    </w:lvl>
+    <w:lvl w:ilvl="8">
+      <w:start w:val="1"/>
+      <w:numFmt w:val="bullet"/>
+      <w:lvlText w:val="■"/>
+      <w:lvlJc w:val="left"/>
+      <w:pPr>
+        <w:ind w:left="6480" w:hanging="360"/>
+      </w:pPr>
+      <w:rPr>
+        <w:u w:val="none"/>
+      </w:rPr>
+    </w:lvl>
+  </w:abstractNum>
+  <w:abstractNum w:abstractNumId="15">
+    <w:lvl w:ilvl="0">
+      <w:start w:val="1"/>
+      <w:numFmt w:val="bullet"/>
+      <w:lvlText w:val="●"/>
+      <w:lvlJc w:val="left"/>
+      <w:pPr>
+        <w:ind w:left="720" w:hanging="360"/>
+      </w:pPr>
+      <w:rPr>
+        <w:u w:val="none"/>
+      </w:rPr>
+    </w:lvl>
+    <w:lvl w:ilvl="1">
+      <w:start w:val="1"/>
+      <w:numFmt w:val="bullet"/>
+      <w:lvlText w:val="○"/>
+      <w:lvlJc w:val="left"/>
+      <w:pPr>
+        <w:ind w:left="1440" w:hanging="360"/>
+      </w:pPr>
+      <w:rPr>
+        <w:u w:val="none"/>
+      </w:rPr>
+    </w:lvl>
+    <w:lvl w:ilvl="2">
+      <w:start w:val="1"/>
+      <w:numFmt w:val="bullet"/>
+      <w:lvlText w:val="■"/>
+      <w:lvlJc w:val="left"/>
+      <w:pPr>
+        <w:ind w:left="2160" w:hanging="360"/>
+      </w:pPr>
+      <w:rPr>
+        <w:u w:val="none"/>
+      </w:rPr>
+    </w:lvl>
+    <w:lvl w:ilvl="3">
+      <w:start w:val="1"/>
+      <w:numFmt w:val="bullet"/>
+      <w:lvlText w:val="●"/>
+      <w:lvlJc w:val="left"/>
+      <w:pPr>
+        <w:ind w:left="2880" w:hanging="360"/>
+      </w:pPr>
+      <w:rPr>
+        <w:u w:val="none"/>
+      </w:rPr>
+    </w:lvl>
+    <w:lvl w:ilvl="4">
+      <w:start w:val="1"/>
+      <w:numFmt w:val="bullet"/>
+      <w:lvlText w:val="○"/>
+      <w:lvlJc w:val="left"/>
+      <w:pPr>
+        <w:ind w:left="3600" w:hanging="360"/>
+      </w:pPr>
+      <w:rPr>
+        <w:u w:val="none"/>
+      </w:rPr>
+    </w:lvl>
+    <w:lvl w:ilvl="5">
+      <w:start w:val="1"/>
+      <w:numFmt w:val="bullet"/>
+      <w:lvlText w:val="■"/>
+      <w:lvlJc w:val="left"/>
+      <w:pPr>
+        <w:ind w:left="4320" w:hanging="360"/>
+      </w:pPr>
+      <w:rPr>
+        <w:u w:val="none"/>
+      </w:rPr>
+    </w:lvl>
+    <w:lvl w:ilvl="6">
+      <w:start w:val="1"/>
+      <w:numFmt w:val="bullet"/>
+      <w:lvlText w:val="●"/>
+      <w:lvlJc w:val="left"/>
+      <w:pPr>
+        <w:ind w:left="5040" w:hanging="360"/>
+      </w:pPr>
+      <w:rPr>
+        <w:u w:val="none"/>
+      </w:rPr>
+    </w:lvl>
+    <w:lvl w:ilvl="7">
+      <w:start w:val="1"/>
+      <w:numFmt w:val="bullet"/>
+      <w:lvlText w:val="○"/>
+      <w:lvlJc w:val="left"/>
+      <w:pPr>
+        <w:ind w:left="5760" w:hanging="360"/>
+      </w:pPr>
+      <w:rPr>
+        <w:u w:val="none"/>
+      </w:rPr>
+    </w:lvl>
+    <w:lvl w:ilvl="8">
+      <w:start w:val="1"/>
+      <w:numFmt w:val="bullet"/>
+      <w:lvlText w:val="■"/>
+      <w:lvlJc w:val="left"/>
+      <w:pPr>
+        <w:ind w:left="6480" w:hanging="360"/>
+      </w:pPr>
+      <w:rPr>
+        <w:u w:val="none"/>
+      </w:rPr>
+    </w:lvl>
+  </w:abstractNum>
+  <w:abstractNum w:abstractNumId="16">
+    <w:lvl w:ilvl="0">
+      <w:start w:val="1"/>
+      <w:numFmt w:val="bullet"/>
+      <w:lvlText w:val="●"/>
+      <w:lvlJc w:val="left"/>
+      <w:pPr>
+        <w:ind w:left="720" w:hanging="360"/>
+      </w:pPr>
+      <w:rPr>
+        <w:u w:val="none"/>
+      </w:rPr>
+    </w:lvl>
+    <w:lvl w:ilvl="1">
+      <w:start w:val="1"/>
+      <w:numFmt w:val="bullet"/>
+      <w:lvlText w:val="○"/>
+      <w:lvlJc w:val="left"/>
+      <w:pPr>
+        <w:ind w:left="1440" w:hanging="360"/>
+      </w:pPr>
+      <w:rPr>
+        <w:u w:val="none"/>
+      </w:rPr>
+    </w:lvl>
+    <w:lvl w:ilvl="2">
+      <w:start w:val="1"/>
+      <w:numFmt w:val="bullet"/>
+      <w:lvlText w:val="■"/>
+      <w:lvlJc w:val="left"/>
+      <w:pPr>
+        <w:ind w:left="2160" w:hanging="360"/>
+      </w:pPr>
+      <w:rPr>
+        <w:u w:val="none"/>
+      </w:rPr>
+    </w:lvl>
+    <w:lvl w:ilvl="3">
+      <w:start w:val="1"/>
+      <w:numFmt w:val="bullet"/>
+      <w:lvlText w:val="●"/>
+      <w:lvlJc w:val="left"/>
+      <w:pPr>
+        <w:ind w:left="2880" w:hanging="360"/>
+      </w:pPr>
+      <w:rPr>
+        <w:u w:val="none"/>
+      </w:rPr>
+    </w:lvl>
+    <w:lvl w:ilvl="4">
+      <w:start w:val="1"/>
+      <w:numFmt w:val="bullet"/>
+      <w:lvlText w:val="○"/>
+      <w:lvlJc w:val="left"/>
+      <w:pPr>
+        <w:ind w:left="3600" w:hanging="360"/>
+      </w:pPr>
+      <w:rPr>
+        <w:u w:val="none"/>
+      </w:rPr>
+    </w:lvl>
+    <w:lvl w:ilvl="5">
+      <w:start w:val="1"/>
+      <w:numFmt w:val="bullet"/>
+      <w:lvlText w:val="■"/>
+      <w:lvlJc w:val="left"/>
+      <w:pPr>
+        <w:ind w:left="4320" w:hanging="360"/>
+      </w:pPr>
+      <w:rPr>
+        <w:u w:val="none"/>
+      </w:rPr>
+    </w:lvl>
+    <w:lvl w:ilvl="6">
+      <w:start w:val="1"/>
+      <w:numFmt w:val="bullet"/>
+      <w:lvlText w:val="●"/>
+      <w:lvlJc w:val="left"/>
+      <w:pPr>
+        <w:ind w:left="5040" w:hanging="360"/>
+      </w:pPr>
+      <w:rPr>
+        <w:u w:val="none"/>
+      </w:rPr>
+    </w:lvl>
+    <w:lvl w:ilvl="7">
+      <w:start w:val="1"/>
+      <w:numFmt w:val="bullet"/>
+      <w:lvlText w:val="○"/>
+      <w:lvlJc w:val="left"/>
+      <w:pPr>
+        <w:ind w:left="5760" w:hanging="360"/>
+      </w:pPr>
+      <w:rPr>
+        <w:u w:val="none"/>
+      </w:rPr>
+    </w:lvl>
+    <w:lvl w:ilvl="8">
+      <w:start w:val="1"/>
+      <w:numFmt w:val="bullet"/>
+      <w:lvlText w:val="■"/>
+      <w:lvlJc w:val="left"/>
+      <w:pPr>
+        <w:ind w:left="6480" w:hanging="360"/>
+      </w:pPr>
+      <w:rPr>
+        <w:u w:val="none"/>
+      </w:rPr>
+    </w:lvl>
+  </w:abstractNum>
+  <w:abstractNum w:abstractNumId="17">
+    <w:lvl w:ilvl="0">
+      <w:start w:val="1"/>
+      <w:numFmt w:val="bullet"/>
+      <w:lvlText w:val="●"/>
+      <w:lvlJc w:val="left"/>
+      <w:pPr>
+        <w:ind w:left="720" w:hanging="360"/>
+      </w:pPr>
+      <w:rPr>
+        <w:u w:val="none"/>
+      </w:rPr>
+    </w:lvl>
+    <w:lvl w:ilvl="1">
+      <w:start w:val="1"/>
+      <w:numFmt w:val="bullet"/>
+      <w:lvlText w:val="○"/>
+      <w:lvlJc w:val="left"/>
+      <w:pPr>
+        <w:ind w:left="1440" w:hanging="360"/>
+      </w:pPr>
+      <w:rPr>
+        <w:u w:val="none"/>
+      </w:rPr>
+    </w:lvl>
+    <w:lvl w:ilvl="2">
+      <w:start w:val="1"/>
+      <w:numFmt w:val="bullet"/>
+      <w:lvlText w:val="■"/>
+      <w:lvlJc w:val="left"/>
+      <w:pPr>
+        <w:ind w:left="2160" w:hanging="360"/>
+      </w:pPr>
+      <w:rPr>
+        <w:u w:val="none"/>
+      </w:rPr>
+    </w:lvl>
+    <w:lvl w:ilvl="3">
+      <w:start w:val="1"/>
+      <w:numFmt w:val="bullet"/>
+      <w:lvlText w:val="●"/>
+      <w:lvlJc w:val="left"/>
+      <w:pPr>
+        <w:ind w:left="2880" w:hanging="360"/>
+      </w:pPr>
+      <w:rPr>
+        <w:u w:val="none"/>
+      </w:rPr>
+    </w:lvl>
+    <w:lvl w:ilvl="4">
+      <w:start w:val="1"/>
+      <w:numFmt w:val="bullet"/>
+      <w:lvlText w:val="○"/>
+      <w:lvlJc w:val="left"/>
+      <w:pPr>
+        <w:ind w:left="3600" w:hanging="360"/>
+      </w:pPr>
+      <w:rPr>
+        <w:u w:val="none"/>
+      </w:rPr>
+    </w:lvl>
+    <w:lvl w:ilvl="5">
+      <w:start w:val="1"/>
+      <w:numFmt w:val="bullet"/>
+      <w:lvlText w:val="■"/>
+      <w:lvlJc w:val="left"/>
+      <w:pPr>
+        <w:ind w:left="4320" w:hanging="360"/>
+      </w:pPr>
+      <w:rPr>
+        <w:u w:val="none"/>
+      </w:rPr>
+    </w:lvl>
+    <w:lvl w:ilvl="6">
+      <w:start w:val="1"/>
+      <w:numFmt w:val="bullet"/>
+      <w:lvlText w:val="●"/>
+      <w:lvlJc w:val="left"/>
+      <w:pPr>
+        <w:ind w:left="5040" w:hanging="360"/>
+      </w:pPr>
+      <w:rPr>
+        <w:u w:val="none"/>
+      </w:rPr>
+    </w:lvl>
+    <w:lvl w:ilvl="7">
+      <w:start w:val="1"/>
+      <w:numFmt w:val="bullet"/>
+      <w:lvlText w:val="○"/>
+      <w:lvlJc w:val="left"/>
+      <w:pPr>
+        <w:ind w:left="5760" w:hanging="360"/>
+      </w:pPr>
+      <w:rPr>
+        <w:u w:val="none"/>
+      </w:rPr>
+    </w:lvl>
+    <w:lvl w:ilvl="8">
+      <w:start w:val="1"/>
+      <w:numFmt w:val="bullet"/>
+      <w:lvlText w:val="■"/>
+      <w:lvlJc w:val="left"/>
+      <w:pPr>
+        <w:ind w:left="6480" w:hanging="360"/>
+      </w:pPr>
+      <w:rPr>
+        <w:u w:val="none"/>
+      </w:rPr>
+    </w:lvl>
+  </w:abstractNum>
+  <w:abstractNum w:abstractNumId="18">
+    <w:lvl w:ilvl="0">
+      <w:start w:val="1"/>
+      <w:numFmt w:val="bullet"/>
+      <w:lvlText w:val="●"/>
+      <w:lvlJc w:val="left"/>
+      <w:pPr>
+        <w:ind w:left="720" w:hanging="360"/>
+      </w:pPr>
+      <w:rPr>
+        <w:u w:val="none"/>
+      </w:rPr>
+    </w:lvl>
+    <w:lvl w:ilvl="1">
+      <w:start w:val="1"/>
+      <w:numFmt w:val="bullet"/>
+      <w:lvlText w:val="○"/>
+      <w:lvlJc w:val="left"/>
+      <w:pPr>
+        <w:ind w:left="1440" w:hanging="360"/>
+      </w:pPr>
+      <w:rPr>
+        <w:u w:val="none"/>
+      </w:rPr>
+    </w:lvl>
+    <w:lvl w:ilvl="2">
+      <w:start w:val="1"/>
+      <w:numFmt w:val="bullet"/>
+      <w:lvlText w:val="■"/>
+      <w:lvlJc w:val="left"/>
+      <w:pPr>
+        <w:ind w:left="2160" w:hanging="360"/>
+      </w:pPr>
+      <w:rPr>
+        <w:u w:val="none"/>
+      </w:rPr>
+    </w:lvl>
+    <w:lvl w:ilvl="3">
+      <w:start w:val="1"/>
+      <w:numFmt w:val="bullet"/>
+      <w:lvlText w:val="●"/>
+      <w:lvlJc w:val="left"/>
+      <w:pPr>
+        <w:ind w:left="2880" w:hanging="360"/>
+      </w:pPr>
+      <w:rPr>
+        <w:u w:val="none"/>
+      </w:rPr>
+    </w:lvl>
+    <w:lvl w:ilvl="4">
+      <w:start w:val="1"/>
+      <w:numFmt w:val="bullet"/>
+      <w:lvlText w:val="○"/>
+      <w:lvlJc w:val="left"/>
+      <w:pPr>
+        <w:ind w:left="3600" w:hanging="360"/>
+      </w:pPr>
+      <w:rPr>
+        <w:u w:val="none"/>
+      </w:rPr>
+    </w:lvl>
+    <w:lvl w:ilvl="5">
+      <w:start w:val="1"/>
+      <w:numFmt w:val="bullet"/>
+      <w:lvlText w:val="■"/>
+      <w:lvlJc w:val="left"/>
+      <w:pPr>
+        <w:ind w:left="4320" w:hanging="360"/>
+      </w:pPr>
+      <w:rPr>
+        <w:u w:val="none"/>
+      </w:rPr>
+    </w:lvl>
+    <w:lvl w:ilvl="6">
+      <w:start w:val="1"/>
+      <w:numFmt w:val="bullet"/>
+      <w:lvlText w:val="●"/>
+      <w:lvlJc w:val="left"/>
+      <w:pPr>
+        <w:ind w:left="5040" w:hanging="360"/>
+      </w:pPr>
+      <w:rPr>
+        <w:u w:val="none"/>
+      </w:rPr>
+    </w:lvl>
+    <w:lvl w:ilvl="7">
+      <w:start w:val="1"/>
+      <w:numFmt w:val="bullet"/>
+      <w:lvlText w:val="○"/>
+      <w:lvlJc w:val="left"/>
+      <w:pPr>
+        <w:ind w:left="5760" w:hanging="360"/>
+      </w:pPr>
+      <w:rPr>
+        <w:u w:val="none"/>
+      </w:rPr>
+    </w:lvl>
+    <w:lvl w:ilvl="8">
+      <w:start w:val="1"/>
+      <w:numFmt w:val="bullet"/>
+      <w:lvlText w:val="■"/>
+      <w:lvlJc w:val="left"/>
+      <w:pPr>
+        <w:ind w:left="6480" w:hanging="360"/>
+      </w:pPr>
+      <w:rPr>
+        <w:u w:val="none"/>
+      </w:rPr>
+    </w:lvl>
+  </w:abstractNum>
+  <w:abstractNum w:abstractNumId="19">
     <w:lvl w:ilvl="0">
       <w:start w:val="1"/>
       <w:numFmt w:val="bullet"/>
@@ -4188,6 +5668,24 @@
   </w:num>
   <w:num w:numId="13">
     <w:abstractNumId w:val="13"/>
+  </w:num>
+  <w:num w:numId="14">
+    <w:abstractNumId w:val="14"/>
+  </w:num>
+  <w:num w:numId="15">
+    <w:abstractNumId w:val="15"/>
+  </w:num>
+  <w:num w:numId="16">
+    <w:abstractNumId w:val="16"/>
+  </w:num>
+  <w:num w:numId="17">
+    <w:abstractNumId w:val="17"/>
+  </w:num>
+  <w:num w:numId="18">
+    <w:abstractNumId w:val="18"/>
+  </w:num>
+  <w:num w:numId="19">
+    <w:abstractNumId w:val="19"/>
   </w:num>
 </w:numbering>
 </file>

</xml_diff>

<commit_message>
docs: refine architecture and implementation boundaries
</commit_message>
<xml_diff>
--- a/docs/DOC-017 — Proceso de Desarrollo Asistido por Inteligencia Artificial.docx
+++ b/docs/DOC-017 — Proceso de Desarrollo Asistido por Inteligencia Artificial.docx
@@ -99,7 +99,7 @@
       <w:pPr>
         <w:numPr>
           <w:ilvl w:val="0"/>
-          <w:numId w:val="17"/>
+          <w:numId w:val="19"/>
         </w:numPr>
         <w:spacing w:after="0" w:afterAutospacing="0" w:before="240" w:lineRule="auto"/>
         <w:ind w:left="720" w:hanging="360"/>
@@ -123,7 +123,7 @@
       <w:pPr>
         <w:numPr>
           <w:ilvl w:val="0"/>
-          <w:numId w:val="17"/>
+          <w:numId w:val="19"/>
         </w:numPr>
         <w:spacing w:after="0" w:afterAutospacing="0" w:before="0" w:beforeAutospacing="0" w:lineRule="auto"/>
         <w:ind w:left="720" w:hanging="360"/>
@@ -147,7 +147,7 @@
       <w:pPr>
         <w:numPr>
           <w:ilvl w:val="0"/>
-          <w:numId w:val="17"/>
+          <w:numId w:val="19"/>
         </w:numPr>
         <w:spacing w:after="0" w:afterAutospacing="0" w:before="0" w:beforeAutospacing="0" w:lineRule="auto"/>
         <w:ind w:left="720" w:hanging="360"/>
@@ -171,7 +171,7 @@
       <w:pPr>
         <w:numPr>
           <w:ilvl w:val="0"/>
-          <w:numId w:val="17"/>
+          <w:numId w:val="19"/>
         </w:numPr>
         <w:spacing w:after="0" w:afterAutospacing="0" w:before="0" w:beforeAutospacing="0" w:lineRule="auto"/>
         <w:ind w:left="720" w:hanging="360"/>
@@ -195,7 +195,7 @@
       <w:pPr>
         <w:numPr>
           <w:ilvl w:val="0"/>
-          <w:numId w:val="17"/>
+          <w:numId w:val="19"/>
         </w:numPr>
         <w:spacing w:after="0" w:afterAutospacing="0" w:before="0" w:beforeAutospacing="0" w:lineRule="auto"/>
         <w:ind w:left="720" w:hanging="360"/>
@@ -219,7 +219,7 @@
       <w:pPr>
         <w:numPr>
           <w:ilvl w:val="0"/>
-          <w:numId w:val="17"/>
+          <w:numId w:val="19"/>
         </w:numPr>
         <w:spacing w:after="0" w:afterAutospacing="0" w:before="0" w:beforeAutospacing="0" w:lineRule="auto"/>
         <w:ind w:left="720" w:hanging="360"/>
@@ -237,7 +237,7 @@
       <w:pPr>
         <w:numPr>
           <w:ilvl w:val="1"/>
-          <w:numId w:val="17"/>
+          <w:numId w:val="19"/>
         </w:numPr>
         <w:spacing w:after="0" w:afterAutospacing="0" w:before="0" w:beforeAutospacing="0" w:lineRule="auto"/>
         <w:ind w:left="1440" w:hanging="360"/>
@@ -253,7 +253,7 @@
       <w:pPr>
         <w:numPr>
           <w:ilvl w:val="1"/>
-          <w:numId w:val="17"/>
+          <w:numId w:val="19"/>
         </w:numPr>
         <w:spacing w:after="0" w:afterAutospacing="0" w:before="0" w:beforeAutospacing="0" w:lineRule="auto"/>
         <w:ind w:left="1440" w:hanging="360"/>
@@ -269,7 +269,7 @@
       <w:pPr>
         <w:numPr>
           <w:ilvl w:val="1"/>
-          <w:numId w:val="17"/>
+          <w:numId w:val="19"/>
         </w:numPr>
         <w:spacing w:after="0" w:afterAutospacing="0" w:before="0" w:beforeAutospacing="0" w:lineRule="auto"/>
         <w:ind w:left="1440" w:hanging="360"/>
@@ -285,7 +285,7 @@
       <w:pPr>
         <w:numPr>
           <w:ilvl w:val="1"/>
-          <w:numId w:val="17"/>
+          <w:numId w:val="19"/>
         </w:numPr>
         <w:spacing w:after="0" w:afterAutospacing="0" w:before="0" w:beforeAutospacing="0" w:lineRule="auto"/>
         <w:ind w:left="1440" w:hanging="360"/>
@@ -301,7 +301,7 @@
       <w:pPr>
         <w:numPr>
           <w:ilvl w:val="1"/>
-          <w:numId w:val="17"/>
+          <w:numId w:val="19"/>
         </w:numPr>
         <w:spacing w:after="240" w:before="0" w:beforeAutospacing="0" w:lineRule="auto"/>
         <w:ind w:left="1440" w:hanging="360"/>
@@ -435,7 +435,7 @@
       <w:pPr>
         <w:numPr>
           <w:ilvl w:val="0"/>
-          <w:numId w:val="14"/>
+          <w:numId w:val="16"/>
         </w:numPr>
         <w:spacing w:after="0" w:afterAutospacing="0" w:before="240" w:lineRule="auto"/>
         <w:ind w:left="720" w:hanging="360"/>
@@ -451,7 +451,7 @@
       <w:pPr>
         <w:numPr>
           <w:ilvl w:val="0"/>
-          <w:numId w:val="14"/>
+          <w:numId w:val="16"/>
         </w:numPr>
         <w:spacing w:after="0" w:afterAutospacing="0" w:before="0" w:beforeAutospacing="0" w:lineRule="auto"/>
         <w:ind w:left="720" w:hanging="360"/>
@@ -467,7 +467,7 @@
       <w:pPr>
         <w:numPr>
           <w:ilvl w:val="0"/>
-          <w:numId w:val="14"/>
+          <w:numId w:val="16"/>
         </w:numPr>
         <w:spacing w:after="0" w:afterAutospacing="0" w:before="0" w:beforeAutospacing="0" w:lineRule="auto"/>
         <w:ind w:left="720" w:hanging="360"/>
@@ -483,7 +483,7 @@
       <w:pPr>
         <w:numPr>
           <w:ilvl w:val="0"/>
-          <w:numId w:val="14"/>
+          <w:numId w:val="16"/>
         </w:numPr>
         <w:spacing w:after="0" w:afterAutospacing="0" w:before="0" w:beforeAutospacing="0" w:lineRule="auto"/>
         <w:ind w:left="720" w:hanging="360"/>
@@ -499,7 +499,7 @@
       <w:pPr>
         <w:numPr>
           <w:ilvl w:val="0"/>
-          <w:numId w:val="14"/>
+          <w:numId w:val="16"/>
         </w:numPr>
         <w:spacing w:after="0" w:afterAutospacing="0" w:before="0" w:beforeAutospacing="0" w:lineRule="auto"/>
         <w:ind w:left="720" w:hanging="360"/>
@@ -515,7 +515,7 @@
       <w:pPr>
         <w:numPr>
           <w:ilvl w:val="0"/>
-          <w:numId w:val="14"/>
+          <w:numId w:val="16"/>
         </w:numPr>
         <w:spacing w:after="0" w:afterAutospacing="0" w:before="0" w:beforeAutospacing="0" w:lineRule="auto"/>
         <w:ind w:left="720" w:hanging="360"/>
@@ -534,7 +534,7 @@
       <w:pPr>
         <w:numPr>
           <w:ilvl w:val="0"/>
-          <w:numId w:val="14"/>
+          <w:numId w:val="16"/>
         </w:numPr>
         <w:spacing w:after="240" w:before="0" w:beforeAutospacing="0" w:lineRule="auto"/>
         <w:ind w:left="720" w:hanging="360"/>
@@ -741,7 +741,7 @@
       <w:pPr>
         <w:numPr>
           <w:ilvl w:val="0"/>
-          <w:numId w:val="12"/>
+          <w:numId w:val="13"/>
         </w:numPr>
         <w:spacing w:after="0" w:afterAutospacing="0" w:before="240" w:lineRule="auto"/>
         <w:ind w:left="720" w:hanging="360"/>
@@ -757,7 +757,7 @@
       <w:pPr>
         <w:numPr>
           <w:ilvl w:val="0"/>
-          <w:numId w:val="12"/>
+          <w:numId w:val="13"/>
         </w:numPr>
         <w:spacing w:after="0" w:afterAutospacing="0" w:before="0" w:beforeAutospacing="0" w:lineRule="auto"/>
         <w:ind w:left="720" w:hanging="360"/>
@@ -773,7 +773,7 @@
       <w:pPr>
         <w:numPr>
           <w:ilvl w:val="0"/>
-          <w:numId w:val="12"/>
+          <w:numId w:val="13"/>
         </w:numPr>
         <w:spacing w:after="0" w:afterAutospacing="0" w:before="0" w:beforeAutospacing="0" w:lineRule="auto"/>
         <w:ind w:left="720" w:hanging="360"/>
@@ -789,7 +789,7 @@
       <w:pPr>
         <w:numPr>
           <w:ilvl w:val="0"/>
-          <w:numId w:val="12"/>
+          <w:numId w:val="13"/>
         </w:numPr>
         <w:spacing w:after="240" w:before="0" w:beforeAutospacing="0" w:lineRule="auto"/>
         <w:ind w:left="720" w:hanging="360"/>
@@ -840,7 +840,7 @@
         <w:rPr>
           <w:rtl w:val="0"/>
         </w:rPr>
-        <w:t xml:space="preserve">Una especificación técnica tiene como objetivo eliminar decisiones de implementación.</w:t>
+        <w:t xml:space="preserve">Una especificación técnica tiene como objetivo eliminar las decisiones arquitectónicas y contractuales que no pueden delegarse al Agente de Implementación sin riesgo de alterar el sistema. No pretende eliminar las decisiones internas propias de programación. </w:t>
       </w:r>
     </w:p>
     <w:p>
@@ -973,7 +973,7 @@
       <w:pPr>
         <w:numPr>
           <w:ilvl w:val="0"/>
-          <w:numId w:val="13"/>
+          <w:numId w:val="15"/>
         </w:numPr>
         <w:spacing w:after="0" w:afterAutospacing="0" w:before="240" w:lineRule="auto"/>
         <w:ind w:left="720" w:hanging="360"/>
@@ -989,7 +989,7 @@
       <w:pPr>
         <w:numPr>
           <w:ilvl w:val="0"/>
-          <w:numId w:val="13"/>
+          <w:numId w:val="15"/>
         </w:numPr>
         <w:spacing w:after="0" w:afterAutospacing="0" w:before="0" w:beforeAutospacing="0" w:lineRule="auto"/>
         <w:ind w:left="720" w:hanging="360"/>
@@ -1005,7 +1005,7 @@
       <w:pPr>
         <w:numPr>
           <w:ilvl w:val="0"/>
-          <w:numId w:val="13"/>
+          <w:numId w:val="15"/>
         </w:numPr>
         <w:spacing w:after="0" w:afterAutospacing="0" w:before="0" w:beforeAutospacing="0" w:lineRule="auto"/>
         <w:ind w:left="720" w:hanging="360"/>
@@ -1021,7 +1021,7 @@
       <w:pPr>
         <w:numPr>
           <w:ilvl w:val="0"/>
-          <w:numId w:val="13"/>
+          <w:numId w:val="15"/>
         </w:numPr>
         <w:spacing w:after="0" w:afterAutospacing="0" w:before="0" w:beforeAutospacing="0" w:lineRule="auto"/>
         <w:ind w:left="720" w:hanging="360"/>
@@ -1037,7 +1037,7 @@
       <w:pPr>
         <w:numPr>
           <w:ilvl w:val="0"/>
-          <w:numId w:val="13"/>
+          <w:numId w:val="15"/>
         </w:numPr>
         <w:spacing w:after="240" w:before="0" w:beforeAutospacing="0" w:lineRule="auto"/>
         <w:ind w:left="720" w:hanging="360"/>
@@ -1068,7 +1068,7 @@
       <w:pPr>
         <w:numPr>
           <w:ilvl w:val="0"/>
-          <w:numId w:val="9"/>
+          <w:numId w:val="10"/>
         </w:numPr>
         <w:spacing w:after="0" w:afterAutospacing="0" w:before="240" w:lineRule="auto"/>
         <w:ind w:left="720" w:hanging="360"/>
@@ -1084,7 +1084,7 @@
       <w:pPr>
         <w:numPr>
           <w:ilvl w:val="0"/>
-          <w:numId w:val="9"/>
+          <w:numId w:val="10"/>
         </w:numPr>
         <w:spacing w:after="0" w:afterAutospacing="0" w:before="0" w:beforeAutospacing="0" w:lineRule="auto"/>
         <w:ind w:left="720" w:hanging="360"/>
@@ -1100,7 +1100,7 @@
       <w:pPr>
         <w:numPr>
           <w:ilvl w:val="0"/>
-          <w:numId w:val="9"/>
+          <w:numId w:val="10"/>
         </w:numPr>
         <w:spacing w:after="240" w:before="0" w:beforeAutospacing="0" w:lineRule="auto"/>
         <w:ind w:left="720" w:hanging="360"/>
@@ -1204,7 +1204,7 @@
       <w:pPr>
         <w:numPr>
           <w:ilvl w:val="0"/>
-          <w:numId w:val="18"/>
+          <w:numId w:val="21"/>
         </w:numPr>
         <w:spacing w:after="0" w:afterAutospacing="0" w:before="240" w:lineRule="auto"/>
         <w:ind w:left="720" w:hanging="360"/>
@@ -1220,7 +1220,7 @@
       <w:pPr>
         <w:numPr>
           <w:ilvl w:val="0"/>
-          <w:numId w:val="18"/>
+          <w:numId w:val="21"/>
         </w:numPr>
         <w:spacing w:after="0" w:afterAutospacing="0" w:before="0" w:beforeAutospacing="0" w:lineRule="auto"/>
         <w:ind w:left="720" w:hanging="360"/>
@@ -1236,7 +1236,7 @@
       <w:pPr>
         <w:numPr>
           <w:ilvl w:val="0"/>
-          <w:numId w:val="18"/>
+          <w:numId w:val="21"/>
         </w:numPr>
         <w:spacing w:after="0" w:afterAutospacing="0" w:before="0" w:beforeAutospacing="0" w:lineRule="auto"/>
         <w:ind w:left="720" w:hanging="360"/>
@@ -1252,7 +1252,7 @@
       <w:pPr>
         <w:numPr>
           <w:ilvl w:val="0"/>
-          <w:numId w:val="18"/>
+          <w:numId w:val="21"/>
         </w:numPr>
         <w:spacing w:after="240" w:before="0" w:beforeAutospacing="0" w:lineRule="auto"/>
         <w:ind w:left="720" w:hanging="360"/>
@@ -1538,9 +1538,12 @@
     </w:p>
     <w:p>
       <w:pPr>
+        <w:pStyle w:val="Heading2"/>
         <w:spacing w:after="240" w:before="240" w:lineRule="auto"/>
         <w:rPr/>
       </w:pPr>
+      <w:bookmarkStart w:colFirst="0" w:colLast="0" w:name="_tp5vnzrh26oz" w:id="12"/>
+      <w:bookmarkEnd w:id="12"/>
       <w:r>
         <w:rPr>
           <w:rtl w:val="0"/>
@@ -1617,8 +1620,8 @@
           <w:szCs w:val="26"/>
         </w:rPr>
       </w:pPr>
-      <w:bookmarkStart w:colFirst="0" w:colLast="0" w:name="_wf36jc3namjw" w:id="12"/>
-      <w:bookmarkEnd w:id="12"/>
+      <w:bookmarkStart w:colFirst="0" w:colLast="0" w:name="_wf36jc3namjw" w:id="13"/>
+      <w:bookmarkEnd w:id="13"/>
       <w:r>
         <w:rPr>
           <w:b w:val="1"/>
@@ -1647,7 +1650,7 @@
       <w:pPr>
         <w:numPr>
           <w:ilvl w:val="0"/>
-          <w:numId w:val="10"/>
+          <w:numId w:val="11"/>
         </w:numPr>
         <w:spacing w:after="0" w:afterAutospacing="0" w:before="240" w:lineRule="auto"/>
         <w:ind w:left="720" w:hanging="360"/>
@@ -1663,7 +1666,7 @@
       <w:pPr>
         <w:numPr>
           <w:ilvl w:val="0"/>
-          <w:numId w:val="10"/>
+          <w:numId w:val="11"/>
         </w:numPr>
         <w:spacing w:after="0" w:afterAutospacing="0" w:before="0" w:beforeAutospacing="0" w:lineRule="auto"/>
         <w:ind w:left="720" w:hanging="360"/>
@@ -1679,7 +1682,7 @@
       <w:pPr>
         <w:numPr>
           <w:ilvl w:val="0"/>
-          <w:numId w:val="10"/>
+          <w:numId w:val="11"/>
         </w:numPr>
         <w:spacing w:after="0" w:afterAutospacing="0" w:before="0" w:beforeAutospacing="0" w:lineRule="auto"/>
         <w:ind w:left="720" w:hanging="360"/>
@@ -1695,7 +1698,7 @@
       <w:pPr>
         <w:numPr>
           <w:ilvl w:val="0"/>
-          <w:numId w:val="10"/>
+          <w:numId w:val="11"/>
         </w:numPr>
         <w:spacing w:after="240" w:before="0" w:beforeAutospacing="0" w:lineRule="auto"/>
         <w:ind w:left="720" w:hanging="360"/>
@@ -1736,8 +1739,8 @@
           <w:szCs w:val="26"/>
         </w:rPr>
       </w:pPr>
-      <w:bookmarkStart w:colFirst="0" w:colLast="0" w:name="_2wcfofr6q6vz" w:id="13"/>
-      <w:bookmarkEnd w:id="13"/>
+      <w:bookmarkStart w:colFirst="0" w:colLast="0" w:name="_2wcfofr6q6vz" w:id="14"/>
+      <w:bookmarkEnd w:id="14"/>
       <w:r>
         <w:rPr>
           <w:b w:val="1"/>
@@ -1766,7 +1769,7 @@
       <w:pPr>
         <w:numPr>
           <w:ilvl w:val="0"/>
-          <w:numId w:val="11"/>
+          <w:numId w:val="12"/>
         </w:numPr>
         <w:spacing w:after="0" w:afterAutospacing="0" w:before="240" w:lineRule="auto"/>
         <w:ind w:left="720" w:hanging="360"/>
@@ -1782,7 +1785,7 @@
       <w:pPr>
         <w:numPr>
           <w:ilvl w:val="0"/>
-          <w:numId w:val="11"/>
+          <w:numId w:val="12"/>
         </w:numPr>
         <w:spacing w:after="0" w:afterAutospacing="0" w:before="0" w:beforeAutospacing="0" w:lineRule="auto"/>
         <w:ind w:left="720" w:hanging="360"/>
@@ -1798,7 +1801,7 @@
       <w:pPr>
         <w:numPr>
           <w:ilvl w:val="0"/>
-          <w:numId w:val="11"/>
+          <w:numId w:val="12"/>
         </w:numPr>
         <w:spacing w:after="0" w:afterAutospacing="0" w:before="0" w:beforeAutospacing="0" w:lineRule="auto"/>
         <w:ind w:left="720" w:hanging="360"/>
@@ -1814,7 +1817,7 @@
       <w:pPr>
         <w:numPr>
           <w:ilvl w:val="0"/>
-          <w:numId w:val="11"/>
+          <w:numId w:val="12"/>
         </w:numPr>
         <w:spacing w:after="240" w:before="0" w:beforeAutospacing="0" w:lineRule="auto"/>
         <w:ind w:left="720" w:hanging="360"/>
@@ -1855,8 +1858,8 @@
           <w:szCs w:val="26"/>
         </w:rPr>
       </w:pPr>
-      <w:bookmarkStart w:colFirst="0" w:colLast="0" w:name="_9jcb0yi23wuk" w:id="14"/>
-      <w:bookmarkEnd w:id="14"/>
+      <w:bookmarkStart w:colFirst="0" w:colLast="0" w:name="_9jcb0yi23wuk" w:id="15"/>
+      <w:bookmarkEnd w:id="15"/>
       <w:r>
         <w:rPr>
           <w:b w:val="1"/>
@@ -1974,8 +1977,8 @@
           <w:szCs w:val="26"/>
         </w:rPr>
       </w:pPr>
-      <w:bookmarkStart w:colFirst="0" w:colLast="0" w:name="_46w4piez3z50" w:id="15"/>
-      <w:bookmarkEnd w:id="15"/>
+      <w:bookmarkStart w:colFirst="0" w:colLast="0" w:name="_46w4piez3z50" w:id="16"/>
+      <w:bookmarkEnd w:id="16"/>
       <w:r>
         <w:rPr>
           <w:b w:val="1"/>
@@ -2109,8 +2112,8 @@
           <w:szCs w:val="26"/>
         </w:rPr>
       </w:pPr>
-      <w:bookmarkStart w:colFirst="0" w:colLast="0" w:name="_uw70ht5xddmz" w:id="16"/>
-      <w:bookmarkEnd w:id="16"/>
+      <w:bookmarkStart w:colFirst="0" w:colLast="0" w:name="_uw70ht5xddmz" w:id="17"/>
+      <w:bookmarkEnd w:id="17"/>
       <w:r>
         <w:rPr>
           <w:b w:val="1"/>
@@ -2244,8 +2247,8 @@
           <w:szCs w:val="26"/>
         </w:rPr>
       </w:pPr>
-      <w:bookmarkStart w:colFirst="0" w:colLast="0" w:name="_tjaznu16b8l4" w:id="17"/>
-      <w:bookmarkEnd w:id="17"/>
+      <w:bookmarkStart w:colFirst="0" w:colLast="0" w:name="_tjaznu16b8l4" w:id="18"/>
+      <w:bookmarkEnd w:id="18"/>
       <w:r>
         <w:rPr>
           <w:b w:val="1"/>
@@ -2274,7 +2277,7 @@
       <w:pPr>
         <w:numPr>
           <w:ilvl w:val="0"/>
-          <w:numId w:val="19"/>
+          <w:numId w:val="22"/>
         </w:numPr>
         <w:spacing w:after="0" w:afterAutospacing="0" w:before="240" w:lineRule="auto"/>
         <w:ind w:left="720" w:hanging="360"/>
@@ -2290,7 +2293,7 @@
       <w:pPr>
         <w:numPr>
           <w:ilvl w:val="0"/>
-          <w:numId w:val="19"/>
+          <w:numId w:val="22"/>
         </w:numPr>
         <w:spacing w:after="0" w:afterAutospacing="0" w:before="0" w:beforeAutospacing="0" w:lineRule="auto"/>
         <w:ind w:left="720" w:hanging="360"/>
@@ -2306,7 +2309,7 @@
       <w:pPr>
         <w:numPr>
           <w:ilvl w:val="0"/>
-          <w:numId w:val="19"/>
+          <w:numId w:val="22"/>
         </w:numPr>
         <w:spacing w:after="0" w:afterAutospacing="0" w:before="0" w:beforeAutospacing="0" w:lineRule="auto"/>
         <w:ind w:left="720" w:hanging="360"/>
@@ -2322,7 +2325,7 @@
       <w:pPr>
         <w:numPr>
           <w:ilvl w:val="0"/>
-          <w:numId w:val="19"/>
+          <w:numId w:val="22"/>
         </w:numPr>
         <w:spacing w:after="240" w:before="0" w:beforeAutospacing="0" w:lineRule="auto"/>
         <w:ind w:left="720" w:hanging="360"/>
@@ -2331,7 +2334,559 @@
         <w:rPr>
           <w:rtl w:val="0"/>
         </w:rPr>
-        <w:t xml:space="preserve">impacto sobre futuras capacidades.</w:t>
+        <w:t xml:space="preserve">impacto sobre futuras capacidades</w:t>
+      </w:r>
+    </w:p>
+    <w:p>
+      <w:pPr>
+        <w:spacing w:after="240" w:before="240" w:lineRule="auto"/>
+        <w:ind w:left="0" w:firstLine="0"/>
+        <w:rPr/>
+      </w:pPr>
+      <w:r>
+        <w:rPr>
+          <w:rtl w:val="0"/>
+        </w:rPr>
+      </w:r>
+    </w:p>
+    <w:p>
+      <w:pPr>
+        <w:pStyle w:val="Heading2"/>
+        <w:spacing w:after="240" w:before="240" w:lineRule="auto"/>
+        <w:rPr/>
+      </w:pPr>
+      <w:bookmarkStart w:colFirst="0" w:colLast="0" w:name="_1a12k0gbfuaz" w:id="19"/>
+      <w:bookmarkEnd w:id="19"/>
+      <w:r>
+        <w:rPr>
+          <w:rtl w:val="0"/>
+        </w:rPr>
+        <w:t xml:space="preserve">4.2 Separación estricta entre arquitectura e implementación</w:t>
+      </w:r>
+    </w:p>
+    <w:p>
+      <w:pPr>
+        <w:spacing w:after="240" w:before="240" w:lineRule="auto"/>
+        <w:rPr/>
+      </w:pPr>
+      <w:r>
+        <w:rPr>
+          <w:rtl w:val="0"/>
+        </w:rPr>
+        <w:t xml:space="preserve">El Arquitecto Técnico deberá definir exclusivamente:</w:t>
+      </w:r>
+    </w:p>
+    <w:p>
+      <w:pPr>
+        <w:numPr>
+          <w:ilvl w:val="0"/>
+          <w:numId w:val="8"/>
+        </w:numPr>
+        <w:spacing w:after="0" w:afterAutospacing="0" w:before="240" w:lineRule="auto"/>
+        <w:ind w:left="720" w:hanging="360"/>
+      </w:pPr>
+      <w:r>
+        <w:rPr>
+          <w:rtl w:val="0"/>
+        </w:rPr>
+        <w:t xml:space="preserve">responsabilidades arquitectónicas;</w:t>
+      </w:r>
+    </w:p>
+    <w:p>
+      <w:pPr>
+        <w:numPr>
+          <w:ilvl w:val="0"/>
+          <w:numId w:val="8"/>
+        </w:numPr>
+        <w:spacing w:after="0" w:afterAutospacing="0" w:before="0" w:beforeAutospacing="0" w:lineRule="auto"/>
+        <w:ind w:left="720" w:hanging="360"/>
+      </w:pPr>
+      <w:r>
+        <w:rPr>
+          <w:rtl w:val="0"/>
+        </w:rPr>
+        <w:t xml:space="preserve">fronteras entre Capabilities;</w:t>
+      </w:r>
+    </w:p>
+    <w:p>
+      <w:pPr>
+        <w:numPr>
+          <w:ilvl w:val="0"/>
+          <w:numId w:val="8"/>
+        </w:numPr>
+        <w:spacing w:after="0" w:afterAutospacing="0" w:before="0" w:beforeAutospacing="0" w:lineRule="auto"/>
+        <w:ind w:left="720" w:hanging="360"/>
+      </w:pPr>
+      <w:r>
+        <w:rPr>
+          <w:rtl w:val="0"/>
+        </w:rPr>
+        <w:t xml:space="preserve">contratos públicos de entrada y salida;</w:t>
+      </w:r>
+    </w:p>
+    <w:p>
+      <w:pPr>
+        <w:numPr>
+          <w:ilvl w:val="0"/>
+          <w:numId w:val="8"/>
+        </w:numPr>
+        <w:spacing w:after="0" w:afterAutospacing="0" w:before="0" w:beforeAutospacing="0" w:lineRule="auto"/>
+        <w:ind w:left="720" w:hanging="360"/>
+      </w:pPr>
+      <w:r>
+        <w:rPr>
+          <w:rtl w:val="0"/>
+        </w:rPr>
+        <w:t xml:space="preserve">semántica del dominio;</w:t>
+      </w:r>
+    </w:p>
+    <w:p>
+      <w:pPr>
+        <w:numPr>
+          <w:ilvl w:val="0"/>
+          <w:numId w:val="8"/>
+        </w:numPr>
+        <w:spacing w:after="0" w:afterAutospacing="0" w:before="0" w:beforeAutospacing="0" w:lineRule="auto"/>
+        <w:ind w:left="720" w:hanging="360"/>
+      </w:pPr>
+      <w:r>
+        <w:rPr>
+          <w:rtl w:val="0"/>
+        </w:rPr>
+        <w:t xml:space="preserve">invariantes arquitectónicas y de dominio;</w:t>
+      </w:r>
+    </w:p>
+    <w:p>
+      <w:pPr>
+        <w:numPr>
+          <w:ilvl w:val="0"/>
+          <w:numId w:val="8"/>
+        </w:numPr>
+        <w:spacing w:after="0" w:afterAutospacing="0" w:before="0" w:beforeAutospacing="0" w:lineRule="auto"/>
+        <w:ind w:left="720" w:hanging="360"/>
+      </w:pPr>
+      <w:r>
+        <w:rPr>
+          <w:rtl w:val="0"/>
+        </w:rPr>
+        <w:t xml:space="preserve">dependencias permitidas;</w:t>
+      </w:r>
+    </w:p>
+    <w:p>
+      <w:pPr>
+        <w:numPr>
+          <w:ilvl w:val="0"/>
+          <w:numId w:val="8"/>
+        </w:numPr>
+        <w:spacing w:after="0" w:afterAutospacing="0" w:before="0" w:beforeAutospacing="0" w:lineRule="auto"/>
+        <w:ind w:left="720" w:hanging="360"/>
+      </w:pPr>
+      <w:r>
+        <w:rPr>
+          <w:rtl w:val="0"/>
+        </w:rPr>
+        <w:t xml:space="preserve">restricciones que afecten la compatibilidad entre componentes;</w:t>
+      </w:r>
+    </w:p>
+    <w:p>
+      <w:pPr>
+        <w:numPr>
+          <w:ilvl w:val="0"/>
+          <w:numId w:val="8"/>
+        </w:numPr>
+        <w:spacing w:after="240" w:before="0" w:beforeAutospacing="0" w:lineRule="auto"/>
+        <w:ind w:left="720" w:hanging="360"/>
+      </w:pPr>
+      <w:r>
+        <w:rPr>
+          <w:rtl w:val="0"/>
+        </w:rPr>
+        <w:t xml:space="preserve">criterios de aceptación observables cuando formen parte del contrato.</w:t>
+      </w:r>
+    </w:p>
+    <w:p>
+      <w:pPr>
+        <w:spacing w:after="240" w:before="240" w:lineRule="auto"/>
+        <w:rPr/>
+      </w:pPr>
+      <w:r>
+        <w:rPr>
+          <w:rtl w:val="0"/>
+        </w:rPr>
+        <w:t xml:space="preserve">El Arquitecto Técnico no deberá definir decisiones internas de programación cuando dichas decisiones no modifiquen la arquitectura, los contratos públicos, la semántica del dominio, las invariantes o las dependencias autorizadas.</w:t>
+      </w:r>
+    </w:p>
+    <w:p>
+      <w:pPr>
+        <w:spacing w:after="240" w:before="240" w:lineRule="auto"/>
+        <w:rPr/>
+      </w:pPr>
+      <w:r>
+        <w:rPr>
+          <w:rtl w:val="0"/>
+        </w:rPr>
+        <w:t xml:space="preserve">Pertenecen exclusivamente al Agente de Implementación, entre otras:</w:t>
+      </w:r>
+    </w:p>
+    <w:p>
+      <w:pPr>
+        <w:numPr>
+          <w:ilvl w:val="0"/>
+          <w:numId w:val="14"/>
+        </w:numPr>
+        <w:spacing w:after="0" w:afterAutospacing="0" w:before="240" w:lineRule="auto"/>
+        <w:ind w:left="720" w:hanging="360"/>
+      </w:pPr>
+      <w:r>
+        <w:rPr>
+          <w:rtl w:val="0"/>
+        </w:rPr>
+        <w:t xml:space="preserve">estructuras de datos internas;</w:t>
+      </w:r>
+    </w:p>
+    <w:p>
+      <w:pPr>
+        <w:numPr>
+          <w:ilvl w:val="0"/>
+          <w:numId w:val="14"/>
+        </w:numPr>
+        <w:spacing w:after="0" w:afterAutospacing="0" w:before="0" w:beforeAutospacing="0" w:lineRule="auto"/>
+        <w:ind w:left="720" w:hanging="360"/>
+      </w:pPr>
+      <w:r>
+        <w:rPr>
+          <w:rtl w:val="0"/>
+        </w:rPr>
+        <w:t xml:space="preserve">algoritmos internos;</w:t>
+      </w:r>
+    </w:p>
+    <w:p>
+      <w:pPr>
+        <w:numPr>
+          <w:ilvl w:val="0"/>
+          <w:numId w:val="14"/>
+        </w:numPr>
+        <w:spacing w:after="0" w:afterAutospacing="0" w:before="0" w:beforeAutospacing="0" w:lineRule="auto"/>
+        <w:ind w:left="720" w:hanging="360"/>
+      </w:pPr>
+      <w:r>
+        <w:rPr>
+          <w:rtl w:val="0"/>
+        </w:rPr>
+        <w:t xml:space="preserve">elección entre estructuras de control;</w:t>
+      </w:r>
+    </w:p>
+    <w:p>
+      <w:pPr>
+        <w:numPr>
+          <w:ilvl w:val="0"/>
+          <w:numId w:val="14"/>
+        </w:numPr>
+        <w:spacing w:after="0" w:afterAutospacing="0" w:before="0" w:beforeAutospacing="0" w:lineRule="auto"/>
+        <w:ind w:left="720" w:hanging="360"/>
+      </w:pPr>
+      <w:r>
+        <w:rPr>
+          <w:rtl w:val="0"/>
+        </w:rPr>
+        <w:t xml:space="preserve">funciones auxiliares;</w:t>
+      </w:r>
+    </w:p>
+    <w:p>
+      <w:pPr>
+        <w:numPr>
+          <w:ilvl w:val="0"/>
+          <w:numId w:val="14"/>
+        </w:numPr>
+        <w:spacing w:after="0" w:afterAutospacing="0" w:before="0" w:beforeAutospacing="0" w:lineRule="auto"/>
+        <w:ind w:left="720" w:hanging="360"/>
+      </w:pPr>
+      <w:r>
+        <w:rPr>
+          <w:rtl w:val="0"/>
+        </w:rPr>
+        <w:t xml:space="preserve">organización interna del código;</w:t>
+      </w:r>
+    </w:p>
+    <w:p>
+      <w:pPr>
+        <w:numPr>
+          <w:ilvl w:val="0"/>
+          <w:numId w:val="14"/>
+        </w:numPr>
+        <w:spacing w:after="0" w:afterAutospacing="0" w:before="0" w:beforeAutospacing="0" w:lineRule="auto"/>
+        <w:ind w:left="720" w:hanging="360"/>
+      </w:pPr>
+      <w:r>
+        <w:rPr>
+          <w:rtl w:val="0"/>
+        </w:rPr>
+        <w:t xml:space="preserve">mecanismos concretos de validación;</w:t>
+      </w:r>
+    </w:p>
+    <w:p>
+      <w:pPr>
+        <w:numPr>
+          <w:ilvl w:val="0"/>
+          <w:numId w:val="14"/>
+        </w:numPr>
+        <w:spacing w:after="0" w:afterAutospacing="0" w:before="0" w:beforeAutospacing="0" w:lineRule="auto"/>
+        <w:ind w:left="720" w:hanging="360"/>
+      </w:pPr>
+      <w:r>
+        <w:rPr>
+          <w:rtl w:val="0"/>
+        </w:rPr>
+        <w:t xml:space="preserve">estrategias concretas de hashing;</w:t>
+      </w:r>
+    </w:p>
+    <w:p>
+      <w:pPr>
+        <w:numPr>
+          <w:ilvl w:val="0"/>
+          <w:numId w:val="14"/>
+        </w:numPr>
+        <w:spacing w:after="0" w:afterAutospacing="0" w:before="0" w:beforeAutospacing="0" w:lineRule="auto"/>
+        <w:ind w:left="720" w:hanging="360"/>
+      </w:pPr>
+      <w:r>
+        <w:rPr>
+          <w:rtl w:val="0"/>
+        </w:rPr>
+        <w:t xml:space="preserve">mecanismos internos de canonicalización;</w:t>
+      </w:r>
+    </w:p>
+    <w:p>
+      <w:pPr>
+        <w:numPr>
+          <w:ilvl w:val="0"/>
+          <w:numId w:val="14"/>
+        </w:numPr>
+        <w:spacing w:after="0" w:afterAutospacing="0" w:before="0" w:beforeAutospacing="0" w:lineRule="auto"/>
+        <w:ind w:left="720" w:hanging="360"/>
+      </w:pPr>
+      <w:r>
+        <w:rPr>
+          <w:rtl w:val="0"/>
+        </w:rPr>
+        <w:t xml:space="preserve">optimizaciones internas;</w:t>
+      </w:r>
+    </w:p>
+    <w:p>
+      <w:pPr>
+        <w:numPr>
+          <w:ilvl w:val="0"/>
+          <w:numId w:val="14"/>
+        </w:numPr>
+        <w:spacing w:after="0" w:afterAutospacing="0" w:before="0" w:beforeAutospacing="0" w:lineRule="auto"/>
+        <w:ind w:left="720" w:hanging="360"/>
+      </w:pPr>
+      <w:r>
+        <w:rPr>
+          <w:rtl w:val="0"/>
+        </w:rPr>
+        <w:t xml:space="preserve">selección de técnicas de implementación;</w:t>
+      </w:r>
+    </w:p>
+    <w:p>
+      <w:pPr>
+        <w:numPr>
+          <w:ilvl w:val="0"/>
+          <w:numId w:val="14"/>
+        </w:numPr>
+        <w:spacing w:after="240" w:before="0" w:beforeAutospacing="0" w:lineRule="auto"/>
+        <w:ind w:left="720" w:hanging="360"/>
+      </w:pPr>
+      <w:r>
+        <w:rPr>
+          <w:rtl w:val="0"/>
+        </w:rPr>
+        <w:t xml:space="preserve">refactorizaciones internas compatibles con los contratos.</w:t>
+      </w:r>
+    </w:p>
+    <w:p>
+      <w:pPr>
+        <w:spacing w:after="240" w:before="240" w:lineRule="auto"/>
+        <w:rPr/>
+      </w:pPr>
+      <w:r>
+        <w:rPr>
+          <w:rtl w:val="0"/>
+        </w:rPr>
+        <w:t xml:space="preserve">Una especificación técnica no deberá intentar eliminar estas decisiones.</w:t>
+      </w:r>
+    </w:p>
+    <w:p>
+      <w:pPr>
+        <w:spacing w:after="240" w:before="240" w:lineRule="auto"/>
+        <w:rPr/>
+      </w:pPr>
+      <w:r>
+        <w:rPr>
+          <w:rtl w:val="0"/>
+        </w:rPr>
+        <w:t xml:space="preserve">La expresión “eliminar decisiones de implementación” significará exclusivamente eliminar aquellas decisiones que, si fueran tomadas de forma distinta por el Agente de Implementación, pudieran alterar:</w:t>
+      </w:r>
+    </w:p>
+    <w:p>
+      <w:pPr>
+        <w:numPr>
+          <w:ilvl w:val="0"/>
+          <w:numId w:val="20"/>
+        </w:numPr>
+        <w:spacing w:after="0" w:afterAutospacing="0" w:before="240" w:lineRule="auto"/>
+        <w:ind w:left="720" w:hanging="360"/>
+      </w:pPr>
+      <w:r>
+        <w:rPr>
+          <w:rtl w:val="0"/>
+        </w:rPr>
+        <w:t xml:space="preserve">la arquitectura;</w:t>
+      </w:r>
+    </w:p>
+    <w:p>
+      <w:pPr>
+        <w:numPr>
+          <w:ilvl w:val="0"/>
+          <w:numId w:val="20"/>
+        </w:numPr>
+        <w:spacing w:after="0" w:afterAutospacing="0" w:before="0" w:beforeAutospacing="0" w:lineRule="auto"/>
+        <w:ind w:left="720" w:hanging="360"/>
+      </w:pPr>
+      <w:r>
+        <w:rPr>
+          <w:rtl w:val="0"/>
+        </w:rPr>
+        <w:t xml:space="preserve">una frontera;</w:t>
+      </w:r>
+    </w:p>
+    <w:p>
+      <w:pPr>
+        <w:numPr>
+          <w:ilvl w:val="0"/>
+          <w:numId w:val="20"/>
+        </w:numPr>
+        <w:spacing w:after="0" w:afterAutospacing="0" w:before="0" w:beforeAutospacing="0" w:lineRule="auto"/>
+        <w:ind w:left="720" w:hanging="360"/>
+      </w:pPr>
+      <w:r>
+        <w:rPr>
+          <w:rtl w:val="0"/>
+        </w:rPr>
+        <w:t xml:space="preserve">un contrato público;</w:t>
+      </w:r>
+    </w:p>
+    <w:p>
+      <w:pPr>
+        <w:numPr>
+          <w:ilvl w:val="0"/>
+          <w:numId w:val="20"/>
+        </w:numPr>
+        <w:spacing w:after="0" w:afterAutospacing="0" w:before="0" w:beforeAutospacing="0" w:lineRule="auto"/>
+        <w:ind w:left="720" w:hanging="360"/>
+      </w:pPr>
+      <w:r>
+        <w:rPr>
+          <w:rtl w:val="0"/>
+        </w:rPr>
+        <w:t xml:space="preserve">la semántica del dominio;</w:t>
+      </w:r>
+    </w:p>
+    <w:p>
+      <w:pPr>
+        <w:numPr>
+          <w:ilvl w:val="0"/>
+          <w:numId w:val="20"/>
+        </w:numPr>
+        <w:spacing w:after="0" w:afterAutospacing="0" w:before="0" w:beforeAutospacing="0" w:lineRule="auto"/>
+        <w:ind w:left="720" w:hanging="360"/>
+      </w:pPr>
+      <w:r>
+        <w:rPr>
+          <w:rtl w:val="0"/>
+        </w:rPr>
+        <w:t xml:space="preserve">una invariante;</w:t>
+      </w:r>
+    </w:p>
+    <w:p>
+      <w:pPr>
+        <w:numPr>
+          <w:ilvl w:val="0"/>
+          <w:numId w:val="20"/>
+        </w:numPr>
+        <w:spacing w:after="0" w:afterAutospacing="0" w:before="0" w:beforeAutospacing="0" w:lineRule="auto"/>
+        <w:ind w:left="720" w:hanging="360"/>
+      </w:pPr>
+      <w:r>
+        <w:rPr>
+          <w:rtl w:val="0"/>
+        </w:rPr>
+        <w:t xml:space="preserve">una dependencia autorizada;</w:t>
+      </w:r>
+    </w:p>
+    <w:p>
+      <w:pPr>
+        <w:numPr>
+          <w:ilvl w:val="0"/>
+          <w:numId w:val="20"/>
+        </w:numPr>
+        <w:spacing w:after="240" w:before="0" w:beforeAutospacing="0" w:lineRule="auto"/>
+        <w:ind w:left="720" w:hanging="360"/>
+      </w:pPr>
+      <w:r>
+        <w:rPr>
+          <w:rtl w:val="0"/>
+        </w:rPr>
+        <w:t xml:space="preserve">un comportamiento observable normativo.</w:t>
+      </w:r>
+    </w:p>
+    <w:p>
+      <w:pPr>
+        <w:spacing w:after="240" w:before="240" w:lineRule="auto"/>
+        <w:rPr/>
+      </w:pPr>
+      <w:r>
+        <w:rPr>
+          <w:rtl w:val="0"/>
+        </w:rPr>
+        <w:t xml:space="preserve">Si varias implementaciones internas distintas pueden satisfacer exactamente el mismo contrato público y las mismas invariantes, la elección entre ellas pertenece al Agente de Implementación.</w:t>
+      </w:r>
+    </w:p>
+    <w:p>
+      <w:pPr>
+        <w:spacing w:after="240" w:before="240" w:lineRule="auto"/>
+        <w:rPr/>
+      </w:pPr>
+      <w:r>
+        <w:rPr>
+          <w:rtl w:val="0"/>
+        </w:rPr>
+        <w:t xml:space="preserve">La implementación únicamente deberá detenerse cuando exista evidencia objetiva de que continuar exige tomar una decisión arquitectónica o contractual no resuelta.</w:t>
+      </w:r>
+    </w:p>
+    <w:p>
+      <w:pPr>
+        <w:spacing w:after="240" w:before="240" w:lineRule="auto"/>
+        <w:rPr/>
+      </w:pPr>
+      <w:r>
+        <w:rPr>
+          <w:rtl w:val="0"/>
+        </w:rPr>
+        <w:t xml:space="preserve">Las decisiones puramente internas de programación no constituyen motivo válido de detención ni justifican una nueva reunión arquitectónica.</w:t>
+      </w:r>
+    </w:p>
+    <w:p>
+      <w:pPr>
+        <w:spacing w:after="240" w:before="240" w:lineRule="auto"/>
+        <w:ind w:left="0" w:firstLine="0"/>
+        <w:rPr/>
+      </w:pPr>
+      <w:r>
+        <w:rPr>
+          <w:rtl w:val="0"/>
+        </w:rPr>
+        <w:t xml:space="preserve">.</w:t>
       </w:r>
     </w:p>
     <w:p>
@@ -2372,8 +2927,8 @@
           <w:szCs w:val="46"/>
         </w:rPr>
       </w:pPr>
-      <w:bookmarkStart w:colFirst="0" w:colLast="0" w:name="_5xm3arev5ity" w:id="18"/>
-      <w:bookmarkEnd w:id="18"/>
+      <w:bookmarkStart w:colFirst="0" w:colLast="0" w:name="_5xm3arev5ity" w:id="20"/>
+      <w:bookmarkEnd w:id="20"/>
       <w:r>
         <w:rPr>
           <w:b w:val="1"/>
@@ -2679,8 +3234,8 @@
           <w:szCs w:val="46"/>
         </w:rPr>
       </w:pPr>
-      <w:bookmarkStart w:colFirst="0" w:colLast="0" w:name="_ygyv45nzyql7" w:id="19"/>
-      <w:bookmarkEnd w:id="19"/>
+      <w:bookmarkStart w:colFirst="0" w:colLast="0" w:name="_ygyv45nzyql7" w:id="21"/>
+      <w:bookmarkEnd w:id="21"/>
       <w:r>
         <w:rPr>
           <w:b w:val="1"/>
@@ -2708,7 +3263,7 @@
       <w:pPr>
         <w:numPr>
           <w:ilvl w:val="0"/>
-          <w:numId w:val="8"/>
+          <w:numId w:val="9"/>
         </w:numPr>
         <w:spacing w:after="0" w:afterAutospacing="0" w:before="240" w:lineRule="auto"/>
         <w:ind w:left="720" w:hanging="360"/>
@@ -2724,7 +3279,7 @@
       <w:pPr>
         <w:numPr>
           <w:ilvl w:val="0"/>
-          <w:numId w:val="8"/>
+          <w:numId w:val="9"/>
         </w:numPr>
         <w:spacing w:after="0" w:afterAutospacing="0" w:before="0" w:beforeAutospacing="0" w:lineRule="auto"/>
         <w:ind w:left="720" w:hanging="360"/>
@@ -2740,7 +3295,7 @@
       <w:pPr>
         <w:numPr>
           <w:ilvl w:val="0"/>
-          <w:numId w:val="8"/>
+          <w:numId w:val="9"/>
         </w:numPr>
         <w:spacing w:after="0" w:afterAutospacing="0" w:before="0" w:beforeAutospacing="0" w:lineRule="auto"/>
         <w:ind w:left="720" w:hanging="360"/>
@@ -2756,7 +3311,7 @@
       <w:pPr>
         <w:numPr>
           <w:ilvl w:val="0"/>
-          <w:numId w:val="8"/>
+          <w:numId w:val="9"/>
         </w:numPr>
         <w:spacing w:after="0" w:afterAutospacing="0" w:before="0" w:beforeAutospacing="0" w:lineRule="auto"/>
         <w:ind w:left="720" w:hanging="360"/>
@@ -2772,7 +3327,7 @@
       <w:pPr>
         <w:numPr>
           <w:ilvl w:val="0"/>
-          <w:numId w:val="8"/>
+          <w:numId w:val="9"/>
         </w:numPr>
         <w:spacing w:after="0" w:afterAutospacing="0" w:before="0" w:beforeAutospacing="0" w:lineRule="auto"/>
         <w:ind w:left="720" w:hanging="360"/>
@@ -2788,7 +3343,7 @@
       <w:pPr>
         <w:numPr>
           <w:ilvl w:val="0"/>
-          <w:numId w:val="8"/>
+          <w:numId w:val="9"/>
         </w:numPr>
         <w:spacing w:after="240" w:before="0" w:beforeAutospacing="0" w:lineRule="auto"/>
         <w:ind w:left="720" w:hanging="360"/>
@@ -2840,8 +3395,8 @@
           <w:szCs w:val="46"/>
         </w:rPr>
       </w:pPr>
-      <w:bookmarkStart w:colFirst="0" w:colLast="0" w:name="_hgin08l9ibcs" w:id="20"/>
-      <w:bookmarkEnd w:id="20"/>
+      <w:bookmarkStart w:colFirst="0" w:colLast="0" w:name="_hgin08l9ibcs" w:id="22"/>
+      <w:bookmarkEnd w:id="22"/>
       <w:r>
         <w:rPr>
           <w:b w:val="1"/>
@@ -2999,8 +3554,8 @@
           <w:szCs w:val="46"/>
         </w:rPr>
       </w:pPr>
-      <w:bookmarkStart w:colFirst="0" w:colLast="0" w:name="_kadl4seaitr6" w:id="21"/>
-      <w:bookmarkEnd w:id="21"/>
+      <w:bookmarkStart w:colFirst="0" w:colLast="0" w:name="_kadl4seaitr6" w:id="23"/>
+      <w:bookmarkEnd w:id="23"/>
       <w:r>
         <w:rPr>
           <w:b w:val="1"/>
@@ -3040,7 +3595,7 @@
       <w:pPr>
         <w:numPr>
           <w:ilvl w:val="0"/>
-          <w:numId w:val="16"/>
+          <w:numId w:val="18"/>
         </w:numPr>
         <w:spacing w:after="0" w:afterAutospacing="0" w:before="240" w:lineRule="auto"/>
         <w:ind w:left="720" w:hanging="360"/>
@@ -3056,7 +3611,7 @@
       <w:pPr>
         <w:numPr>
           <w:ilvl w:val="0"/>
-          <w:numId w:val="16"/>
+          <w:numId w:val="18"/>
         </w:numPr>
         <w:spacing w:after="0" w:afterAutospacing="0" w:before="0" w:beforeAutospacing="0" w:lineRule="auto"/>
         <w:ind w:left="720" w:hanging="360"/>
@@ -3072,7 +3627,7 @@
       <w:pPr>
         <w:numPr>
           <w:ilvl w:val="0"/>
-          <w:numId w:val="16"/>
+          <w:numId w:val="18"/>
         </w:numPr>
         <w:spacing w:after="0" w:afterAutospacing="0" w:before="0" w:beforeAutospacing="0" w:lineRule="auto"/>
         <w:ind w:left="720" w:hanging="360"/>
@@ -3088,7 +3643,7 @@
       <w:pPr>
         <w:numPr>
           <w:ilvl w:val="0"/>
-          <w:numId w:val="16"/>
+          <w:numId w:val="18"/>
         </w:numPr>
         <w:spacing w:after="240" w:before="0" w:beforeAutospacing="0" w:lineRule="auto"/>
         <w:ind w:left="720" w:hanging="360"/>
@@ -3140,8 +3695,8 @@
           <w:szCs w:val="46"/>
         </w:rPr>
       </w:pPr>
-      <w:bookmarkStart w:colFirst="0" w:colLast="0" w:name="_34l9e34puccl" w:id="22"/>
-      <w:bookmarkEnd w:id="22"/>
+      <w:bookmarkStart w:colFirst="0" w:colLast="0" w:name="_34l9e34puccl" w:id="24"/>
+      <w:bookmarkEnd w:id="24"/>
       <w:r>
         <w:rPr>
           <w:b w:val="1"/>
@@ -3169,7 +3724,7 @@
       <w:pPr>
         <w:numPr>
           <w:ilvl w:val="0"/>
-          <w:numId w:val="15"/>
+          <w:numId w:val="17"/>
         </w:numPr>
         <w:spacing w:after="0" w:afterAutospacing="0" w:before="240" w:lineRule="auto"/>
         <w:ind w:left="720" w:hanging="360"/>
@@ -3185,7 +3740,7 @@
       <w:pPr>
         <w:numPr>
           <w:ilvl w:val="0"/>
-          <w:numId w:val="15"/>
+          <w:numId w:val="17"/>
         </w:numPr>
         <w:spacing w:after="0" w:afterAutospacing="0" w:before="0" w:beforeAutospacing="0" w:lineRule="auto"/>
         <w:ind w:left="720" w:hanging="360"/>
@@ -3201,7 +3756,7 @@
       <w:pPr>
         <w:numPr>
           <w:ilvl w:val="0"/>
-          <w:numId w:val="15"/>
+          <w:numId w:val="17"/>
         </w:numPr>
         <w:spacing w:after="0" w:afterAutospacing="0" w:before="0" w:beforeAutospacing="0" w:lineRule="auto"/>
         <w:ind w:left="720" w:hanging="360"/>
@@ -3217,7 +3772,7 @@
       <w:pPr>
         <w:numPr>
           <w:ilvl w:val="0"/>
-          <w:numId w:val="15"/>
+          <w:numId w:val="17"/>
         </w:numPr>
         <w:spacing w:after="0" w:afterAutospacing="0" w:before="0" w:beforeAutospacing="0" w:lineRule="auto"/>
         <w:ind w:left="720" w:hanging="360"/>
@@ -3233,7 +3788,7 @@
       <w:pPr>
         <w:numPr>
           <w:ilvl w:val="0"/>
-          <w:numId w:val="15"/>
+          <w:numId w:val="17"/>
         </w:numPr>
         <w:spacing w:after="240" w:before="0" w:beforeAutospacing="0" w:lineRule="auto"/>
         <w:ind w:left="720" w:hanging="360"/>
@@ -3273,8 +3828,8 @@
           <w:szCs w:val="46"/>
         </w:rPr>
       </w:pPr>
-      <w:bookmarkStart w:colFirst="0" w:colLast="0" w:name="_jlkomerib4ly" w:id="23"/>
-      <w:bookmarkEnd w:id="23"/>
+      <w:bookmarkStart w:colFirst="0" w:colLast="0" w:name="_jlkomerib4ly" w:id="25"/>
+      <w:bookmarkEnd w:id="25"/>
       <w:r>
         <w:rPr>
           <w:b w:val="1"/>
@@ -3391,8 +3946,8 @@
           <w:szCs w:val="46"/>
         </w:rPr>
       </w:pPr>
-      <w:bookmarkStart w:colFirst="0" w:colLast="0" w:name="_6lfbcjgkeeok" w:id="24"/>
-      <w:bookmarkEnd w:id="24"/>
+      <w:bookmarkStart w:colFirst="0" w:colLast="0" w:name="_6lfbcjgkeeok" w:id="26"/>
+      <w:bookmarkEnd w:id="26"/>
       <w:r>
         <w:rPr>
           <w:b w:val="1"/>
@@ -3468,8 +4023,8 @@
           <w:szCs w:val="46"/>
         </w:rPr>
       </w:pPr>
-      <w:bookmarkStart w:colFirst="0" w:colLast="0" w:name="_bt0u3esnco0d" w:id="25"/>
-      <w:bookmarkEnd w:id="25"/>
+      <w:bookmarkStart w:colFirst="0" w:colLast="0" w:name="_bt0u3esnco0d" w:id="27"/>
+      <w:bookmarkEnd w:id="27"/>
       <w:r>
         <w:rPr>
           <w:b w:val="1"/>
@@ -3530,6 +4085,7 @@
       </w:r>
     </w:p>
     <w:sectPr>
+      <w:headerReference r:id="rId6" w:type="default"/>
       <w:pgSz w:h="16834" w:w="11909" w:orient="portrait"/>
       <w:pgMar w:bottom="1440" w:top="1440" w:left="1440" w:right="1440" w:header="720" w:footer="720"/>
       <w:pgNumType w:start="1"/>
@@ -3538,6 +4094,21 @@
 </w:document>
 </file>
 
+<file path=word/header1.xml><?xml version="1.0" encoding="utf-8"?>
+<w:hdr xmlns:mc="http://schemas.openxmlformats.org/markup-compatibility/2006" xmlns:o="urn:schemas-microsoft-com:office:office" xmlns:r="http://schemas.openxmlformats.org/officeDocument/2006/relationships" xmlns:m="http://schemas.openxmlformats.org/officeDocument/2006/math" xmlns:v="urn:schemas-microsoft-com:vml" xmlns:wp="http://schemas.openxmlformats.org/drawingml/2006/wordprocessingDrawing" xmlns:w10="urn:schemas-microsoft-com:office:word" xmlns:w="http://schemas.openxmlformats.org/wordprocessingml/2006/main" xmlns:wne="http://schemas.microsoft.com/office/word/2006/wordml" xmlns:sl="http://schemas.openxmlformats.org/schemaLibrary/2006/main" xmlns:a="http://schemas.openxmlformats.org/drawingml/2006/main" xmlns:pic="http://schemas.openxmlformats.org/drawingml/2006/picture" xmlns:c="http://schemas.openxmlformats.org/drawingml/2006/chart" xmlns:lc="http://schemas.openxmlformats.org/drawingml/2006/lockedCanvas" xmlns:dgm="http://schemas.openxmlformats.org/drawingml/2006/diagram" xmlns:wps="http://schemas.microsoft.com/office/word/2010/wordprocessingShape" xmlns:wpg="http://schemas.microsoft.com/office/word/2010/wordprocessingGroup" xmlns:w14="http://schemas.microsoft.com/office/word/2010/wordml" xmlns:w15="http://schemas.microsoft.com/office/word/2012/wordml" xmlns:w16="http://schemas.microsoft.com/office/word/2018/wordml" xmlns:w16cex="http://schemas.microsoft.com/office/word/2018/wordml/cex" xmlns:w16cid="http://schemas.microsoft.com/office/word/2016/wordml/cid" xmlns="http://schemas.microsoft.com/office/tasks/2019/documenttasks" xmlns:cr="http://schemas.microsoft.com/office/comments/2020/reactions">
+  <w:p>
+    <w:pPr>
+      <w:rPr/>
+    </w:pPr>
+    <w:r>
+      <w:rPr>
+        <w:rtl w:val="0"/>
+      </w:rPr>
+    </w:r>
+  </w:p>
+</w:hdr>
+</file>
+
 <file path=word/numbering.xml><?xml version="1.0" encoding="utf-8"?>
 <w:numbering xmlns:mc="http://schemas.openxmlformats.org/markup-compatibility/2006" xmlns:o="urn:schemas-microsoft-com:office:office" xmlns:r="http://schemas.openxmlformats.org/officeDocument/2006/relationships" xmlns:m="http://schemas.openxmlformats.org/officeDocument/2006/math" xmlns:v="urn:schemas-microsoft-com:vml" xmlns:wp="http://schemas.openxmlformats.org/drawingml/2006/wordprocessingDrawing" xmlns:w10="urn:schemas-microsoft-com:office:word" xmlns:w="http://schemas.openxmlformats.org/wordprocessingml/2006/main" xmlns:wne="http://schemas.microsoft.com/office/word/2006/wordml" xmlns:sl="http://schemas.openxmlformats.org/schemaLibrary/2006/main" xmlns:a="http://schemas.openxmlformats.org/drawingml/2006/main" xmlns:pic="http://schemas.openxmlformats.org/drawingml/2006/picture" xmlns:c="http://schemas.openxmlformats.org/drawingml/2006/chart" xmlns:lc="http://schemas.openxmlformats.org/drawingml/2006/lockedCanvas" xmlns:dgm="http://schemas.openxmlformats.org/drawingml/2006/diagram" xmlns:wps="http://schemas.microsoft.com/office/word/2010/wordprocessingShape" xmlns:wpg="http://schemas.microsoft.com/office/word/2010/wordprocessingGroup" xmlns:w14="http://schemas.microsoft.com/office/word/2010/wordml" xmlns:w15="http://schemas.microsoft.com/office/word/2012/wordml" xmlns:w16="http://schemas.microsoft.com/office/word/2018/wordml" xmlns:w16cex="http://schemas.microsoft.com/office/word/2018/wordml/cex" xmlns:w16cid="http://schemas.microsoft.com/office/word/2016/wordml/cid" xmlns="http://schemas.microsoft.com/office/tasks/2019/documenttasks" xmlns:cr="http://schemas.microsoft.com/office/comments/2020/reactions">
   <w:abstractNum w:abstractNumId="1">
@@ -5521,6 +6092,336 @@
     </w:lvl>
   </w:abstractNum>
   <w:abstractNum w:abstractNumId="19">
+    <w:lvl w:ilvl="0">
+      <w:start w:val="1"/>
+      <w:numFmt w:val="bullet"/>
+      <w:lvlText w:val="●"/>
+      <w:lvlJc w:val="left"/>
+      <w:pPr>
+        <w:ind w:left="720" w:hanging="360"/>
+      </w:pPr>
+      <w:rPr>
+        <w:u w:val="none"/>
+      </w:rPr>
+    </w:lvl>
+    <w:lvl w:ilvl="1">
+      <w:start w:val="1"/>
+      <w:numFmt w:val="bullet"/>
+      <w:lvlText w:val="○"/>
+      <w:lvlJc w:val="left"/>
+      <w:pPr>
+        <w:ind w:left="1440" w:hanging="360"/>
+      </w:pPr>
+      <w:rPr>
+        <w:u w:val="none"/>
+      </w:rPr>
+    </w:lvl>
+    <w:lvl w:ilvl="2">
+      <w:start w:val="1"/>
+      <w:numFmt w:val="bullet"/>
+      <w:lvlText w:val="■"/>
+      <w:lvlJc w:val="left"/>
+      <w:pPr>
+        <w:ind w:left="2160" w:hanging="360"/>
+      </w:pPr>
+      <w:rPr>
+        <w:u w:val="none"/>
+      </w:rPr>
+    </w:lvl>
+    <w:lvl w:ilvl="3">
+      <w:start w:val="1"/>
+      <w:numFmt w:val="bullet"/>
+      <w:lvlText w:val="●"/>
+      <w:lvlJc w:val="left"/>
+      <w:pPr>
+        <w:ind w:left="2880" w:hanging="360"/>
+      </w:pPr>
+      <w:rPr>
+        <w:u w:val="none"/>
+      </w:rPr>
+    </w:lvl>
+    <w:lvl w:ilvl="4">
+      <w:start w:val="1"/>
+      <w:numFmt w:val="bullet"/>
+      <w:lvlText w:val="○"/>
+      <w:lvlJc w:val="left"/>
+      <w:pPr>
+        <w:ind w:left="3600" w:hanging="360"/>
+      </w:pPr>
+      <w:rPr>
+        <w:u w:val="none"/>
+      </w:rPr>
+    </w:lvl>
+    <w:lvl w:ilvl="5">
+      <w:start w:val="1"/>
+      <w:numFmt w:val="bullet"/>
+      <w:lvlText w:val="■"/>
+      <w:lvlJc w:val="left"/>
+      <w:pPr>
+        <w:ind w:left="4320" w:hanging="360"/>
+      </w:pPr>
+      <w:rPr>
+        <w:u w:val="none"/>
+      </w:rPr>
+    </w:lvl>
+    <w:lvl w:ilvl="6">
+      <w:start w:val="1"/>
+      <w:numFmt w:val="bullet"/>
+      <w:lvlText w:val="●"/>
+      <w:lvlJc w:val="left"/>
+      <w:pPr>
+        <w:ind w:left="5040" w:hanging="360"/>
+      </w:pPr>
+      <w:rPr>
+        <w:u w:val="none"/>
+      </w:rPr>
+    </w:lvl>
+    <w:lvl w:ilvl="7">
+      <w:start w:val="1"/>
+      <w:numFmt w:val="bullet"/>
+      <w:lvlText w:val="○"/>
+      <w:lvlJc w:val="left"/>
+      <w:pPr>
+        <w:ind w:left="5760" w:hanging="360"/>
+      </w:pPr>
+      <w:rPr>
+        <w:u w:val="none"/>
+      </w:rPr>
+    </w:lvl>
+    <w:lvl w:ilvl="8">
+      <w:start w:val="1"/>
+      <w:numFmt w:val="bullet"/>
+      <w:lvlText w:val="■"/>
+      <w:lvlJc w:val="left"/>
+      <w:pPr>
+        <w:ind w:left="6480" w:hanging="360"/>
+      </w:pPr>
+      <w:rPr>
+        <w:u w:val="none"/>
+      </w:rPr>
+    </w:lvl>
+  </w:abstractNum>
+  <w:abstractNum w:abstractNumId="20">
+    <w:lvl w:ilvl="0">
+      <w:start w:val="1"/>
+      <w:numFmt w:val="bullet"/>
+      <w:lvlText w:val="●"/>
+      <w:lvlJc w:val="left"/>
+      <w:pPr>
+        <w:ind w:left="720" w:hanging="360"/>
+      </w:pPr>
+      <w:rPr>
+        <w:u w:val="none"/>
+      </w:rPr>
+    </w:lvl>
+    <w:lvl w:ilvl="1">
+      <w:start w:val="1"/>
+      <w:numFmt w:val="bullet"/>
+      <w:lvlText w:val="○"/>
+      <w:lvlJc w:val="left"/>
+      <w:pPr>
+        <w:ind w:left="1440" w:hanging="360"/>
+      </w:pPr>
+      <w:rPr>
+        <w:u w:val="none"/>
+      </w:rPr>
+    </w:lvl>
+    <w:lvl w:ilvl="2">
+      <w:start w:val="1"/>
+      <w:numFmt w:val="bullet"/>
+      <w:lvlText w:val="■"/>
+      <w:lvlJc w:val="left"/>
+      <w:pPr>
+        <w:ind w:left="2160" w:hanging="360"/>
+      </w:pPr>
+      <w:rPr>
+        <w:u w:val="none"/>
+      </w:rPr>
+    </w:lvl>
+    <w:lvl w:ilvl="3">
+      <w:start w:val="1"/>
+      <w:numFmt w:val="bullet"/>
+      <w:lvlText w:val="●"/>
+      <w:lvlJc w:val="left"/>
+      <w:pPr>
+        <w:ind w:left="2880" w:hanging="360"/>
+      </w:pPr>
+      <w:rPr>
+        <w:u w:val="none"/>
+      </w:rPr>
+    </w:lvl>
+    <w:lvl w:ilvl="4">
+      <w:start w:val="1"/>
+      <w:numFmt w:val="bullet"/>
+      <w:lvlText w:val="○"/>
+      <w:lvlJc w:val="left"/>
+      <w:pPr>
+        <w:ind w:left="3600" w:hanging="360"/>
+      </w:pPr>
+      <w:rPr>
+        <w:u w:val="none"/>
+      </w:rPr>
+    </w:lvl>
+    <w:lvl w:ilvl="5">
+      <w:start w:val="1"/>
+      <w:numFmt w:val="bullet"/>
+      <w:lvlText w:val="■"/>
+      <w:lvlJc w:val="left"/>
+      <w:pPr>
+        <w:ind w:left="4320" w:hanging="360"/>
+      </w:pPr>
+      <w:rPr>
+        <w:u w:val="none"/>
+      </w:rPr>
+    </w:lvl>
+    <w:lvl w:ilvl="6">
+      <w:start w:val="1"/>
+      <w:numFmt w:val="bullet"/>
+      <w:lvlText w:val="●"/>
+      <w:lvlJc w:val="left"/>
+      <w:pPr>
+        <w:ind w:left="5040" w:hanging="360"/>
+      </w:pPr>
+      <w:rPr>
+        <w:u w:val="none"/>
+      </w:rPr>
+    </w:lvl>
+    <w:lvl w:ilvl="7">
+      <w:start w:val="1"/>
+      <w:numFmt w:val="bullet"/>
+      <w:lvlText w:val="○"/>
+      <w:lvlJc w:val="left"/>
+      <w:pPr>
+        <w:ind w:left="5760" w:hanging="360"/>
+      </w:pPr>
+      <w:rPr>
+        <w:u w:val="none"/>
+      </w:rPr>
+    </w:lvl>
+    <w:lvl w:ilvl="8">
+      <w:start w:val="1"/>
+      <w:numFmt w:val="bullet"/>
+      <w:lvlText w:val="■"/>
+      <w:lvlJc w:val="left"/>
+      <w:pPr>
+        <w:ind w:left="6480" w:hanging="360"/>
+      </w:pPr>
+      <w:rPr>
+        <w:u w:val="none"/>
+      </w:rPr>
+    </w:lvl>
+  </w:abstractNum>
+  <w:abstractNum w:abstractNumId="21">
+    <w:lvl w:ilvl="0">
+      <w:start w:val="1"/>
+      <w:numFmt w:val="bullet"/>
+      <w:lvlText w:val="●"/>
+      <w:lvlJc w:val="left"/>
+      <w:pPr>
+        <w:ind w:left="720" w:hanging="360"/>
+      </w:pPr>
+      <w:rPr>
+        <w:u w:val="none"/>
+      </w:rPr>
+    </w:lvl>
+    <w:lvl w:ilvl="1">
+      <w:start w:val="1"/>
+      <w:numFmt w:val="bullet"/>
+      <w:lvlText w:val="○"/>
+      <w:lvlJc w:val="left"/>
+      <w:pPr>
+        <w:ind w:left="1440" w:hanging="360"/>
+      </w:pPr>
+      <w:rPr>
+        <w:u w:val="none"/>
+      </w:rPr>
+    </w:lvl>
+    <w:lvl w:ilvl="2">
+      <w:start w:val="1"/>
+      <w:numFmt w:val="bullet"/>
+      <w:lvlText w:val="■"/>
+      <w:lvlJc w:val="left"/>
+      <w:pPr>
+        <w:ind w:left="2160" w:hanging="360"/>
+      </w:pPr>
+      <w:rPr>
+        <w:u w:val="none"/>
+      </w:rPr>
+    </w:lvl>
+    <w:lvl w:ilvl="3">
+      <w:start w:val="1"/>
+      <w:numFmt w:val="bullet"/>
+      <w:lvlText w:val="●"/>
+      <w:lvlJc w:val="left"/>
+      <w:pPr>
+        <w:ind w:left="2880" w:hanging="360"/>
+      </w:pPr>
+      <w:rPr>
+        <w:u w:val="none"/>
+      </w:rPr>
+    </w:lvl>
+    <w:lvl w:ilvl="4">
+      <w:start w:val="1"/>
+      <w:numFmt w:val="bullet"/>
+      <w:lvlText w:val="○"/>
+      <w:lvlJc w:val="left"/>
+      <w:pPr>
+        <w:ind w:left="3600" w:hanging="360"/>
+      </w:pPr>
+      <w:rPr>
+        <w:u w:val="none"/>
+      </w:rPr>
+    </w:lvl>
+    <w:lvl w:ilvl="5">
+      <w:start w:val="1"/>
+      <w:numFmt w:val="bullet"/>
+      <w:lvlText w:val="■"/>
+      <w:lvlJc w:val="left"/>
+      <w:pPr>
+        <w:ind w:left="4320" w:hanging="360"/>
+      </w:pPr>
+      <w:rPr>
+        <w:u w:val="none"/>
+      </w:rPr>
+    </w:lvl>
+    <w:lvl w:ilvl="6">
+      <w:start w:val="1"/>
+      <w:numFmt w:val="bullet"/>
+      <w:lvlText w:val="●"/>
+      <w:lvlJc w:val="left"/>
+      <w:pPr>
+        <w:ind w:left="5040" w:hanging="360"/>
+      </w:pPr>
+      <w:rPr>
+        <w:u w:val="none"/>
+      </w:rPr>
+    </w:lvl>
+    <w:lvl w:ilvl="7">
+      <w:start w:val="1"/>
+      <w:numFmt w:val="bullet"/>
+      <w:lvlText w:val="○"/>
+      <w:lvlJc w:val="left"/>
+      <w:pPr>
+        <w:ind w:left="5760" w:hanging="360"/>
+      </w:pPr>
+      <w:rPr>
+        <w:u w:val="none"/>
+      </w:rPr>
+    </w:lvl>
+    <w:lvl w:ilvl="8">
+      <w:start w:val="1"/>
+      <w:numFmt w:val="bullet"/>
+      <w:lvlText w:val="■"/>
+      <w:lvlJc w:val="left"/>
+      <w:pPr>
+        <w:ind w:left="6480" w:hanging="360"/>
+      </w:pPr>
+      <w:rPr>
+        <w:u w:val="none"/>
+      </w:rPr>
+    </w:lvl>
+  </w:abstractNum>
+  <w:abstractNum w:abstractNumId="22">
     <w:lvl w:ilvl="0">
       <w:start w:val="1"/>
       <w:numFmt w:val="bullet"/>
@@ -5686,6 +6587,15 @@
   </w:num>
   <w:num w:numId="19">
     <w:abstractNumId w:val="19"/>
+  </w:num>
+  <w:num w:numId="20">
+    <w:abstractNumId w:val="20"/>
+  </w:num>
+  <w:num w:numId="21">
+    <w:abstractNumId w:val="21"/>
+  </w:num>
+  <w:num w:numId="22">
+    <w:abstractNumId w:val="22"/>
   </w:num>
 </w:numbering>
 </file>

</xml_diff>

<commit_message>
docs: define execution capability and execution domain model
</commit_message>
<xml_diff>
--- a/docs/DOC-017 — Proceso de Desarrollo Asistido por Inteligencia Artificial.docx
+++ b/docs/DOC-017 — Proceso de Desarrollo Asistido por Inteligencia Artificial.docx
@@ -99,7 +99,7 @@
       <w:pPr>
         <w:numPr>
           <w:ilvl w:val="0"/>
-          <w:numId w:val="19"/>
+          <w:numId w:val="21"/>
         </w:numPr>
         <w:spacing w:after="0" w:afterAutospacing="0" w:before="240" w:lineRule="auto"/>
         <w:ind w:left="720" w:hanging="360"/>
@@ -123,7 +123,7 @@
       <w:pPr>
         <w:numPr>
           <w:ilvl w:val="0"/>
-          <w:numId w:val="19"/>
+          <w:numId w:val="21"/>
         </w:numPr>
         <w:spacing w:after="0" w:afterAutospacing="0" w:before="0" w:beforeAutospacing="0" w:lineRule="auto"/>
         <w:ind w:left="720" w:hanging="360"/>
@@ -147,7 +147,7 @@
       <w:pPr>
         <w:numPr>
           <w:ilvl w:val="0"/>
-          <w:numId w:val="19"/>
+          <w:numId w:val="21"/>
         </w:numPr>
         <w:spacing w:after="0" w:afterAutospacing="0" w:before="0" w:beforeAutospacing="0" w:lineRule="auto"/>
         <w:ind w:left="720" w:hanging="360"/>
@@ -171,7 +171,7 @@
       <w:pPr>
         <w:numPr>
           <w:ilvl w:val="0"/>
-          <w:numId w:val="19"/>
+          <w:numId w:val="21"/>
         </w:numPr>
         <w:spacing w:after="0" w:afterAutospacing="0" w:before="0" w:beforeAutospacing="0" w:lineRule="auto"/>
         <w:ind w:left="720" w:hanging="360"/>
@@ -195,7 +195,7 @@
       <w:pPr>
         <w:numPr>
           <w:ilvl w:val="0"/>
-          <w:numId w:val="19"/>
+          <w:numId w:val="21"/>
         </w:numPr>
         <w:spacing w:after="0" w:afterAutospacing="0" w:before="0" w:beforeAutospacing="0" w:lineRule="auto"/>
         <w:ind w:left="720" w:hanging="360"/>
@@ -219,7 +219,7 @@
       <w:pPr>
         <w:numPr>
           <w:ilvl w:val="0"/>
-          <w:numId w:val="19"/>
+          <w:numId w:val="21"/>
         </w:numPr>
         <w:spacing w:after="0" w:afterAutospacing="0" w:before="0" w:beforeAutospacing="0" w:lineRule="auto"/>
         <w:ind w:left="720" w:hanging="360"/>
@@ -237,7 +237,7 @@
       <w:pPr>
         <w:numPr>
           <w:ilvl w:val="1"/>
-          <w:numId w:val="19"/>
+          <w:numId w:val="21"/>
         </w:numPr>
         <w:spacing w:after="0" w:afterAutospacing="0" w:before="0" w:beforeAutospacing="0" w:lineRule="auto"/>
         <w:ind w:left="1440" w:hanging="360"/>
@@ -253,7 +253,7 @@
       <w:pPr>
         <w:numPr>
           <w:ilvl w:val="1"/>
-          <w:numId w:val="19"/>
+          <w:numId w:val="21"/>
         </w:numPr>
         <w:spacing w:after="0" w:afterAutospacing="0" w:before="0" w:beforeAutospacing="0" w:lineRule="auto"/>
         <w:ind w:left="1440" w:hanging="360"/>
@@ -269,7 +269,7 @@
       <w:pPr>
         <w:numPr>
           <w:ilvl w:val="1"/>
-          <w:numId w:val="19"/>
+          <w:numId w:val="21"/>
         </w:numPr>
         <w:spacing w:after="0" w:afterAutospacing="0" w:before="0" w:beforeAutospacing="0" w:lineRule="auto"/>
         <w:ind w:left="1440" w:hanging="360"/>
@@ -285,7 +285,7 @@
       <w:pPr>
         <w:numPr>
           <w:ilvl w:val="1"/>
-          <w:numId w:val="19"/>
+          <w:numId w:val="21"/>
         </w:numPr>
         <w:spacing w:after="0" w:afterAutospacing="0" w:before="0" w:beforeAutospacing="0" w:lineRule="auto"/>
         <w:ind w:left="1440" w:hanging="360"/>
@@ -301,7 +301,7 @@
       <w:pPr>
         <w:numPr>
           <w:ilvl w:val="1"/>
-          <w:numId w:val="19"/>
+          <w:numId w:val="21"/>
         </w:numPr>
         <w:spacing w:after="240" w:before="0" w:beforeAutospacing="0" w:lineRule="auto"/>
         <w:ind w:left="1440" w:hanging="360"/>
@@ -435,7 +435,7 @@
       <w:pPr>
         <w:numPr>
           <w:ilvl w:val="0"/>
-          <w:numId w:val="16"/>
+          <w:numId w:val="17"/>
         </w:numPr>
         <w:spacing w:after="0" w:afterAutospacing="0" w:before="240" w:lineRule="auto"/>
         <w:ind w:left="720" w:hanging="360"/>
@@ -451,7 +451,7 @@
       <w:pPr>
         <w:numPr>
           <w:ilvl w:val="0"/>
-          <w:numId w:val="16"/>
+          <w:numId w:val="17"/>
         </w:numPr>
         <w:spacing w:after="0" w:afterAutospacing="0" w:before="0" w:beforeAutospacing="0" w:lineRule="auto"/>
         <w:ind w:left="720" w:hanging="360"/>
@@ -467,7 +467,7 @@
       <w:pPr>
         <w:numPr>
           <w:ilvl w:val="0"/>
-          <w:numId w:val="16"/>
+          <w:numId w:val="17"/>
         </w:numPr>
         <w:spacing w:after="0" w:afterAutospacing="0" w:before="0" w:beforeAutospacing="0" w:lineRule="auto"/>
         <w:ind w:left="720" w:hanging="360"/>
@@ -483,7 +483,7 @@
       <w:pPr>
         <w:numPr>
           <w:ilvl w:val="0"/>
-          <w:numId w:val="16"/>
+          <w:numId w:val="17"/>
         </w:numPr>
         <w:spacing w:after="0" w:afterAutospacing="0" w:before="0" w:beforeAutospacing="0" w:lineRule="auto"/>
         <w:ind w:left="720" w:hanging="360"/>
@@ -499,7 +499,7 @@
       <w:pPr>
         <w:numPr>
           <w:ilvl w:val="0"/>
-          <w:numId w:val="16"/>
+          <w:numId w:val="17"/>
         </w:numPr>
         <w:spacing w:after="0" w:afterAutospacing="0" w:before="0" w:beforeAutospacing="0" w:lineRule="auto"/>
         <w:ind w:left="720" w:hanging="360"/>
@@ -515,7 +515,7 @@
       <w:pPr>
         <w:numPr>
           <w:ilvl w:val="0"/>
-          <w:numId w:val="16"/>
+          <w:numId w:val="17"/>
         </w:numPr>
         <w:spacing w:after="0" w:afterAutospacing="0" w:before="0" w:beforeAutospacing="0" w:lineRule="auto"/>
         <w:ind w:left="720" w:hanging="360"/>
@@ -534,7 +534,7 @@
       <w:pPr>
         <w:numPr>
           <w:ilvl w:val="0"/>
-          <w:numId w:val="16"/>
+          <w:numId w:val="17"/>
         </w:numPr>
         <w:spacing w:after="240" w:before="0" w:beforeAutospacing="0" w:lineRule="auto"/>
         <w:ind w:left="720" w:hanging="360"/>
@@ -604,7 +604,7 @@
       <w:pPr>
         <w:numPr>
           <w:ilvl w:val="0"/>
-          <w:numId w:val="7"/>
+          <w:numId w:val="8"/>
         </w:numPr>
         <w:spacing w:after="0" w:afterAutospacing="0" w:before="240" w:lineRule="auto"/>
         <w:ind w:left="720" w:hanging="360"/>
@@ -620,7 +620,7 @@
       <w:pPr>
         <w:numPr>
           <w:ilvl w:val="0"/>
-          <w:numId w:val="7"/>
+          <w:numId w:val="8"/>
         </w:numPr>
         <w:spacing w:after="0" w:afterAutospacing="0" w:before="0" w:beforeAutospacing="0" w:lineRule="auto"/>
         <w:ind w:left="720" w:hanging="360"/>
@@ -636,7 +636,7 @@
       <w:pPr>
         <w:numPr>
           <w:ilvl w:val="0"/>
-          <w:numId w:val="7"/>
+          <w:numId w:val="8"/>
         </w:numPr>
         <w:spacing w:after="0" w:afterAutospacing="0" w:before="0" w:beforeAutospacing="0" w:lineRule="auto"/>
         <w:ind w:left="720" w:hanging="360"/>
@@ -652,7 +652,7 @@
       <w:pPr>
         <w:numPr>
           <w:ilvl w:val="0"/>
-          <w:numId w:val="7"/>
+          <w:numId w:val="8"/>
         </w:numPr>
         <w:spacing w:after="240" w:before="0" w:beforeAutospacing="0" w:lineRule="auto"/>
         <w:ind w:left="720" w:hanging="360"/>
@@ -741,7 +741,7 @@
       <w:pPr>
         <w:numPr>
           <w:ilvl w:val="0"/>
-          <w:numId w:val="13"/>
+          <w:numId w:val="14"/>
         </w:numPr>
         <w:spacing w:after="0" w:afterAutospacing="0" w:before="240" w:lineRule="auto"/>
         <w:ind w:left="720" w:hanging="360"/>
@@ -757,7 +757,7 @@
       <w:pPr>
         <w:numPr>
           <w:ilvl w:val="0"/>
-          <w:numId w:val="13"/>
+          <w:numId w:val="14"/>
         </w:numPr>
         <w:spacing w:after="0" w:afterAutospacing="0" w:before="0" w:beforeAutospacing="0" w:lineRule="auto"/>
         <w:ind w:left="720" w:hanging="360"/>
@@ -773,7 +773,7 @@
       <w:pPr>
         <w:numPr>
           <w:ilvl w:val="0"/>
-          <w:numId w:val="13"/>
+          <w:numId w:val="14"/>
         </w:numPr>
         <w:spacing w:after="0" w:afterAutospacing="0" w:before="0" w:beforeAutospacing="0" w:lineRule="auto"/>
         <w:ind w:left="720" w:hanging="360"/>
@@ -789,7 +789,7 @@
       <w:pPr>
         <w:numPr>
           <w:ilvl w:val="0"/>
-          <w:numId w:val="13"/>
+          <w:numId w:val="14"/>
         </w:numPr>
         <w:spacing w:after="240" w:before="0" w:beforeAutospacing="0" w:lineRule="auto"/>
         <w:ind w:left="720" w:hanging="360"/>
@@ -933,6 +933,34 @@
     </w:p>
     <w:p>
       <w:pPr>
+        <w:keepNext w:val="0"/>
+        <w:keepLines w:val="0"/>
+        <w:spacing w:after="240" w:before="240" w:lineRule="auto"/>
+        <w:rPr/>
+      </w:pPr>
+      <w:r>
+        <w:rPr>
+          <w:rtl w:val="0"/>
+        </w:rPr>
+        <w:t xml:space="preserve">Cada rol deberá producir únicamente los entregables propios de su responsabilidad.</w:t>
+      </w:r>
+    </w:p>
+    <w:p>
+      <w:pPr>
+        <w:keepNext w:val="0"/>
+        <w:keepLines w:val="0"/>
+        <w:spacing w:after="240" w:before="240" w:lineRule="auto"/>
+        <w:rPr/>
+      </w:pPr>
+      <w:r>
+        <w:rPr>
+          <w:rtl w:val="0"/>
+        </w:rPr>
+        <w:t xml:space="preserve">Ningún participante deberá asumir responsabilidades pertenecientes a otro rol salvo autorización expresa del Director del Proyecto.</w:t>
+      </w:r>
+    </w:p>
+    <w:p>
+      <w:pPr>
         <w:pStyle w:val="Heading2"/>
         <w:keepNext w:val="0"/>
         <w:keepLines w:val="0"/>
@@ -973,7 +1001,7 @@
       <w:pPr>
         <w:numPr>
           <w:ilvl w:val="0"/>
-          <w:numId w:val="15"/>
+          <w:numId w:val="16"/>
         </w:numPr>
         <w:spacing w:after="0" w:afterAutospacing="0" w:before="240" w:lineRule="auto"/>
         <w:ind w:left="720" w:hanging="360"/>
@@ -989,7 +1017,7 @@
       <w:pPr>
         <w:numPr>
           <w:ilvl w:val="0"/>
-          <w:numId w:val="15"/>
+          <w:numId w:val="16"/>
         </w:numPr>
         <w:spacing w:after="0" w:afterAutospacing="0" w:before="0" w:beforeAutospacing="0" w:lineRule="auto"/>
         <w:ind w:left="720" w:hanging="360"/>
@@ -1005,7 +1033,7 @@
       <w:pPr>
         <w:numPr>
           <w:ilvl w:val="0"/>
-          <w:numId w:val="15"/>
+          <w:numId w:val="16"/>
         </w:numPr>
         <w:spacing w:after="0" w:afterAutospacing="0" w:before="0" w:beforeAutospacing="0" w:lineRule="auto"/>
         <w:ind w:left="720" w:hanging="360"/>
@@ -1021,7 +1049,7 @@
       <w:pPr>
         <w:numPr>
           <w:ilvl w:val="0"/>
-          <w:numId w:val="15"/>
+          <w:numId w:val="16"/>
         </w:numPr>
         <w:spacing w:after="0" w:afterAutospacing="0" w:before="0" w:beforeAutospacing="0" w:lineRule="auto"/>
         <w:ind w:left="720" w:hanging="360"/>
@@ -1037,7 +1065,7 @@
       <w:pPr>
         <w:numPr>
           <w:ilvl w:val="0"/>
-          <w:numId w:val="15"/>
+          <w:numId w:val="16"/>
         </w:numPr>
         <w:spacing w:after="240" w:before="0" w:beforeAutospacing="0" w:lineRule="auto"/>
         <w:ind w:left="720" w:hanging="360"/>
@@ -1068,7 +1096,7 @@
       <w:pPr>
         <w:numPr>
           <w:ilvl w:val="0"/>
-          <w:numId w:val="10"/>
+          <w:numId w:val="11"/>
         </w:numPr>
         <w:spacing w:after="0" w:afterAutospacing="0" w:before="240" w:lineRule="auto"/>
         <w:ind w:left="720" w:hanging="360"/>
@@ -1084,7 +1112,7 @@
       <w:pPr>
         <w:numPr>
           <w:ilvl w:val="0"/>
-          <w:numId w:val="10"/>
+          <w:numId w:val="11"/>
         </w:numPr>
         <w:spacing w:after="0" w:afterAutospacing="0" w:before="0" w:beforeAutospacing="0" w:lineRule="auto"/>
         <w:ind w:left="720" w:hanging="360"/>
@@ -1100,7 +1128,7 @@
       <w:pPr>
         <w:numPr>
           <w:ilvl w:val="0"/>
-          <w:numId w:val="10"/>
+          <w:numId w:val="11"/>
         </w:numPr>
         <w:spacing w:after="240" w:before="0" w:beforeAutospacing="0" w:lineRule="auto"/>
         <w:ind w:left="720" w:hanging="360"/>
@@ -1204,7 +1232,7 @@
       <w:pPr>
         <w:numPr>
           <w:ilvl w:val="0"/>
-          <w:numId w:val="21"/>
+          <w:numId w:val="23"/>
         </w:numPr>
         <w:spacing w:after="0" w:afterAutospacing="0" w:before="240" w:lineRule="auto"/>
         <w:ind w:left="720" w:hanging="360"/>
@@ -1220,7 +1248,7 @@
       <w:pPr>
         <w:numPr>
           <w:ilvl w:val="0"/>
-          <w:numId w:val="21"/>
+          <w:numId w:val="23"/>
         </w:numPr>
         <w:spacing w:after="0" w:afterAutospacing="0" w:before="0" w:beforeAutospacing="0" w:lineRule="auto"/>
         <w:ind w:left="720" w:hanging="360"/>
@@ -1236,7 +1264,7 @@
       <w:pPr>
         <w:numPr>
           <w:ilvl w:val="0"/>
-          <w:numId w:val="21"/>
+          <w:numId w:val="23"/>
         </w:numPr>
         <w:spacing w:after="0" w:afterAutospacing="0" w:before="0" w:beforeAutospacing="0" w:lineRule="auto"/>
         <w:ind w:left="720" w:hanging="360"/>
@@ -1252,7 +1280,7 @@
       <w:pPr>
         <w:numPr>
           <w:ilvl w:val="0"/>
-          <w:numId w:val="21"/>
+          <w:numId w:val="23"/>
         </w:numPr>
         <w:spacing w:after="240" w:before="0" w:beforeAutospacing="0" w:lineRule="auto"/>
         <w:ind w:left="720" w:hanging="360"/>
@@ -1650,7 +1678,7 @@
       <w:pPr>
         <w:numPr>
           <w:ilvl w:val="0"/>
-          <w:numId w:val="11"/>
+          <w:numId w:val="12"/>
         </w:numPr>
         <w:spacing w:after="0" w:afterAutospacing="0" w:before="240" w:lineRule="auto"/>
         <w:ind w:left="720" w:hanging="360"/>
@@ -1666,7 +1694,7 @@
       <w:pPr>
         <w:numPr>
           <w:ilvl w:val="0"/>
-          <w:numId w:val="11"/>
+          <w:numId w:val="12"/>
         </w:numPr>
         <w:spacing w:after="0" w:afterAutospacing="0" w:before="0" w:beforeAutospacing="0" w:lineRule="auto"/>
         <w:ind w:left="720" w:hanging="360"/>
@@ -1682,7 +1710,7 @@
       <w:pPr>
         <w:numPr>
           <w:ilvl w:val="0"/>
-          <w:numId w:val="11"/>
+          <w:numId w:val="12"/>
         </w:numPr>
         <w:spacing w:after="0" w:afterAutospacing="0" w:before="0" w:beforeAutospacing="0" w:lineRule="auto"/>
         <w:ind w:left="720" w:hanging="360"/>
@@ -1698,7 +1726,7 @@
       <w:pPr>
         <w:numPr>
           <w:ilvl w:val="0"/>
-          <w:numId w:val="11"/>
+          <w:numId w:val="12"/>
         </w:numPr>
         <w:spacing w:after="240" w:before="0" w:beforeAutospacing="0" w:lineRule="auto"/>
         <w:ind w:left="720" w:hanging="360"/>
@@ -1769,7 +1797,7 @@
       <w:pPr>
         <w:numPr>
           <w:ilvl w:val="0"/>
-          <w:numId w:val="12"/>
+          <w:numId w:val="13"/>
         </w:numPr>
         <w:spacing w:after="0" w:afterAutospacing="0" w:before="240" w:lineRule="auto"/>
         <w:ind w:left="720" w:hanging="360"/>
@@ -1785,7 +1813,7 @@
       <w:pPr>
         <w:numPr>
           <w:ilvl w:val="0"/>
-          <w:numId w:val="12"/>
+          <w:numId w:val="13"/>
         </w:numPr>
         <w:spacing w:after="0" w:afterAutospacing="0" w:before="0" w:beforeAutospacing="0" w:lineRule="auto"/>
         <w:ind w:left="720" w:hanging="360"/>
@@ -1801,7 +1829,7 @@
       <w:pPr>
         <w:numPr>
           <w:ilvl w:val="0"/>
-          <w:numId w:val="12"/>
+          <w:numId w:val="13"/>
         </w:numPr>
         <w:spacing w:after="0" w:afterAutospacing="0" w:before="0" w:beforeAutospacing="0" w:lineRule="auto"/>
         <w:ind w:left="720" w:hanging="360"/>
@@ -1817,7 +1845,7 @@
       <w:pPr>
         <w:numPr>
           <w:ilvl w:val="0"/>
-          <w:numId w:val="12"/>
+          <w:numId w:val="13"/>
         </w:numPr>
         <w:spacing w:after="240" w:before="0" w:beforeAutospacing="0" w:lineRule="auto"/>
         <w:ind w:left="720" w:hanging="360"/>
@@ -2142,7 +2170,7 @@
       <w:pPr>
         <w:numPr>
           <w:ilvl w:val="0"/>
-          <w:numId w:val="6"/>
+          <w:numId w:val="7"/>
         </w:numPr>
         <w:spacing w:after="0" w:afterAutospacing="0" w:before="240" w:lineRule="auto"/>
         <w:ind w:left="720" w:hanging="360"/>
@@ -2158,7 +2186,7 @@
       <w:pPr>
         <w:numPr>
           <w:ilvl w:val="0"/>
-          <w:numId w:val="6"/>
+          <w:numId w:val="7"/>
         </w:numPr>
         <w:spacing w:after="0" w:afterAutospacing="0" w:before="0" w:beforeAutospacing="0" w:lineRule="auto"/>
         <w:ind w:left="720" w:hanging="360"/>
@@ -2174,7 +2202,7 @@
       <w:pPr>
         <w:numPr>
           <w:ilvl w:val="0"/>
-          <w:numId w:val="6"/>
+          <w:numId w:val="7"/>
         </w:numPr>
         <w:spacing w:after="0" w:afterAutospacing="0" w:before="0" w:beforeAutospacing="0" w:lineRule="auto"/>
         <w:ind w:left="720" w:hanging="360"/>
@@ -2190,7 +2218,7 @@
       <w:pPr>
         <w:numPr>
           <w:ilvl w:val="0"/>
-          <w:numId w:val="6"/>
+          <w:numId w:val="7"/>
         </w:numPr>
         <w:spacing w:after="0" w:afterAutospacing="0" w:before="0" w:beforeAutospacing="0" w:lineRule="auto"/>
         <w:ind w:left="720" w:hanging="360"/>
@@ -2206,7 +2234,7 @@
       <w:pPr>
         <w:numPr>
           <w:ilvl w:val="0"/>
-          <w:numId w:val="6"/>
+          <w:numId w:val="7"/>
         </w:numPr>
         <w:spacing w:after="240" w:before="0" w:beforeAutospacing="0" w:lineRule="auto"/>
         <w:ind w:left="720" w:hanging="360"/>
@@ -2277,7 +2305,7 @@
       <w:pPr>
         <w:numPr>
           <w:ilvl w:val="0"/>
-          <w:numId w:val="22"/>
+          <w:numId w:val="24"/>
         </w:numPr>
         <w:spacing w:after="0" w:afterAutospacing="0" w:before="240" w:lineRule="auto"/>
         <w:ind w:left="720" w:hanging="360"/>
@@ -2293,7 +2321,7 @@
       <w:pPr>
         <w:numPr>
           <w:ilvl w:val="0"/>
-          <w:numId w:val="22"/>
+          <w:numId w:val="24"/>
         </w:numPr>
         <w:spacing w:after="0" w:afterAutospacing="0" w:before="0" w:beforeAutospacing="0" w:lineRule="auto"/>
         <w:ind w:left="720" w:hanging="360"/>
@@ -2309,7 +2337,7 @@
       <w:pPr>
         <w:numPr>
           <w:ilvl w:val="0"/>
-          <w:numId w:val="22"/>
+          <w:numId w:val="24"/>
         </w:numPr>
         <w:spacing w:after="0" w:afterAutospacing="0" w:before="0" w:beforeAutospacing="0" w:lineRule="auto"/>
         <w:ind w:left="720" w:hanging="360"/>
@@ -2325,7 +2353,7 @@
       <w:pPr>
         <w:numPr>
           <w:ilvl w:val="0"/>
-          <w:numId w:val="22"/>
+          <w:numId w:val="24"/>
         </w:numPr>
         <w:spacing w:after="240" w:before="0" w:beforeAutospacing="0" w:lineRule="auto"/>
         <w:ind w:left="720" w:hanging="360"/>
@@ -2380,7 +2408,7 @@
       <w:pPr>
         <w:numPr>
           <w:ilvl w:val="0"/>
-          <w:numId w:val="8"/>
+          <w:numId w:val="9"/>
         </w:numPr>
         <w:spacing w:after="0" w:afterAutospacing="0" w:before="240" w:lineRule="auto"/>
         <w:ind w:left="720" w:hanging="360"/>
@@ -2396,7 +2424,7 @@
       <w:pPr>
         <w:numPr>
           <w:ilvl w:val="0"/>
-          <w:numId w:val="8"/>
+          <w:numId w:val="9"/>
         </w:numPr>
         <w:spacing w:after="0" w:afterAutospacing="0" w:before="0" w:beforeAutospacing="0" w:lineRule="auto"/>
         <w:ind w:left="720" w:hanging="360"/>
@@ -2412,7 +2440,7 @@
       <w:pPr>
         <w:numPr>
           <w:ilvl w:val="0"/>
-          <w:numId w:val="8"/>
+          <w:numId w:val="9"/>
         </w:numPr>
         <w:spacing w:after="0" w:afterAutospacing="0" w:before="0" w:beforeAutospacing="0" w:lineRule="auto"/>
         <w:ind w:left="720" w:hanging="360"/>
@@ -2428,7 +2456,7 @@
       <w:pPr>
         <w:numPr>
           <w:ilvl w:val="0"/>
-          <w:numId w:val="8"/>
+          <w:numId w:val="9"/>
         </w:numPr>
         <w:spacing w:after="0" w:afterAutospacing="0" w:before="0" w:beforeAutospacing="0" w:lineRule="auto"/>
         <w:ind w:left="720" w:hanging="360"/>
@@ -2444,7 +2472,7 @@
       <w:pPr>
         <w:numPr>
           <w:ilvl w:val="0"/>
-          <w:numId w:val="8"/>
+          <w:numId w:val="9"/>
         </w:numPr>
         <w:spacing w:after="0" w:afterAutospacing="0" w:before="0" w:beforeAutospacing="0" w:lineRule="auto"/>
         <w:ind w:left="720" w:hanging="360"/>
@@ -2460,7 +2488,7 @@
       <w:pPr>
         <w:numPr>
           <w:ilvl w:val="0"/>
-          <w:numId w:val="8"/>
+          <w:numId w:val="9"/>
         </w:numPr>
         <w:spacing w:after="0" w:afterAutospacing="0" w:before="0" w:beforeAutospacing="0" w:lineRule="auto"/>
         <w:ind w:left="720" w:hanging="360"/>
@@ -2476,7 +2504,7 @@
       <w:pPr>
         <w:numPr>
           <w:ilvl w:val="0"/>
-          <w:numId w:val="8"/>
+          <w:numId w:val="9"/>
         </w:numPr>
         <w:spacing w:after="0" w:afterAutospacing="0" w:before="0" w:beforeAutospacing="0" w:lineRule="auto"/>
         <w:ind w:left="720" w:hanging="360"/>
@@ -2492,7 +2520,7 @@
       <w:pPr>
         <w:numPr>
           <w:ilvl w:val="0"/>
-          <w:numId w:val="8"/>
+          <w:numId w:val="9"/>
         </w:numPr>
         <w:spacing w:after="240" w:before="0" w:beforeAutospacing="0" w:lineRule="auto"/>
         <w:ind w:left="720" w:hanging="360"/>
@@ -2532,7 +2560,7 @@
       <w:pPr>
         <w:numPr>
           <w:ilvl w:val="0"/>
-          <w:numId w:val="14"/>
+          <w:numId w:val="15"/>
         </w:numPr>
         <w:spacing w:after="0" w:afterAutospacing="0" w:before="240" w:lineRule="auto"/>
         <w:ind w:left="720" w:hanging="360"/>
@@ -2548,7 +2576,7 @@
       <w:pPr>
         <w:numPr>
           <w:ilvl w:val="0"/>
-          <w:numId w:val="14"/>
+          <w:numId w:val="15"/>
         </w:numPr>
         <w:spacing w:after="0" w:afterAutospacing="0" w:before="0" w:beforeAutospacing="0" w:lineRule="auto"/>
         <w:ind w:left="720" w:hanging="360"/>
@@ -2564,7 +2592,7 @@
       <w:pPr>
         <w:numPr>
           <w:ilvl w:val="0"/>
-          <w:numId w:val="14"/>
+          <w:numId w:val="15"/>
         </w:numPr>
         <w:spacing w:after="0" w:afterAutospacing="0" w:before="0" w:beforeAutospacing="0" w:lineRule="auto"/>
         <w:ind w:left="720" w:hanging="360"/>
@@ -2580,7 +2608,7 @@
       <w:pPr>
         <w:numPr>
           <w:ilvl w:val="0"/>
-          <w:numId w:val="14"/>
+          <w:numId w:val="15"/>
         </w:numPr>
         <w:spacing w:after="0" w:afterAutospacing="0" w:before="0" w:beforeAutospacing="0" w:lineRule="auto"/>
         <w:ind w:left="720" w:hanging="360"/>
@@ -2596,7 +2624,7 @@
       <w:pPr>
         <w:numPr>
           <w:ilvl w:val="0"/>
-          <w:numId w:val="14"/>
+          <w:numId w:val="15"/>
         </w:numPr>
         <w:spacing w:after="0" w:afterAutospacing="0" w:before="0" w:beforeAutospacing="0" w:lineRule="auto"/>
         <w:ind w:left="720" w:hanging="360"/>
@@ -2612,7 +2640,7 @@
       <w:pPr>
         <w:numPr>
           <w:ilvl w:val="0"/>
-          <w:numId w:val="14"/>
+          <w:numId w:val="15"/>
         </w:numPr>
         <w:spacing w:after="0" w:afterAutospacing="0" w:before="0" w:beforeAutospacing="0" w:lineRule="auto"/>
         <w:ind w:left="720" w:hanging="360"/>
@@ -2628,7 +2656,7 @@
       <w:pPr>
         <w:numPr>
           <w:ilvl w:val="0"/>
-          <w:numId w:val="14"/>
+          <w:numId w:val="15"/>
         </w:numPr>
         <w:spacing w:after="0" w:afterAutospacing="0" w:before="0" w:beforeAutospacing="0" w:lineRule="auto"/>
         <w:ind w:left="720" w:hanging="360"/>
@@ -2644,7 +2672,7 @@
       <w:pPr>
         <w:numPr>
           <w:ilvl w:val="0"/>
-          <w:numId w:val="14"/>
+          <w:numId w:val="15"/>
         </w:numPr>
         <w:spacing w:after="0" w:afterAutospacing="0" w:before="0" w:beforeAutospacing="0" w:lineRule="auto"/>
         <w:ind w:left="720" w:hanging="360"/>
@@ -2660,7 +2688,7 @@
       <w:pPr>
         <w:numPr>
           <w:ilvl w:val="0"/>
-          <w:numId w:val="14"/>
+          <w:numId w:val="15"/>
         </w:numPr>
         <w:spacing w:after="0" w:afterAutospacing="0" w:before="0" w:beforeAutospacing="0" w:lineRule="auto"/>
         <w:ind w:left="720" w:hanging="360"/>
@@ -2676,7 +2704,7 @@
       <w:pPr>
         <w:numPr>
           <w:ilvl w:val="0"/>
-          <w:numId w:val="14"/>
+          <w:numId w:val="15"/>
         </w:numPr>
         <w:spacing w:after="0" w:afterAutospacing="0" w:before="0" w:beforeAutospacing="0" w:lineRule="auto"/>
         <w:ind w:left="720" w:hanging="360"/>
@@ -2692,7 +2720,7 @@
       <w:pPr>
         <w:numPr>
           <w:ilvl w:val="0"/>
-          <w:numId w:val="14"/>
+          <w:numId w:val="15"/>
         </w:numPr>
         <w:spacing w:after="240" w:before="0" w:beforeAutospacing="0" w:lineRule="auto"/>
         <w:ind w:left="720" w:hanging="360"/>
@@ -2732,7 +2760,7 @@
       <w:pPr>
         <w:numPr>
           <w:ilvl w:val="0"/>
-          <w:numId w:val="20"/>
+          <w:numId w:val="22"/>
         </w:numPr>
         <w:spacing w:after="0" w:afterAutospacing="0" w:before="240" w:lineRule="auto"/>
         <w:ind w:left="720" w:hanging="360"/>
@@ -2748,7 +2776,7 @@
       <w:pPr>
         <w:numPr>
           <w:ilvl w:val="0"/>
-          <w:numId w:val="20"/>
+          <w:numId w:val="22"/>
         </w:numPr>
         <w:spacing w:after="0" w:afterAutospacing="0" w:before="0" w:beforeAutospacing="0" w:lineRule="auto"/>
         <w:ind w:left="720" w:hanging="360"/>
@@ -2764,7 +2792,7 @@
       <w:pPr>
         <w:numPr>
           <w:ilvl w:val="0"/>
-          <w:numId w:val="20"/>
+          <w:numId w:val="22"/>
         </w:numPr>
         <w:spacing w:after="0" w:afterAutospacing="0" w:before="0" w:beforeAutospacing="0" w:lineRule="auto"/>
         <w:ind w:left="720" w:hanging="360"/>
@@ -2780,7 +2808,7 @@
       <w:pPr>
         <w:numPr>
           <w:ilvl w:val="0"/>
-          <w:numId w:val="20"/>
+          <w:numId w:val="22"/>
         </w:numPr>
         <w:spacing w:after="0" w:afterAutospacing="0" w:before="0" w:beforeAutospacing="0" w:lineRule="auto"/>
         <w:ind w:left="720" w:hanging="360"/>
@@ -2796,7 +2824,7 @@
       <w:pPr>
         <w:numPr>
           <w:ilvl w:val="0"/>
-          <w:numId w:val="20"/>
+          <w:numId w:val="22"/>
         </w:numPr>
         <w:spacing w:after="0" w:afterAutospacing="0" w:before="0" w:beforeAutospacing="0" w:lineRule="auto"/>
         <w:ind w:left="720" w:hanging="360"/>
@@ -2812,7 +2840,7 @@
       <w:pPr>
         <w:numPr>
           <w:ilvl w:val="0"/>
-          <w:numId w:val="20"/>
+          <w:numId w:val="22"/>
         </w:numPr>
         <w:spacing w:after="0" w:afterAutospacing="0" w:before="0" w:beforeAutospacing="0" w:lineRule="auto"/>
         <w:ind w:left="720" w:hanging="360"/>
@@ -2828,7 +2856,7 @@
       <w:pPr>
         <w:numPr>
           <w:ilvl w:val="0"/>
-          <w:numId w:val="20"/>
+          <w:numId w:val="22"/>
         </w:numPr>
         <w:spacing w:after="240" w:before="0" w:beforeAutospacing="0" w:lineRule="auto"/>
         <w:ind w:left="720" w:hanging="360"/>
@@ -2874,6 +2902,47 @@
           <w:rtl w:val="0"/>
         </w:rPr>
         <w:t xml:space="preserve">Las decisiones puramente internas de programación no constituyen motivo válido de detención ni justifican una nueva reunión arquitectónica.</w:t>
+      </w:r>
+    </w:p>
+    <w:p>
+      <w:pPr>
+        <w:spacing w:after="240" w:before="240" w:lineRule="auto"/>
+        <w:rPr>
+          <w:b w:val="1"/>
+          <w:bCs w:val="1"/>
+        </w:rPr>
+      </w:pPr>
+      <w:r>
+        <w:rPr>
+          <w:b w:val="1"/>
+          <w:bCs w:val="1"/>
+          <w:rtl w:val="0"/>
+        </w:rPr>
+        <w:t xml:space="preserve">Regla de decisión arquitectónica</w:t>
+      </w:r>
+    </w:p>
+    <w:p>
+      <w:pPr>
+        <w:spacing w:after="240" w:before="240" w:lineRule="auto"/>
+        <w:rPr/>
+      </w:pPr>
+      <w:r>
+        <w:rPr>
+          <w:rtl w:val="0"/>
+        </w:rPr>
+        <w:t xml:space="preserve">Antes de proponer una modificación de un documento arquitectónico, una nueva reunión o un bloqueo de implementación, el Arquitecto Técnico deberá determinar si dos implementaciones internas diferentes podrían satisfacer exactamente el mismo contrato público y las mismas invariantes.</w:t>
+      </w:r>
+    </w:p>
+    <w:p>
+      <w:pPr>
+        <w:spacing w:after="240" w:before="240" w:lineRule="auto"/>
+        <w:rPr/>
+      </w:pPr>
+      <w:r>
+        <w:rPr>
+          <w:rtl w:val="0"/>
+        </w:rPr>
+        <w:t xml:space="preserve">Si la respuesta es afirmativa, la decisión pertenece al Agente de Implementación y no deberá incorporarse a la documentación arquitectónica.</w:t>
       </w:r>
     </w:p>
     <w:p>
@@ -2886,7 +2955,6 @@
         <w:rPr>
           <w:rtl w:val="0"/>
         </w:rPr>
-        <w:t xml:space="preserve">.</w:t>
       </w:r>
     </w:p>
     <w:p>
@@ -2969,10 +3037,30 @@
       </w:pPr>
       <w:r>
         <w:rPr>
+          <w:rtl w:val="0"/>
+        </w:rPr>
+      </w:r>
+    </w:p>
+    <w:p>
+      <w:pPr>
+        <w:rPr/>
+      </w:pPr>
+      <w:r>
+        <w:rPr>
           <w:rFonts w:ascii="Arial Unicode MS" w:cs="Arial Unicode MS" w:eastAsia="Arial Unicode MS" w:hAnsi="Arial Unicode MS"/>
           <w:rtl w:val="0"/>
         </w:rPr>
-        <w:t xml:space="preserve">       ↓</w:t>
+        <w:t xml:space="preserve">        ↓</w:t>
+      </w:r>
+    </w:p>
+    <w:p>
+      <w:pPr>
+        <w:rPr/>
+      </w:pPr>
+      <w:r>
+        <w:rPr>
+          <w:rtl w:val="0"/>
+        </w:rPr>
       </w:r>
     </w:p>
     <w:p>
@@ -2992,10 +3080,30 @@
       </w:pPr>
       <w:r>
         <w:rPr>
+          <w:rtl w:val="0"/>
+        </w:rPr>
+      </w:r>
+    </w:p>
+    <w:p>
+      <w:pPr>
+        <w:rPr/>
+      </w:pPr>
+      <w:r>
+        <w:rPr>
           <w:rFonts w:ascii="Arial Unicode MS" w:cs="Arial Unicode MS" w:eastAsia="Arial Unicode MS" w:hAnsi="Arial Unicode MS"/>
           <w:rtl w:val="0"/>
         </w:rPr>
-        <w:t xml:space="preserve">       ↓</w:t>
+        <w:t xml:space="preserve">        ↓</w:t>
+      </w:r>
+    </w:p>
+    <w:p>
+      <w:pPr>
+        <w:rPr/>
+      </w:pPr>
+      <w:r>
+        <w:rPr>
+          <w:rtl w:val="0"/>
+        </w:rPr>
       </w:r>
     </w:p>
     <w:p>
@@ -3015,10 +3123,30 @@
       </w:pPr>
       <w:r>
         <w:rPr>
+          <w:rtl w:val="0"/>
+        </w:rPr>
+      </w:r>
+    </w:p>
+    <w:p>
+      <w:pPr>
+        <w:rPr/>
+      </w:pPr>
+      <w:r>
+        <w:rPr>
           <w:rFonts w:ascii="Arial Unicode MS" w:cs="Arial Unicode MS" w:eastAsia="Arial Unicode MS" w:hAnsi="Arial Unicode MS"/>
           <w:rtl w:val="0"/>
         </w:rPr>
-        <w:t xml:space="preserve">       ↓</w:t>
+        <w:t xml:space="preserve">        ↓</w:t>
+      </w:r>
+    </w:p>
+    <w:p>
+      <w:pPr>
+        <w:rPr/>
+      </w:pPr>
+      <w:r>
+        <w:rPr>
+          <w:rtl w:val="0"/>
+        </w:rPr>
       </w:r>
     </w:p>
     <w:p>
@@ -3038,10 +3166,73 @@
       </w:pPr>
       <w:r>
         <w:rPr>
+          <w:rtl w:val="0"/>
+        </w:rPr>
+      </w:r>
+    </w:p>
+    <w:p>
+      <w:pPr>
+        <w:rPr/>
+      </w:pPr>
+      <w:r>
+        <w:rPr>
           <w:rFonts w:ascii="Arial Unicode MS" w:cs="Arial Unicode MS" w:eastAsia="Arial Unicode MS" w:hAnsi="Arial Unicode MS"/>
           <w:rtl w:val="0"/>
         </w:rPr>
-        <w:t xml:space="preserve">       ↓</w:t>
+        <w:t xml:space="preserve">        ↓</w:t>
+      </w:r>
+    </w:p>
+    <w:p>
+      <w:pPr>
+        <w:rPr/>
+      </w:pPr>
+      <w:r>
+        <w:rPr>
+          <w:rtl w:val="0"/>
+        </w:rPr>
+      </w:r>
+    </w:p>
+    <w:p>
+      <w:pPr>
+        <w:rPr/>
+      </w:pPr>
+      <w:r>
+        <w:rPr>
+          <w:rtl w:val="0"/>
+        </w:rPr>
+        <w:t xml:space="preserve">Auditoría de implementabilidad</w:t>
+      </w:r>
+    </w:p>
+    <w:p>
+      <w:pPr>
+        <w:rPr/>
+      </w:pPr>
+      <w:r>
+        <w:rPr>
+          <w:rtl w:val="0"/>
+        </w:rPr>
+      </w:r>
+    </w:p>
+    <w:p>
+      <w:pPr>
+        <w:rPr/>
+      </w:pPr>
+      <w:r>
+        <w:rPr>
+          <w:rFonts w:ascii="Arial Unicode MS" w:cs="Arial Unicode MS" w:eastAsia="Arial Unicode MS" w:hAnsi="Arial Unicode MS"/>
+          <w:rtl w:val="0"/>
+        </w:rPr>
+        <w:t xml:space="preserve">        ↓</w:t>
+      </w:r>
+    </w:p>
+    <w:p>
+      <w:pPr>
+        <w:rPr/>
+      </w:pPr>
+      <w:r>
+        <w:rPr>
+          <w:rtl w:val="0"/>
+        </w:rPr>
       </w:r>
     </w:p>
     <w:p>
@@ -3061,10 +3252,30 @@
       </w:pPr>
       <w:r>
         <w:rPr>
+          <w:rtl w:val="0"/>
+        </w:rPr>
+      </w:r>
+    </w:p>
+    <w:p>
+      <w:pPr>
+        <w:rPr/>
+      </w:pPr>
+      <w:r>
+        <w:rPr>
           <w:rFonts w:ascii="Arial Unicode MS" w:cs="Arial Unicode MS" w:eastAsia="Arial Unicode MS" w:hAnsi="Arial Unicode MS"/>
           <w:rtl w:val="0"/>
         </w:rPr>
-        <w:t xml:space="preserve">       ↓</w:t>
+        <w:t xml:space="preserve">        ↓</w:t>
+      </w:r>
+    </w:p>
+    <w:p>
+      <w:pPr>
+        <w:rPr/>
+      </w:pPr>
+      <w:r>
+        <w:rPr>
+          <w:rtl w:val="0"/>
+        </w:rPr>
       </w:r>
     </w:p>
     <w:p>
@@ -3084,10 +3295,30 @@
       </w:pPr>
       <w:r>
         <w:rPr>
+          <w:rtl w:val="0"/>
+        </w:rPr>
+      </w:r>
+    </w:p>
+    <w:p>
+      <w:pPr>
+        <w:rPr/>
+      </w:pPr>
+      <w:r>
+        <w:rPr>
           <w:rFonts w:ascii="Arial Unicode MS" w:cs="Arial Unicode MS" w:eastAsia="Arial Unicode MS" w:hAnsi="Arial Unicode MS"/>
           <w:rtl w:val="0"/>
         </w:rPr>
-        <w:t xml:space="preserve">       ↓</w:t>
+        <w:t xml:space="preserve">        ↓</w:t>
+      </w:r>
+    </w:p>
+    <w:p>
+      <w:pPr>
+        <w:rPr/>
+      </w:pPr>
+      <w:r>
+        <w:rPr>
+          <w:rtl w:val="0"/>
+        </w:rPr>
       </w:r>
     </w:p>
     <w:p>
@@ -3103,7 +3334,16 @@
     </w:p>
     <w:p>
       <w:pPr>
-        <w:ind w:left="0" w:firstLine="0"/>
+        <w:rPr/>
+      </w:pPr>
+      <w:r>
+        <w:rPr>
+          <w:rtl w:val="0"/>
+        </w:rPr>
+      </w:r>
+    </w:p>
+    <w:p>
+      <w:pPr>
         <w:rPr/>
       </w:pPr>
       <w:r>
@@ -3111,18 +3351,38 @@
           <w:rFonts w:ascii="Arial Unicode MS" w:cs="Arial Unicode MS" w:eastAsia="Arial Unicode MS" w:hAnsi="Arial Unicode MS"/>
           <w:rtl w:val="0"/>
         </w:rPr>
-        <w:t xml:space="preserve">       ↓</w:t>
-      </w:r>
-    </w:p>
-    <w:p>
-      <w:pPr>
-        <w:rPr/>
-      </w:pPr>
-      <w:r>
-        <w:rPr>
-          <w:rtl w:val="0"/>
-        </w:rPr>
-        <w:t xml:space="preserve">Auditoría de cobertura </w:t>
+        <w:t xml:space="preserve">        ↓</w:t>
+      </w:r>
+    </w:p>
+    <w:p>
+      <w:pPr>
+        <w:rPr/>
+      </w:pPr>
+      <w:r>
+        <w:rPr>
+          <w:rtl w:val="0"/>
+        </w:rPr>
+      </w:r>
+    </w:p>
+    <w:p>
+      <w:pPr>
+        <w:rPr/>
+      </w:pPr>
+      <w:r>
+        <w:rPr>
+          <w:rtl w:val="0"/>
+        </w:rPr>
+        <w:t xml:space="preserve">Auditoría de cobertura</w:t>
+      </w:r>
+    </w:p>
+    <w:p>
+      <w:pPr>
+        <w:rPr/>
+      </w:pPr>
+      <w:r>
+        <w:rPr>
+          <w:rtl w:val="0"/>
+        </w:rPr>
       </w:r>
     </w:p>
     <w:p>
@@ -3134,7 +3394,17 @@
           <w:rFonts w:ascii="Arial Unicode MS" w:cs="Arial Unicode MS" w:eastAsia="Arial Unicode MS" w:hAnsi="Arial Unicode MS"/>
           <w:rtl w:val="0"/>
         </w:rPr>
-        <w:t xml:space="preserve">       ↓</w:t>
+        <w:t xml:space="preserve">        ↓</w:t>
+      </w:r>
+    </w:p>
+    <w:p>
+      <w:pPr>
+        <w:rPr/>
+      </w:pPr>
+      <w:r>
+        <w:rPr>
+          <w:rtl w:val="0"/>
+        </w:rPr>
       </w:r>
     </w:p>
     <w:p>
@@ -3154,10 +3424,30 @@
       </w:pPr>
       <w:r>
         <w:rPr>
+          <w:rtl w:val="0"/>
+        </w:rPr>
+      </w:r>
+    </w:p>
+    <w:p>
+      <w:pPr>
+        <w:rPr/>
+      </w:pPr>
+      <w:r>
+        <w:rPr>
           <w:rFonts w:ascii="Arial Unicode MS" w:cs="Arial Unicode MS" w:eastAsia="Arial Unicode MS" w:hAnsi="Arial Unicode MS"/>
           <w:rtl w:val="0"/>
         </w:rPr>
-        <w:t xml:space="preserve">       ↓</w:t>
+        <w:t xml:space="preserve">        ↓</w:t>
+      </w:r>
+    </w:p>
+    <w:p>
+      <w:pPr>
+        <w:rPr/>
+      </w:pPr>
+      <w:r>
+        <w:rPr>
+          <w:rtl w:val="0"/>
+        </w:rPr>
       </w:r>
     </w:p>
     <w:p>
@@ -3177,10 +3467,30 @@
       </w:pPr>
       <w:r>
         <w:rPr>
+          <w:rtl w:val="0"/>
+        </w:rPr>
+      </w:r>
+    </w:p>
+    <w:p>
+      <w:pPr>
+        <w:rPr/>
+      </w:pPr>
+      <w:r>
+        <w:rPr>
           <w:rFonts w:ascii="Arial Unicode MS" w:cs="Arial Unicode MS" w:eastAsia="Arial Unicode MS" w:hAnsi="Arial Unicode MS"/>
           <w:rtl w:val="0"/>
         </w:rPr>
-        <w:t xml:space="preserve">       ↓</w:t>
+        <w:t xml:space="preserve">        ↓</w:t>
+      </w:r>
+    </w:p>
+    <w:p>
+      <w:pPr>
+        <w:rPr/>
+      </w:pPr>
+      <w:r>
+        <w:rPr>
+          <w:rtl w:val="0"/>
+        </w:rPr>
       </w:r>
     </w:p>
     <w:p>
@@ -3196,6 +3506,16 @@
     </w:p>
     <w:p>
       <w:pPr>
+        <w:rPr/>
+      </w:pPr>
+      <w:r>
+        <w:rPr>
+          <w:rtl w:val="0"/>
+        </w:rPr>
+      </w:r>
+    </w:p>
+    <w:p>
+      <w:pPr>
         <w:spacing w:after="240" w:before="240" w:lineRule="auto"/>
         <w:rPr/>
       </w:pPr>
@@ -3204,6 +3524,321 @@
           <w:rtl w:val="0"/>
         </w:rPr>
         <w:t xml:space="preserve">Ninguna etapa podrá omitirse salvo autorización expresa documentada.</w:t>
+      </w:r>
+    </w:p>
+    <w:p>
+      <w:pPr>
+        <w:spacing w:after="240" w:before="240" w:lineRule="auto"/>
+        <w:rPr/>
+      </w:pPr>
+      <w:r>
+        <w:rPr>
+          <w:rtl w:val="0"/>
+        </w:rPr>
+      </w:r>
+    </w:p>
+    <w:p>
+      <w:pPr>
+        <w:pStyle w:val="Heading2"/>
+        <w:spacing w:after="240" w:before="240" w:lineRule="auto"/>
+        <w:rPr/>
+      </w:pPr>
+      <w:bookmarkStart w:colFirst="0" w:colLast="0" w:name="_892mc9nt4yvv" w:id="21"/>
+      <w:bookmarkEnd w:id="21"/>
+      <w:r>
+        <w:rPr>
+          <w:rtl w:val="0"/>
+        </w:rPr>
+        <w:t xml:space="preserve">5.1 Auditoría contractual de implementabilidad  </w:t>
+      </w:r>
+    </w:p>
+    <w:p>
+      <w:pPr>
+        <w:spacing w:after="240" w:before="240" w:lineRule="auto"/>
+        <w:rPr>
+          <w:b w:val="1"/>
+          <w:bCs w:val="1"/>
+        </w:rPr>
+      </w:pPr>
+      <w:r>
+        <w:rPr>
+          <w:b w:val="1"/>
+          <w:bCs w:val="1"/>
+          <w:rtl w:val="0"/>
+        </w:rPr>
+        <w:t xml:space="preserve">Objetivo</w:t>
+      </w:r>
+    </w:p>
+    <w:p>
+      <w:pPr>
+        <w:spacing w:after="240" w:before="240" w:lineRule="auto"/>
+        <w:rPr/>
+      </w:pPr>
+      <w:r>
+        <w:rPr>
+          <w:rtl w:val="0"/>
+        </w:rPr>
+        <w:t xml:space="preserve">Verificar que la especificación técnica elimina todas las decisiones arquitectónicas y contractuales que no pueden delegarse al Agente de Implementación sin alterar el sistema.</w:t>
+      </w:r>
+    </w:p>
+    <w:p>
+      <w:pPr>
+        <w:spacing w:after="240" w:before="240" w:lineRule="auto"/>
+        <w:rPr/>
+      </w:pPr>
+      <w:r>
+        <w:rPr>
+          <w:rtl w:val="0"/>
+        </w:rPr>
+        <w:t xml:space="preserve">La auditoría tiene como finalidad confirmar que el Agente de Implementación puede desarrollar el incremento respetando exactamente:</w:t>
+      </w:r>
+    </w:p>
+    <w:p>
+      <w:pPr>
+        <w:numPr>
+          <w:ilvl w:val="0"/>
+          <w:numId w:val="6"/>
+        </w:numPr>
+        <w:spacing w:after="0" w:afterAutospacing="0" w:before="240" w:lineRule="auto"/>
+        <w:ind w:left="720" w:hanging="360"/>
+      </w:pPr>
+      <w:r>
+        <w:rPr>
+          <w:rtl w:val="0"/>
+        </w:rPr>
+        <w:t xml:space="preserve">la arquitectura;</w:t>
+      </w:r>
+    </w:p>
+    <w:p>
+      <w:pPr>
+        <w:numPr>
+          <w:ilvl w:val="0"/>
+          <w:numId w:val="6"/>
+        </w:numPr>
+        <w:spacing w:after="0" w:afterAutospacing="0" w:before="0" w:beforeAutospacing="0" w:lineRule="auto"/>
+        <w:ind w:left="720" w:hanging="360"/>
+      </w:pPr>
+      <w:r>
+        <w:rPr>
+          <w:rtl w:val="0"/>
+        </w:rPr>
+        <w:t xml:space="preserve">los contratos públicos;</w:t>
+      </w:r>
+    </w:p>
+    <w:p>
+      <w:pPr>
+        <w:numPr>
+          <w:ilvl w:val="0"/>
+          <w:numId w:val="6"/>
+        </w:numPr>
+        <w:spacing w:after="0" w:afterAutospacing="0" w:before="0" w:beforeAutospacing="0" w:lineRule="auto"/>
+        <w:ind w:left="720" w:hanging="360"/>
+      </w:pPr>
+      <w:r>
+        <w:rPr>
+          <w:rtl w:val="0"/>
+        </w:rPr>
+        <w:t xml:space="preserve">la semántica del dominio;</w:t>
+      </w:r>
+    </w:p>
+    <w:p>
+      <w:pPr>
+        <w:numPr>
+          <w:ilvl w:val="0"/>
+          <w:numId w:val="6"/>
+        </w:numPr>
+        <w:spacing w:after="0" w:afterAutospacing="0" w:before="0" w:beforeAutospacing="0" w:lineRule="auto"/>
+        <w:ind w:left="720" w:hanging="360"/>
+      </w:pPr>
+      <w:r>
+        <w:rPr>
+          <w:rtl w:val="0"/>
+        </w:rPr>
+        <w:t xml:space="preserve">las invariantes;</w:t>
+      </w:r>
+    </w:p>
+    <w:p>
+      <w:pPr>
+        <w:numPr>
+          <w:ilvl w:val="0"/>
+          <w:numId w:val="6"/>
+        </w:numPr>
+        <w:spacing w:after="240" w:before="0" w:beforeAutospacing="0" w:lineRule="auto"/>
+        <w:ind w:left="720" w:hanging="360"/>
+      </w:pPr>
+      <w:r>
+        <w:rPr>
+          <w:rtl w:val="0"/>
+        </w:rPr>
+        <w:t xml:space="preserve">las dependencias autorizadas.</w:t>
+      </w:r>
+    </w:p>
+    <w:p>
+      <w:pPr>
+        <w:spacing w:after="240" w:before="240" w:lineRule="auto"/>
+        <w:rPr/>
+      </w:pPr>
+      <w:r>
+        <w:rPr>
+          <w:rtl w:val="0"/>
+        </w:rPr>
+        <w:t xml:space="preserve">La auditoría </w:t>
+      </w:r>
+      <w:r>
+        <w:rPr>
+          <w:b w:val="1"/>
+          <w:bCs w:val="1"/>
+          <w:rtl w:val="0"/>
+        </w:rPr>
+        <w:t xml:space="preserve">no tiene como finalidad</w:t>
+      </w:r>
+      <w:r>
+        <w:rPr>
+          <w:rtl w:val="0"/>
+        </w:rPr>
+        <w:t xml:space="preserve">:</w:t>
+      </w:r>
+    </w:p>
+    <w:p>
+      <w:pPr>
+        <w:numPr>
+          <w:ilvl w:val="0"/>
+          <w:numId w:val="18"/>
+        </w:numPr>
+        <w:spacing w:after="0" w:afterAutospacing="0" w:before="240" w:lineRule="auto"/>
+        <w:ind w:left="720" w:hanging="360"/>
+      </w:pPr>
+      <w:r>
+        <w:rPr>
+          <w:rtl w:val="0"/>
+        </w:rPr>
+        <w:t xml:space="preserve">revisar decisiones internas de programación;</w:t>
+      </w:r>
+    </w:p>
+    <w:p>
+      <w:pPr>
+        <w:numPr>
+          <w:ilvl w:val="0"/>
+          <w:numId w:val="18"/>
+        </w:numPr>
+        <w:spacing w:after="0" w:afterAutospacing="0" w:before="0" w:beforeAutospacing="0" w:lineRule="auto"/>
+        <w:ind w:left="720" w:hanging="360"/>
+      </w:pPr>
+      <w:r>
+        <w:rPr>
+          <w:rtl w:val="0"/>
+        </w:rPr>
+        <w:t xml:space="preserve">anticipar estructuras internas de implementación;</w:t>
+      </w:r>
+    </w:p>
+    <w:p>
+      <w:pPr>
+        <w:numPr>
+          <w:ilvl w:val="0"/>
+          <w:numId w:val="18"/>
+        </w:numPr>
+        <w:spacing w:after="0" w:afterAutospacing="0" w:before="0" w:beforeAutospacing="0" w:lineRule="auto"/>
+        <w:ind w:left="720" w:hanging="360"/>
+      </w:pPr>
+      <w:r>
+        <w:rPr>
+          <w:rtl w:val="0"/>
+        </w:rPr>
+        <w:t xml:space="preserve">imponer algoritmos;</w:t>
+      </w:r>
+    </w:p>
+    <w:p>
+      <w:pPr>
+        <w:numPr>
+          <w:ilvl w:val="0"/>
+          <w:numId w:val="18"/>
+        </w:numPr>
+        <w:spacing w:after="0" w:afterAutospacing="0" w:before="0" w:beforeAutospacing="0" w:lineRule="auto"/>
+        <w:ind w:left="720" w:hanging="360"/>
+      </w:pPr>
+      <w:r>
+        <w:rPr>
+          <w:rtl w:val="0"/>
+        </w:rPr>
+        <w:t xml:space="preserve">definir mecanismos internos de validación;</w:t>
+      </w:r>
+    </w:p>
+    <w:p>
+      <w:pPr>
+        <w:numPr>
+          <w:ilvl w:val="0"/>
+          <w:numId w:val="18"/>
+        </w:numPr>
+        <w:spacing w:after="0" w:afterAutospacing="0" w:before="0" w:beforeAutospacing="0" w:lineRule="auto"/>
+        <w:ind w:left="720" w:hanging="360"/>
+      </w:pPr>
+      <w:r>
+        <w:rPr>
+          <w:rtl w:val="0"/>
+        </w:rPr>
+        <w:t xml:space="preserve">definir optimizaciones;</w:t>
+      </w:r>
+    </w:p>
+    <w:p>
+      <w:pPr>
+        <w:numPr>
+          <w:ilvl w:val="0"/>
+          <w:numId w:val="18"/>
+        </w:numPr>
+        <w:spacing w:after="240" w:before="0" w:beforeAutospacing="0" w:lineRule="auto"/>
+        <w:ind w:left="720" w:hanging="360"/>
+      </w:pPr>
+      <w:r>
+        <w:rPr>
+          <w:rtl w:val="0"/>
+        </w:rPr>
+        <w:t xml:space="preserve">sustituir el criterio técnico propio del Agente de Implementación.</w:t>
+      </w:r>
+    </w:p>
+    <w:p>
+      <w:pPr>
+        <w:spacing w:after="240" w:before="240" w:lineRule="auto"/>
+        <w:rPr/>
+      </w:pPr>
+      <w:r>
+        <w:rPr>
+          <w:rtl w:val="0"/>
+        </w:rPr>
+        <w:t xml:space="preserve">La implementación únicamente deberá detenerse cuando la auditoría identifique una decisión arquitectónica o contractual pendiente de resolución.</w:t>
+      </w:r>
+    </w:p>
+    <w:p>
+      <w:pPr>
+        <w:spacing w:after="240" w:before="240" w:lineRule="auto"/>
+        <w:rPr/>
+      </w:pPr>
+      <w:r>
+        <w:rPr>
+          <w:rtl w:val="0"/>
+        </w:rPr>
+        <w:t xml:space="preserve">Las decisiones puramente internas de programación pertenecen al Agente de Implementación conforme a la Sección 4.2.</w:t>
+      </w:r>
+    </w:p>
+    <w:p>
+      <w:pPr>
+        <w:spacing w:after="240" w:before="240" w:lineRule="auto"/>
+        <w:rPr/>
+      </w:pPr>
+      <w:r>
+        <w:rPr>
+          <w:rtl w:val="0"/>
+        </w:rPr>
+      </w:r>
+    </w:p>
+    <w:p>
+      <w:pPr>
+        <w:spacing w:after="240" w:before="240" w:lineRule="auto"/>
+        <w:rPr/>
+      </w:pPr>
+      <w:r>
+        <w:rPr>
+          <w:rtl w:val="0"/>
+        </w:rPr>
       </w:r>
     </w:p>
     <w:p>
@@ -3234,8 +3869,8 @@
           <w:szCs w:val="46"/>
         </w:rPr>
       </w:pPr>
-      <w:bookmarkStart w:colFirst="0" w:colLast="0" w:name="_ygyv45nzyql7" w:id="21"/>
-      <w:bookmarkEnd w:id="21"/>
+      <w:bookmarkStart w:colFirst="0" w:colLast="0" w:name="_ygyv45nzyql7" w:id="22"/>
+      <w:bookmarkEnd w:id="22"/>
       <w:r>
         <w:rPr>
           <w:b w:val="1"/>
@@ -3263,7 +3898,7 @@
       <w:pPr>
         <w:numPr>
           <w:ilvl w:val="0"/>
-          <w:numId w:val="9"/>
+          <w:numId w:val="10"/>
         </w:numPr>
         <w:spacing w:after="0" w:afterAutospacing="0" w:before="240" w:lineRule="auto"/>
         <w:ind w:left="720" w:hanging="360"/>
@@ -3279,7 +3914,7 @@
       <w:pPr>
         <w:numPr>
           <w:ilvl w:val="0"/>
-          <w:numId w:val="9"/>
+          <w:numId w:val="10"/>
         </w:numPr>
         <w:spacing w:after="0" w:afterAutospacing="0" w:before="0" w:beforeAutospacing="0" w:lineRule="auto"/>
         <w:ind w:left="720" w:hanging="360"/>
@@ -3295,7 +3930,7 @@
       <w:pPr>
         <w:numPr>
           <w:ilvl w:val="0"/>
-          <w:numId w:val="9"/>
+          <w:numId w:val="10"/>
         </w:numPr>
         <w:spacing w:after="0" w:afterAutospacing="0" w:before="0" w:beforeAutospacing="0" w:lineRule="auto"/>
         <w:ind w:left="720" w:hanging="360"/>
@@ -3311,7 +3946,7 @@
       <w:pPr>
         <w:numPr>
           <w:ilvl w:val="0"/>
-          <w:numId w:val="9"/>
+          <w:numId w:val="10"/>
         </w:numPr>
         <w:spacing w:after="0" w:afterAutospacing="0" w:before="0" w:beforeAutospacing="0" w:lineRule="auto"/>
         <w:ind w:left="720" w:hanging="360"/>
@@ -3327,7 +3962,7 @@
       <w:pPr>
         <w:numPr>
           <w:ilvl w:val="0"/>
-          <w:numId w:val="9"/>
+          <w:numId w:val="10"/>
         </w:numPr>
         <w:spacing w:after="0" w:afterAutospacing="0" w:before="0" w:beforeAutospacing="0" w:lineRule="auto"/>
         <w:ind w:left="720" w:hanging="360"/>
@@ -3343,7 +3978,7 @@
       <w:pPr>
         <w:numPr>
           <w:ilvl w:val="0"/>
-          <w:numId w:val="9"/>
+          <w:numId w:val="10"/>
         </w:numPr>
         <w:spacing w:after="240" w:before="0" w:beforeAutospacing="0" w:lineRule="auto"/>
         <w:ind w:left="720" w:hanging="360"/>
@@ -3395,8 +4030,8 @@
           <w:szCs w:val="46"/>
         </w:rPr>
       </w:pPr>
-      <w:bookmarkStart w:colFirst="0" w:colLast="0" w:name="_hgin08l9ibcs" w:id="22"/>
-      <w:bookmarkEnd w:id="22"/>
+      <w:bookmarkStart w:colFirst="0" w:colLast="0" w:name="_hgin08l9ibcs" w:id="23"/>
+      <w:bookmarkEnd w:id="23"/>
       <w:r>
         <w:rPr>
           <w:b w:val="1"/>
@@ -3554,8 +4189,8 @@
           <w:szCs w:val="46"/>
         </w:rPr>
       </w:pPr>
-      <w:bookmarkStart w:colFirst="0" w:colLast="0" w:name="_kadl4seaitr6" w:id="23"/>
-      <w:bookmarkEnd w:id="23"/>
+      <w:bookmarkStart w:colFirst="0" w:colLast="0" w:name="_kadl4seaitr6" w:id="24"/>
+      <w:bookmarkEnd w:id="24"/>
       <w:r>
         <w:rPr>
           <w:b w:val="1"/>
@@ -3595,7 +4230,7 @@
       <w:pPr>
         <w:numPr>
           <w:ilvl w:val="0"/>
-          <w:numId w:val="18"/>
+          <w:numId w:val="20"/>
         </w:numPr>
         <w:spacing w:after="0" w:afterAutospacing="0" w:before="240" w:lineRule="auto"/>
         <w:ind w:left="720" w:hanging="360"/>
@@ -3611,7 +4246,7 @@
       <w:pPr>
         <w:numPr>
           <w:ilvl w:val="0"/>
-          <w:numId w:val="18"/>
+          <w:numId w:val="20"/>
         </w:numPr>
         <w:spacing w:after="0" w:afterAutospacing="0" w:before="0" w:beforeAutospacing="0" w:lineRule="auto"/>
         <w:ind w:left="720" w:hanging="360"/>
@@ -3627,7 +4262,7 @@
       <w:pPr>
         <w:numPr>
           <w:ilvl w:val="0"/>
-          <w:numId w:val="18"/>
+          <w:numId w:val="20"/>
         </w:numPr>
         <w:spacing w:after="0" w:afterAutospacing="0" w:before="0" w:beforeAutospacing="0" w:lineRule="auto"/>
         <w:ind w:left="720" w:hanging="360"/>
@@ -3643,7 +4278,7 @@
       <w:pPr>
         <w:numPr>
           <w:ilvl w:val="0"/>
-          <w:numId w:val="18"/>
+          <w:numId w:val="20"/>
         </w:numPr>
         <w:spacing w:after="240" w:before="0" w:beforeAutospacing="0" w:lineRule="auto"/>
         <w:ind w:left="720" w:hanging="360"/>
@@ -3695,8 +4330,8 @@
           <w:szCs w:val="46"/>
         </w:rPr>
       </w:pPr>
-      <w:bookmarkStart w:colFirst="0" w:colLast="0" w:name="_34l9e34puccl" w:id="24"/>
-      <w:bookmarkEnd w:id="24"/>
+      <w:bookmarkStart w:colFirst="0" w:colLast="0" w:name="_34l9e34puccl" w:id="25"/>
+      <w:bookmarkEnd w:id="25"/>
       <w:r>
         <w:rPr>
           <w:b w:val="1"/>
@@ -3724,7 +4359,7 @@
       <w:pPr>
         <w:numPr>
           <w:ilvl w:val="0"/>
-          <w:numId w:val="17"/>
+          <w:numId w:val="19"/>
         </w:numPr>
         <w:spacing w:after="0" w:afterAutospacing="0" w:before="240" w:lineRule="auto"/>
         <w:ind w:left="720" w:hanging="360"/>
@@ -3740,7 +4375,7 @@
       <w:pPr>
         <w:numPr>
           <w:ilvl w:val="0"/>
-          <w:numId w:val="17"/>
+          <w:numId w:val="19"/>
         </w:numPr>
         <w:spacing w:after="0" w:afterAutospacing="0" w:before="0" w:beforeAutospacing="0" w:lineRule="auto"/>
         <w:ind w:left="720" w:hanging="360"/>
@@ -3756,7 +4391,7 @@
       <w:pPr>
         <w:numPr>
           <w:ilvl w:val="0"/>
-          <w:numId w:val="17"/>
+          <w:numId w:val="19"/>
         </w:numPr>
         <w:spacing w:after="0" w:afterAutospacing="0" w:before="0" w:beforeAutospacing="0" w:lineRule="auto"/>
         <w:ind w:left="720" w:hanging="360"/>
@@ -3772,7 +4407,7 @@
       <w:pPr>
         <w:numPr>
           <w:ilvl w:val="0"/>
-          <w:numId w:val="17"/>
+          <w:numId w:val="19"/>
         </w:numPr>
         <w:spacing w:after="0" w:afterAutospacing="0" w:before="0" w:beforeAutospacing="0" w:lineRule="auto"/>
         <w:ind w:left="720" w:hanging="360"/>
@@ -3788,7 +4423,7 @@
       <w:pPr>
         <w:numPr>
           <w:ilvl w:val="0"/>
-          <w:numId w:val="17"/>
+          <w:numId w:val="19"/>
         </w:numPr>
         <w:spacing w:after="240" w:before="0" w:beforeAutospacing="0" w:lineRule="auto"/>
         <w:ind w:left="720" w:hanging="360"/>
@@ -3828,8 +4463,8 @@
           <w:szCs w:val="46"/>
         </w:rPr>
       </w:pPr>
-      <w:bookmarkStart w:colFirst="0" w:colLast="0" w:name="_jlkomerib4ly" w:id="25"/>
-      <w:bookmarkEnd w:id="25"/>
+      <w:bookmarkStart w:colFirst="0" w:colLast="0" w:name="_jlkomerib4ly" w:id="26"/>
+      <w:bookmarkEnd w:id="26"/>
       <w:r>
         <w:rPr>
           <w:b w:val="1"/>
@@ -3946,8 +4581,8 @@
           <w:szCs w:val="46"/>
         </w:rPr>
       </w:pPr>
-      <w:bookmarkStart w:colFirst="0" w:colLast="0" w:name="_6lfbcjgkeeok" w:id="26"/>
-      <w:bookmarkEnd w:id="26"/>
+      <w:bookmarkStart w:colFirst="0" w:colLast="0" w:name="_6lfbcjgkeeok" w:id="27"/>
+      <w:bookmarkEnd w:id="27"/>
       <w:r>
         <w:rPr>
           <w:b w:val="1"/>
@@ -4023,8 +4658,8 @@
           <w:szCs w:val="46"/>
         </w:rPr>
       </w:pPr>
-      <w:bookmarkStart w:colFirst="0" w:colLast="0" w:name="_bt0u3esnco0d" w:id="27"/>
-      <w:bookmarkEnd w:id="27"/>
+      <w:bookmarkStart w:colFirst="0" w:colLast="0" w:name="_bt0u3esnco0d" w:id="28"/>
+      <w:bookmarkEnd w:id="28"/>
       <w:r>
         <w:rPr>
           <w:b w:val="1"/>
@@ -6422,6 +7057,226 @@
     </w:lvl>
   </w:abstractNum>
   <w:abstractNum w:abstractNumId="22">
+    <w:lvl w:ilvl="0">
+      <w:start w:val="1"/>
+      <w:numFmt w:val="bullet"/>
+      <w:lvlText w:val="●"/>
+      <w:lvlJc w:val="left"/>
+      <w:pPr>
+        <w:ind w:left="720" w:hanging="360"/>
+      </w:pPr>
+      <w:rPr>
+        <w:u w:val="none"/>
+      </w:rPr>
+    </w:lvl>
+    <w:lvl w:ilvl="1">
+      <w:start w:val="1"/>
+      <w:numFmt w:val="bullet"/>
+      <w:lvlText w:val="○"/>
+      <w:lvlJc w:val="left"/>
+      <w:pPr>
+        <w:ind w:left="1440" w:hanging="360"/>
+      </w:pPr>
+      <w:rPr>
+        <w:u w:val="none"/>
+      </w:rPr>
+    </w:lvl>
+    <w:lvl w:ilvl="2">
+      <w:start w:val="1"/>
+      <w:numFmt w:val="bullet"/>
+      <w:lvlText w:val="■"/>
+      <w:lvlJc w:val="left"/>
+      <w:pPr>
+        <w:ind w:left="2160" w:hanging="360"/>
+      </w:pPr>
+      <w:rPr>
+        <w:u w:val="none"/>
+      </w:rPr>
+    </w:lvl>
+    <w:lvl w:ilvl="3">
+      <w:start w:val="1"/>
+      <w:numFmt w:val="bullet"/>
+      <w:lvlText w:val="●"/>
+      <w:lvlJc w:val="left"/>
+      <w:pPr>
+        <w:ind w:left="2880" w:hanging="360"/>
+      </w:pPr>
+      <w:rPr>
+        <w:u w:val="none"/>
+      </w:rPr>
+    </w:lvl>
+    <w:lvl w:ilvl="4">
+      <w:start w:val="1"/>
+      <w:numFmt w:val="bullet"/>
+      <w:lvlText w:val="○"/>
+      <w:lvlJc w:val="left"/>
+      <w:pPr>
+        <w:ind w:left="3600" w:hanging="360"/>
+      </w:pPr>
+      <w:rPr>
+        <w:u w:val="none"/>
+      </w:rPr>
+    </w:lvl>
+    <w:lvl w:ilvl="5">
+      <w:start w:val="1"/>
+      <w:numFmt w:val="bullet"/>
+      <w:lvlText w:val="■"/>
+      <w:lvlJc w:val="left"/>
+      <w:pPr>
+        <w:ind w:left="4320" w:hanging="360"/>
+      </w:pPr>
+      <w:rPr>
+        <w:u w:val="none"/>
+      </w:rPr>
+    </w:lvl>
+    <w:lvl w:ilvl="6">
+      <w:start w:val="1"/>
+      <w:numFmt w:val="bullet"/>
+      <w:lvlText w:val="●"/>
+      <w:lvlJc w:val="left"/>
+      <w:pPr>
+        <w:ind w:left="5040" w:hanging="360"/>
+      </w:pPr>
+      <w:rPr>
+        <w:u w:val="none"/>
+      </w:rPr>
+    </w:lvl>
+    <w:lvl w:ilvl="7">
+      <w:start w:val="1"/>
+      <w:numFmt w:val="bullet"/>
+      <w:lvlText w:val="○"/>
+      <w:lvlJc w:val="left"/>
+      <w:pPr>
+        <w:ind w:left="5760" w:hanging="360"/>
+      </w:pPr>
+      <w:rPr>
+        <w:u w:val="none"/>
+      </w:rPr>
+    </w:lvl>
+    <w:lvl w:ilvl="8">
+      <w:start w:val="1"/>
+      <w:numFmt w:val="bullet"/>
+      <w:lvlText w:val="■"/>
+      <w:lvlJc w:val="left"/>
+      <w:pPr>
+        <w:ind w:left="6480" w:hanging="360"/>
+      </w:pPr>
+      <w:rPr>
+        <w:u w:val="none"/>
+      </w:rPr>
+    </w:lvl>
+  </w:abstractNum>
+  <w:abstractNum w:abstractNumId="23">
+    <w:lvl w:ilvl="0">
+      <w:start w:val="1"/>
+      <w:numFmt w:val="bullet"/>
+      <w:lvlText w:val="●"/>
+      <w:lvlJc w:val="left"/>
+      <w:pPr>
+        <w:ind w:left="720" w:hanging="360"/>
+      </w:pPr>
+      <w:rPr>
+        <w:u w:val="none"/>
+      </w:rPr>
+    </w:lvl>
+    <w:lvl w:ilvl="1">
+      <w:start w:val="1"/>
+      <w:numFmt w:val="bullet"/>
+      <w:lvlText w:val="○"/>
+      <w:lvlJc w:val="left"/>
+      <w:pPr>
+        <w:ind w:left="1440" w:hanging="360"/>
+      </w:pPr>
+      <w:rPr>
+        <w:u w:val="none"/>
+      </w:rPr>
+    </w:lvl>
+    <w:lvl w:ilvl="2">
+      <w:start w:val="1"/>
+      <w:numFmt w:val="bullet"/>
+      <w:lvlText w:val="■"/>
+      <w:lvlJc w:val="left"/>
+      <w:pPr>
+        <w:ind w:left="2160" w:hanging="360"/>
+      </w:pPr>
+      <w:rPr>
+        <w:u w:val="none"/>
+      </w:rPr>
+    </w:lvl>
+    <w:lvl w:ilvl="3">
+      <w:start w:val="1"/>
+      <w:numFmt w:val="bullet"/>
+      <w:lvlText w:val="●"/>
+      <w:lvlJc w:val="left"/>
+      <w:pPr>
+        <w:ind w:left="2880" w:hanging="360"/>
+      </w:pPr>
+      <w:rPr>
+        <w:u w:val="none"/>
+      </w:rPr>
+    </w:lvl>
+    <w:lvl w:ilvl="4">
+      <w:start w:val="1"/>
+      <w:numFmt w:val="bullet"/>
+      <w:lvlText w:val="○"/>
+      <w:lvlJc w:val="left"/>
+      <w:pPr>
+        <w:ind w:left="3600" w:hanging="360"/>
+      </w:pPr>
+      <w:rPr>
+        <w:u w:val="none"/>
+      </w:rPr>
+    </w:lvl>
+    <w:lvl w:ilvl="5">
+      <w:start w:val="1"/>
+      <w:numFmt w:val="bullet"/>
+      <w:lvlText w:val="■"/>
+      <w:lvlJc w:val="left"/>
+      <w:pPr>
+        <w:ind w:left="4320" w:hanging="360"/>
+      </w:pPr>
+      <w:rPr>
+        <w:u w:val="none"/>
+      </w:rPr>
+    </w:lvl>
+    <w:lvl w:ilvl="6">
+      <w:start w:val="1"/>
+      <w:numFmt w:val="bullet"/>
+      <w:lvlText w:val="●"/>
+      <w:lvlJc w:val="left"/>
+      <w:pPr>
+        <w:ind w:left="5040" w:hanging="360"/>
+      </w:pPr>
+      <w:rPr>
+        <w:u w:val="none"/>
+      </w:rPr>
+    </w:lvl>
+    <w:lvl w:ilvl="7">
+      <w:start w:val="1"/>
+      <w:numFmt w:val="bullet"/>
+      <w:lvlText w:val="○"/>
+      <w:lvlJc w:val="left"/>
+      <w:pPr>
+        <w:ind w:left="5760" w:hanging="360"/>
+      </w:pPr>
+      <w:rPr>
+        <w:u w:val="none"/>
+      </w:rPr>
+    </w:lvl>
+    <w:lvl w:ilvl="8">
+      <w:start w:val="1"/>
+      <w:numFmt w:val="bullet"/>
+      <w:lvlText w:val="■"/>
+      <w:lvlJc w:val="left"/>
+      <w:pPr>
+        <w:ind w:left="6480" w:hanging="360"/>
+      </w:pPr>
+      <w:rPr>
+        <w:u w:val="none"/>
+      </w:rPr>
+    </w:lvl>
+  </w:abstractNum>
+  <w:abstractNum w:abstractNumId="24">
     <w:lvl w:ilvl="0">
       <w:start w:val="1"/>
       <w:numFmt w:val="bullet"/>
@@ -6596,6 +7451,12 @@
   </w:num>
   <w:num w:numId="22">
     <w:abstractNumId w:val="22"/>
+  </w:num>
+  <w:num w:numId="23">
+    <w:abstractNumId w:val="23"/>
+  </w:num>
+  <w:num w:numId="24">
+    <w:abstractNumId w:val="24"/>
   </w:num>
 </w:numbering>
 </file>

</xml_diff>